<commit_message>
Reorganize repo, convert word
</commit_message>
<xml_diff>
--- a/documentation/SDMX_3-0_SECTION_3A_PART_II_COMMON.docx
+++ b/documentation/SDMX_3-0_SECTION_3A_PART_II_COMMON.docx
@@ -1,1483 +1,12 @@
 
 <file path=word/document.xml><?xml version="1.0" encoding="utf-8"?>
-<w:document xmlns:wpc="http://schemas.microsoft.com/office/word/2010/wordprocessingCanvas" xmlns:cx="http://schemas.microsoft.com/office/drawing/2014/chartex" xmlns:cx1="http://schemas.microsoft.com/office/drawing/2015/9/8/chartex" xmlns:cx2="http://schemas.microsoft.com/office/drawing/2015/10/21/chartex" xmlns:cx3="http://schemas.microsoft.com/office/drawing/2016/5/9/chartex" xmlns:cx4="http://schemas.microsoft.com/office/drawing/2016/5/10/chartex" xmlns:cx5="http://schemas.microsoft.com/office/drawing/2016/5/11/chartex" xmlns:cx6="http://schemas.microsoft.com/office/drawing/2016/5/12/chartex" xmlns:cx7="http://schemas.microsoft.com/office/drawing/2016/5/13/chartex" xmlns:cx8="http://schemas.microsoft.com/office/drawing/2016/5/14/chartex" xmlns:mc="http://schemas.openxmlformats.org/markup-compatibility/2006" xmlns:aink="http://schemas.microsoft.com/office/drawing/2016/ink" xmlns:am3d="http://schemas.microsoft.com/office/drawing/2017/model3d" xmlns:o="urn:schemas-microsoft-com:office:office" xmlns:r="http://schemas.openxmlformats.org/officeDocument/2006/relationships" xmlns:m="http://schemas.openxmlformats.org/officeDocument/2006/math" xmlns:v="urn:schemas-microsoft-com:vml" xmlns:wp14="http://schemas.microsoft.com/office/word/2010/wordprocessingDrawing" xmlns:wp="http://schemas.openxmlformats.org/drawingml/2006/wordprocessingDrawing" xmlns:w10="urn:schemas-microsoft-com:office:word" xmlns:w="http://schemas.openxmlformats.org/wordprocessingml/2006/main" xmlns:w14="http://schemas.microsoft.com/office/word/2010/wordml" xmlns:w15="http://schemas.microsoft.com/office/word/2012/wordml" xmlns:w16cex="http://schemas.microsoft.com/office/word/2018/wordml/cex" xmlns:w16cid="http://schemas.microsoft.com/office/word/2016/wordml/cid" xmlns:w16="http://schemas.microsoft.com/office/word/2018/wordml" xmlns:w16sdtdh="http://schemas.microsoft.com/office/word/2020/wordml/sdtdatahash" xmlns:w16se="http://schemas.microsoft.com/office/word/2015/wordml/symex" xmlns:wpg="http://schemas.microsoft.com/office/word/2010/wordprocessingGroup" xmlns:wpi="http://schemas.microsoft.com/office/word/2010/wordprocessingInk" xmlns:wne="http://schemas.microsoft.com/office/word/2006/wordml" xmlns:wps="http://schemas.microsoft.com/office/word/2010/wordprocessingShape" mc:Ignorable="w14 w15 w16se w16cid w16 w16cex w16sdtdh wp14">
+<w:document xmlns:wpc="http://schemas.microsoft.com/office/word/2010/wordprocessingCanvas" xmlns:cx="http://schemas.microsoft.com/office/drawing/2014/chartex" xmlns:cx1="http://schemas.microsoft.com/office/drawing/2015/9/8/chartex" xmlns:cx2="http://schemas.microsoft.com/office/drawing/2015/10/21/chartex" xmlns:cx3="http://schemas.microsoft.com/office/drawing/2016/5/9/chartex" xmlns:cx4="http://schemas.microsoft.com/office/drawing/2016/5/10/chartex" xmlns:cx5="http://schemas.microsoft.com/office/drawing/2016/5/11/chartex" xmlns:cx6="http://schemas.microsoft.com/office/drawing/2016/5/12/chartex" xmlns:cx7="http://schemas.microsoft.com/office/drawing/2016/5/13/chartex" xmlns:cx8="http://schemas.microsoft.com/office/drawing/2016/5/14/chartex" xmlns:mc="http://schemas.openxmlformats.org/markup-compatibility/2006" xmlns:aink="http://schemas.microsoft.com/office/drawing/2016/ink" xmlns:am3d="http://schemas.microsoft.com/office/drawing/2017/model3d" xmlns:o="urn:schemas-microsoft-com:office:office" xmlns:oel="http://schemas.microsoft.com/office/2019/extlst" xmlns:r="http://schemas.openxmlformats.org/officeDocument/2006/relationships" xmlns:m="http://schemas.openxmlformats.org/officeDocument/2006/math" xmlns:v="urn:schemas-microsoft-com:vml" xmlns:wp14="http://schemas.microsoft.com/office/word/2010/wordprocessingDrawing" xmlns:wp="http://schemas.openxmlformats.org/drawingml/2006/wordprocessingDrawing" xmlns:w10="urn:schemas-microsoft-com:office:word" xmlns:w="http://schemas.openxmlformats.org/wordprocessingml/2006/main" xmlns:w14="http://schemas.microsoft.com/office/word/2010/wordml" xmlns:w15="http://schemas.microsoft.com/office/word/2012/wordml" xmlns:w16cex="http://schemas.microsoft.com/office/word/2018/wordml/cex" xmlns:w16cid="http://schemas.microsoft.com/office/word/2016/wordml/cid" xmlns:w16="http://schemas.microsoft.com/office/word/2018/wordml" xmlns:w16du="http://schemas.microsoft.com/office/word/2023/wordml/word16du" xmlns:w16sdtdh="http://schemas.microsoft.com/office/word/2020/wordml/sdtdatahash" xmlns:w16sdtfl="http://schemas.microsoft.com/office/word/2024/wordml/sdtformatlock" xmlns:w16se="http://schemas.microsoft.com/office/word/2015/wordml/symex" xmlns:wpg="http://schemas.microsoft.com/office/word/2010/wordprocessingGroup" xmlns:wpi="http://schemas.microsoft.com/office/word/2010/wordprocessingInk" xmlns:wne="http://schemas.microsoft.com/office/word/2006/wordml" xmlns:wps="http://schemas.microsoft.com/office/word/2010/wordprocessingShape" mc:Ignorable="w14 w15 w16se w16cid w16 w16cex w16sdtdh w16sdtfl w16du wp14">
   <w:body>
     <w:p>
       <w:pPr>
-        <w:pStyle w:val="FrontPage"/>
-        <w:rPr>
-          <w:lang w:val="de-DE"/>
-        </w:rPr>
-      </w:pPr>
-    </w:p>
-    <w:p>
-      <w:pPr>
-        <w:pStyle w:val="FrontPage"/>
-        <w:rPr>
-          <w:lang w:val="de-DE"/>
-        </w:rPr>
-      </w:pPr>
-    </w:p>
-    <w:p>
-      <w:pPr>
-        <w:pStyle w:val="FrontPage"/>
-        <w:rPr>
-          <w:lang w:val="de-DE"/>
-        </w:rPr>
-      </w:pPr>
-      <w:r>
-        <w:rPr>
-          <w:noProof/>
-          <w:lang w:eastAsia="en-GB"/>
-        </w:rPr>
-        <mc:AlternateContent>
-          <mc:Choice Requires="wps">
-            <w:drawing>
-              <wp:anchor distT="0" distB="0" distL="114300" distR="114300" simplePos="0" relativeHeight="251657728" behindDoc="1" locked="0" layoutInCell="1" allowOverlap="1" wp14:anchorId="5517FAE3" wp14:editId="1400B1A8">
-                <wp:simplePos x="0" y="0"/>
-                <wp:positionH relativeFrom="margin">
-                  <wp:align>center</wp:align>
-                </wp:positionH>
-                <wp:positionV relativeFrom="paragraph">
-                  <wp:posOffset>330835</wp:posOffset>
-                </wp:positionV>
-                <wp:extent cx="4914900" cy="6858000"/>
-                <wp:effectExtent l="0" t="0" r="0" b="0"/>
-                <wp:wrapNone/>
-                <wp:docPr id="833" name="Rectangle 40"/>
-                <wp:cNvGraphicFramePr>
-                  <a:graphicFrameLocks xmlns:a="http://schemas.openxmlformats.org/drawingml/2006/main"/>
-                </wp:cNvGraphicFramePr>
-                <a:graphic xmlns:a="http://schemas.openxmlformats.org/drawingml/2006/main">
-                  <a:graphicData uri="http://schemas.microsoft.com/office/word/2010/wordprocessingShape">
-                    <wps:wsp>
-                      <wps:cNvSpPr>
-                        <a:spLocks/>
-                      </wps:cNvSpPr>
-                      <wps:spPr bwMode="auto">
-                        <a:xfrm>
-                          <a:off x="0" y="0"/>
-                          <a:ext cx="4914900" cy="6858000"/>
-                        </a:xfrm>
-                        <a:prstGeom prst="rect">
-                          <a:avLst/>
-                        </a:prstGeom>
-                        <a:noFill/>
-                        <a:ln w="9525">
-                          <a:solidFill>
-                            <a:srgbClr val="000000"/>
-                          </a:solidFill>
-                          <a:miter lim="800000"/>
-                          <a:headEnd/>
-                          <a:tailEnd/>
-                        </a:ln>
-                        <a:extLst>
-                          <a:ext uri="{909E8E84-426E-40DD-AFC4-6F175D3DCCD1}">
-                            <a14:hiddenFill xmlns:a14="http://schemas.microsoft.com/office/drawing/2010/main">
-                              <a:solidFill>
-                                <a:srgbClr val="3366FF">
-                                  <a:alpha val="80000"/>
-                                </a:srgbClr>
-                              </a:solidFill>
-                            </a14:hiddenFill>
-                          </a:ext>
-                        </a:extLst>
-                      </wps:spPr>
-                      <wps:bodyPr rot="0" vert="horz" wrap="square" lIns="91440" tIns="45720" rIns="91440" bIns="45720" anchor="t" anchorCtr="0" upright="1">
-                        <a:noAutofit/>
-                      </wps:bodyPr>
-                    </wps:wsp>
-                  </a:graphicData>
-                </a:graphic>
-                <wp14:sizeRelH relativeFrom="page">
-                  <wp14:pctWidth>0</wp14:pctWidth>
-                </wp14:sizeRelH>
-                <wp14:sizeRelV relativeFrom="page">
-                  <wp14:pctHeight>0</wp14:pctHeight>
-                </wp14:sizeRelV>
-              </wp:anchor>
-            </w:drawing>
-          </mc:Choice>
-          <mc:Fallback>
-            <w:pict>
-              <v:rect w14:anchorId="5D20F485" id="Rectangle 40" o:spid="_x0000_s1026" style="position:absolute;margin-left:0;margin-top:26.05pt;width:387pt;height:540pt;z-index:-251658752;visibility:visible;mso-wrap-style:square;mso-width-percent:0;mso-height-percent:0;mso-wrap-distance-left:9pt;mso-wrap-distance-top:0;mso-wrap-distance-right:9pt;mso-wrap-distance-bottom:0;mso-position-horizontal:center;mso-position-horizontal-relative:margin;mso-position-vertical:absolute;mso-position-vertical-relative:text;mso-width-percent:0;mso-height-percent:0;mso-width-relative:page;mso-height-relative:page;v-text-anchor:top" o:gfxdata="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" filled="f" fillcolor="#36f">
-                <v:fill opacity="52428f"/>
-                <v:path arrowok="t"/>
-                <w10:wrap anchorx="margin"/>
-              </v:rect>
-            </w:pict>
-          </mc:Fallback>
-        </mc:AlternateContent>
-      </w:r>
-    </w:p>
-    <w:p>
-      <w:pPr>
-        <w:pStyle w:val="SectionTitle"/>
-        <w:rPr>
-          <w:b w:val="0"/>
-          <w:lang w:val="de-DE"/>
-        </w:rPr>
-      </w:pPr>
-      <w:r>
-        <w:rPr>
-          <w:b w:val="0"/>
-          <w:lang w:val="de-DE"/>
-        </w:rPr>
-        <w:t xml:space="preserve">SDMX Standards: Section </w:t>
-      </w:r>
-      <w:r>
-        <w:rPr>
-          <w:b w:val="0"/>
-          <w:lang w:val="de-DE"/>
-        </w:rPr>
-        <w:t>3A PaRT II</w:t>
-      </w:r>
-    </w:p>
-    <w:p>
-      <w:pPr>
-        <w:pStyle w:val="FrontPage"/>
-        <w:rPr>
-          <w:lang w:val="de-DE"/>
-        </w:rPr>
-      </w:pPr>
-    </w:p>
-    <w:p>
-      <w:pPr>
-        <w:pStyle w:val="FrontPage"/>
-        <w:rPr>
-          <w:lang w:val="de-DE"/>
-        </w:rPr>
-      </w:pPr>
-    </w:p>
-    <w:p>
-      <w:pPr>
-        <w:pStyle w:val="DocumentTitle"/>
-        <w:rPr>
-          <w:b w:val="0"/>
-        </w:rPr>
-      </w:pPr>
-      <w:r>
-        <w:rPr>
-          <w:b w:val="0"/>
-        </w:rPr>
-        <w:t>SDMX-ML</w:t>
-      </w:r>
-      <w:r>
-        <w:rPr>
-          <w:b w:val="0"/>
-        </w:rPr>
-        <w:t xml:space="preserve">: </w:t>
-      </w:r>
-    </w:p>
-    <w:p>
-      <w:pPr>
-        <w:pStyle w:val="DocumentTitle"/>
-        <w:rPr>
-          <w:b w:val="0"/>
-        </w:rPr>
-      </w:pPr>
-      <w:r>
-        <w:rPr>
-          <w:b w:val="0"/>
-        </w:rPr>
-        <w:t xml:space="preserve">  </w:t>
-      </w:r>
-      <w:r>
-        <w:rPr>
-          <w:b w:val="0"/>
-        </w:rPr>
-        <w:t xml:space="preserve"> </w:t>
-      </w:r>
-      <w:r>
-        <w:rPr>
-          <w:b w:val="0"/>
-        </w:rPr>
-        <w:t>Schema and Documentation</w:t>
-      </w:r>
-    </w:p>
-    <w:p>
-      <w:pPr>
-        <w:pStyle w:val="DocumentTitle"/>
-        <w:rPr>
-          <w:b w:val="0"/>
-        </w:rPr>
-      </w:pPr>
-      <w:r>
-        <w:rPr>
-          <w:b w:val="0"/>
-        </w:rPr>
-        <w:t xml:space="preserve">Common </w:t>
-      </w:r>
-      <w:r>
-        <w:rPr>
-          <w:b w:val="0"/>
-        </w:rPr>
-        <w:t>Namespace</w:t>
-      </w:r>
-    </w:p>
-    <w:p>
-      <w:pPr>
-        <w:pStyle w:val="FrontPage"/>
-        <w:rPr>
-          <w:lang w:val="de-DE"/>
-        </w:rPr>
-      </w:pPr>
-    </w:p>
-    <w:p>
-      <w:pPr>
-        <w:pStyle w:val="FrontPage"/>
-        <w:rPr>
-          <w:b w:val="0"/>
-          <w:lang w:val="de-DE"/>
-        </w:rPr>
-      </w:pPr>
-      <w:r>
-        <w:rPr>
-          <w:b w:val="0"/>
-          <w:smallCaps/>
-          <w:sz w:val="32"/>
-          <w:szCs w:val="32"/>
-          <w:lang w:val="de-DE"/>
-        </w:rPr>
-        <w:t xml:space="preserve">Version </w:t>
-      </w:r>
-      <w:r>
-        <w:rPr>
-          <w:b w:val="0"/>
-          <w:smallCaps/>
-          <w:sz w:val="32"/>
-          <w:szCs w:val="32"/>
-          <w:lang w:val="de-DE"/>
-        </w:rPr>
-        <w:t>3</w:t>
-      </w:r>
-      <w:r>
-        <w:rPr>
-          <w:b w:val="0"/>
-          <w:smallCaps/>
-          <w:sz w:val="32"/>
-          <w:szCs w:val="32"/>
-          <w:lang w:val="de-DE"/>
-        </w:rPr>
-        <w:t>.</w:t>
-      </w:r>
-      <w:r>
-        <w:rPr>
-          <w:b w:val="0"/>
-          <w:smallCaps/>
-          <w:sz w:val="32"/>
-          <w:szCs w:val="32"/>
-          <w:lang w:val="de-DE"/>
-        </w:rPr>
-        <w:t>0</w:t>
-      </w:r>
-    </w:p>
-    <w:p>
-      <w:pPr>
-        <w:pStyle w:val="FrontPage"/>
-        <w:rPr>
-          <w:sz w:val="36"/>
-          <w:szCs w:val="36"/>
-          <w:lang w:val="de-DE"/>
-        </w:rPr>
-      </w:pPr>
-    </w:p>
-    <w:p>
-      <w:pPr>
-        <w:pStyle w:val="FrontPage"/>
-        <w:rPr>
-          <w:sz w:val="36"/>
-          <w:szCs w:val="36"/>
-          <w:lang w:val="de-DE"/>
-        </w:rPr>
-      </w:pPr>
-    </w:p>
-    <w:p>
-      <w:pPr>
-        <w:pStyle w:val="FrontPage"/>
-        <w:rPr>
-          <w:sz w:val="36"/>
-          <w:szCs w:val="36"/>
-          <w:lang w:val="de-DE"/>
-        </w:rPr>
-      </w:pPr>
-    </w:p>
-    <w:p>
-      <w:pPr>
-        <w:pStyle w:val="FrontPage"/>
-        <w:rPr>
-          <w:sz w:val="36"/>
-          <w:szCs w:val="36"/>
-          <w:lang w:val="de-DE"/>
-        </w:rPr>
-      </w:pPr>
-    </w:p>
-    <w:p>
-      <w:pPr>
-        <w:pStyle w:val="FrontPage"/>
-        <w:rPr>
-          <w:sz w:val="36"/>
-          <w:szCs w:val="36"/>
-          <w:lang w:val="de-DE"/>
-        </w:rPr>
-      </w:pPr>
-    </w:p>
-    <w:p>
-      <w:pPr>
-        <w:pStyle w:val="FrontPage"/>
-        <w:rPr>
-          <w:sz w:val="36"/>
-          <w:szCs w:val="36"/>
-          <w:lang w:val="de-DE"/>
-        </w:rPr>
-      </w:pPr>
-    </w:p>
-    <w:p>
-      <w:pPr>
-        <w:pStyle w:val="DatePub"/>
-        <w:rPr>
-          <w:lang w:val="de-DE"/>
-        </w:rPr>
-      </w:pPr>
-      <w:r>
-        <w:rPr>
-          <w:lang w:val="de-DE"/>
-        </w:rPr>
-        <w:t>September</w:t>
-      </w:r>
-      <w:r>
-        <w:rPr>
-          <w:lang w:val="de-DE"/>
-        </w:rPr>
-        <w:t xml:space="preserve"> 20</w:t>
-      </w:r>
-      <w:r>
-        <w:rPr>
-          <w:lang w:val="de-DE"/>
-        </w:rPr>
-        <w:t>2</w:t>
-      </w:r>
-      <w:r>
-        <w:rPr>
-          <w:lang w:val="de-DE"/>
-        </w:rPr>
-        <w:t>1</w:t>
-      </w:r>
-    </w:p>
-    <w:p>
-      <w:pPr>
-        <w:pStyle w:val="ParagraphCharCharChar"/>
-        <w:rPr>
-          <w:lang w:val="de-DE"/>
-        </w:rPr>
-      </w:pPr>
-    </w:p>
-    <w:p>
-      <w:pPr>
-        <w:pStyle w:val="ParagraphCharCharChar"/>
-        <w:rPr>
-          <w:lang w:val="de-DE"/>
-        </w:rPr>
+        <w:pStyle w:val="berschrift1"/>
         <w:sectPr>
-          <w:headerReference w:type="default" r:id="rId8"/>
-          <w:footerReference w:type="default" r:id="rId9"/>
-          <w:pgSz w:w="11906" w:h="16838" w:code="9"/>
-          <w:pgMar w:top="1440" w:right="1797" w:bottom="1440" w:left="1797" w:header="709" w:footer="709" w:gutter="0"/>
-          <w:cols w:space="708"/>
-          <w:docGrid w:linePitch="360"/>
-        </w:sectPr>
-      </w:pPr>
-    </w:p>
-    <w:p>
-      <w:pPr>
-        <w:pStyle w:val="ParagraphCharCharChar"/>
-        <w:rPr>
-          <w:lang w:val="de-DE"/>
-        </w:rPr>
-      </w:pPr>
-    </w:p>
-    <w:p>
-      <w:pPr>
-        <w:pStyle w:val="ParagraphCharCharChar"/>
-        <w:rPr>
-          <w:lang w:val="de-DE"/>
-        </w:rPr>
-      </w:pPr>
-    </w:p>
-    <w:p>
-      <w:pPr>
-        <w:pStyle w:val="ParagraphCharCharChar"/>
-        <w:rPr>
-          <w:lang w:val="de-DE"/>
-        </w:rPr>
-      </w:pPr>
-    </w:p>
-    <w:p>
-      <w:pPr>
-        <w:pStyle w:val="ParagraphCharCharChar"/>
-        <w:rPr>
-          <w:lang w:val="de-DE"/>
-        </w:rPr>
-      </w:pPr>
-    </w:p>
-    <w:p>
-      <w:pPr>
-        <w:pStyle w:val="ParagraphCharCharChar"/>
-        <w:rPr>
-          <w:lang w:val="de-DE"/>
-        </w:rPr>
-      </w:pPr>
-    </w:p>
-    <w:p>
-      <w:pPr>
-        <w:pStyle w:val="ParagraphCharCharChar"/>
-        <w:rPr>
-          <w:lang w:val="de-DE"/>
-        </w:rPr>
-      </w:pPr>
-    </w:p>
-    <w:p>
-      <w:pPr>
-        <w:pStyle w:val="ParagraphCharCharChar"/>
-        <w:rPr>
-          <w:lang w:val="de-DE"/>
-        </w:rPr>
-      </w:pPr>
-    </w:p>
-    <w:p>
-      <w:pPr>
-        <w:pStyle w:val="ParagraphCharCharChar"/>
-        <w:rPr>
-          <w:lang w:val="de-DE"/>
-        </w:rPr>
-      </w:pPr>
-    </w:p>
-    <w:p>
-      <w:pPr>
-        <w:pStyle w:val="ParagraphCharCharChar"/>
-        <w:rPr>
-          <w:lang w:val="de-DE"/>
-        </w:rPr>
-      </w:pPr>
-    </w:p>
-    <w:p>
-      <w:pPr>
-        <w:pStyle w:val="ParagraphCharCharChar"/>
-        <w:rPr>
-          <w:lang w:val="de-DE"/>
-        </w:rPr>
-      </w:pPr>
-    </w:p>
-    <w:p>
-      <w:pPr>
-        <w:pStyle w:val="ParagraphCharCharChar"/>
-        <w:rPr>
-          <w:lang w:val="de-DE"/>
-        </w:rPr>
-      </w:pPr>
-    </w:p>
-    <w:p>
-      <w:pPr>
-        <w:pStyle w:val="ParagraphCharCharChar"/>
-        <w:rPr>
-          <w:lang w:val="de-DE"/>
-        </w:rPr>
-      </w:pPr>
-    </w:p>
-    <w:p>
-      <w:pPr>
-        <w:pStyle w:val="ParagraphCharCharChar"/>
-        <w:rPr>
-          <w:lang w:val="de-DE"/>
-        </w:rPr>
-      </w:pPr>
-    </w:p>
-    <w:p>
-      <w:pPr>
-        <w:pStyle w:val="ParagraphCharCharChar"/>
-        <w:rPr>
-          <w:lang w:val="de-DE"/>
-        </w:rPr>
-      </w:pPr>
-    </w:p>
-    <w:p>
-      <w:pPr>
-        <w:pStyle w:val="ParagraphCharCharChar"/>
-        <w:rPr>
-          <w:lang w:val="de-DE"/>
-        </w:rPr>
-      </w:pPr>
-    </w:p>
-    <w:p>
-      <w:pPr>
-        <w:pStyle w:val="ParagraphCharCharChar"/>
-        <w:rPr>
-          <w:lang w:val="de-DE"/>
-        </w:rPr>
-      </w:pPr>
-    </w:p>
-    <w:p>
-      <w:pPr>
-        <w:pStyle w:val="ParagraphCharCharChar"/>
-        <w:rPr>
-          <w:lang w:val="de-DE"/>
-        </w:rPr>
-      </w:pPr>
-    </w:p>
-    <w:p>
-      <w:pPr>
-        <w:pStyle w:val="ParagraphCharCharChar"/>
-        <w:rPr>
-          <w:lang w:val="de-DE"/>
-        </w:rPr>
-      </w:pPr>
-    </w:p>
-    <w:p>
-      <w:pPr>
-        <w:pStyle w:val="ParagraphCharCharChar"/>
-        <w:rPr>
-          <w:lang w:val="de-DE"/>
-        </w:rPr>
-      </w:pPr>
-    </w:p>
-    <w:p>
-      <w:pPr>
-        <w:pStyle w:val="ParagraphCharCharChar"/>
-        <w:rPr>
-          <w:lang w:val="de-DE"/>
-        </w:rPr>
-      </w:pPr>
-    </w:p>
-    <w:p>
-      <w:pPr>
-        <w:pStyle w:val="ParagraphCharCharChar"/>
-        <w:rPr>
-          <w:lang w:val="de-DE"/>
-        </w:rPr>
-      </w:pPr>
-    </w:p>
-    <w:p>
-      <w:pPr>
-        <w:pStyle w:val="ParagraphCharCharChar"/>
-        <w:rPr>
-          <w:lang w:val="de-DE"/>
-        </w:rPr>
-      </w:pPr>
-    </w:p>
-    <w:p>
-      <w:pPr>
-        <w:pStyle w:val="ParagraphCharCharChar"/>
-        <w:rPr>
-          <w:lang w:val="de-DE"/>
-        </w:rPr>
-      </w:pPr>
-    </w:p>
-    <w:p>
-      <w:pPr>
-        <w:pStyle w:val="ParagraphCharCharChar"/>
-        <w:rPr>
-          <w:lang w:val="de-DE"/>
-        </w:rPr>
-      </w:pPr>
-    </w:p>
-    <w:p>
-      <w:pPr>
-        <w:pStyle w:val="ParagraphCharCharChar"/>
-        <w:rPr>
-          <w:lang w:val="de-DE"/>
-        </w:rPr>
-      </w:pPr>
-    </w:p>
-    <w:p>
-      <w:pPr>
-        <w:pStyle w:val="ParagraphCharCharChar"/>
-        <w:rPr>
-          <w:lang w:val="de-DE"/>
-        </w:rPr>
-      </w:pPr>
-    </w:p>
-    <w:p>
-      <w:pPr>
-        <w:pStyle w:val="ParagraphCharCharChar"/>
-        <w:rPr>
-          <w:lang w:val="de-DE"/>
-        </w:rPr>
-      </w:pPr>
-    </w:p>
-    <w:p>
-      <w:pPr>
-        <w:pStyle w:val="ParagraphCharCharChar"/>
-        <w:rPr>
-          <w:lang w:val="de-DE"/>
-        </w:rPr>
-      </w:pPr>
-    </w:p>
-    <w:p>
-      <w:pPr>
-        <w:pStyle w:val="ParagraphCharCharChar"/>
-        <w:rPr>
-          <w:lang w:val="de-DE"/>
-        </w:rPr>
-      </w:pPr>
-    </w:p>
-    <w:p>
-      <w:pPr>
-        <w:pStyle w:val="ParagraphCharCharChar"/>
-        <w:rPr>
-          <w:lang w:val="de-DE"/>
-        </w:rPr>
-      </w:pPr>
-    </w:p>
-    <w:p>
-      <w:pPr>
-        <w:pStyle w:val="ParagraphCharCharChar"/>
-        <w:rPr>
-          <w:lang w:val="de-DE"/>
-        </w:rPr>
-      </w:pPr>
-    </w:p>
-    <w:p>
-      <w:pPr>
-        <w:pStyle w:val="ParagraphCharCharChar"/>
-        <w:rPr>
-          <w:lang w:val="de-DE"/>
-        </w:rPr>
-      </w:pPr>
-    </w:p>
-    <w:p>
-      <w:pPr>
-        <w:pStyle w:val="ParagraphCharCharChar"/>
-        <w:rPr>
-          <w:lang w:val="de-DE"/>
-        </w:rPr>
-      </w:pPr>
-    </w:p>
-    <w:p>
-      <w:pPr>
-        <w:pStyle w:val="ParagraphCharCharChar"/>
-        <w:rPr>
-          <w:lang w:val="de-DE"/>
-        </w:rPr>
-      </w:pPr>
-    </w:p>
-    <w:p>
-      <w:pPr>
-        <w:pStyle w:val="ParagraphCharCharChar"/>
-        <w:rPr>
-          <w:lang w:val="de-DE"/>
-        </w:rPr>
-      </w:pPr>
-    </w:p>
-    <w:p>
-      <w:pPr>
-        <w:pStyle w:val="ParagraphCharCharChar"/>
-        <w:rPr>
-          <w:lang w:val="de-DE"/>
-        </w:rPr>
-      </w:pPr>
-    </w:p>
-    <w:p>
-      <w:pPr>
-        <w:pStyle w:val="ParagraphCharCharChar"/>
-        <w:rPr>
-          <w:lang w:val="de-DE"/>
-        </w:rPr>
-      </w:pPr>
-    </w:p>
-    <w:p>
-      <w:pPr>
-        <w:pStyle w:val="ParagraphCharCharChar"/>
-        <w:rPr>
-          <w:lang w:val="de-DE"/>
-        </w:rPr>
-      </w:pPr>
-    </w:p>
-    <w:p>
-      <w:pPr>
-        <w:pStyle w:val="ParagraphCharCharChar"/>
-        <w:rPr>
-          <w:lang w:val="de-DE"/>
-        </w:rPr>
-      </w:pPr>
-    </w:p>
-    <w:p>
-      <w:pPr>
-        <w:pStyle w:val="ParagraphCharCharChar"/>
-        <w:rPr>
-          <w:lang w:val="de-DE"/>
-        </w:rPr>
-      </w:pPr>
-    </w:p>
-    <w:p>
-      <w:pPr>
-        <w:pStyle w:val="ParagraphCharCharChar"/>
-        <w:rPr>
-          <w:lang w:val="de-DE"/>
-        </w:rPr>
-      </w:pPr>
-    </w:p>
-    <w:p>
-      <w:pPr>
-        <w:pStyle w:val="ParagraphCharCharChar"/>
-        <w:rPr>
-          <w:lang w:val="de-DE"/>
-        </w:rPr>
-      </w:pPr>
-    </w:p>
-    <w:p>
-      <w:pPr>
-        <w:pStyle w:val="ParagraphCharCharChar"/>
-        <w:rPr>
-          <w:lang w:val="de-DE"/>
-        </w:rPr>
-      </w:pPr>
-    </w:p>
-    <w:p>
-      <w:pPr>
-        <w:pStyle w:val="ParagraphCharCharChar"/>
-        <w:rPr>
-          <w:lang w:val="de-DE"/>
-        </w:rPr>
-      </w:pPr>
-      <w:r>
-        <w:rPr>
-          <w:lang w:val="de-DE"/>
-        </w:rPr>
-        <w:t>© SDMX 20</w:t>
-      </w:r>
-      <w:r>
-        <w:rPr>
-          <w:lang w:val="de-DE"/>
-        </w:rPr>
-        <w:t>2</w:t>
-      </w:r>
-      <w:r>
-        <w:rPr>
-          <w:lang w:val="de-DE"/>
-        </w:rPr>
-        <w:t>1</w:t>
-      </w:r>
-    </w:p>
-    <w:p>
-      <w:pPr>
-        <w:pStyle w:val="ParagraphCharCharChar"/>
-        <w:rPr>
-          <w:color w:val="0000FF"/>
-          <w:u w:val="single"/>
-          <w:lang w:val="de-DE"/>
-        </w:rPr>
-      </w:pPr>
-      <w:r>
-        <w:rPr>
-          <w:rStyle w:val="Hyperlink"/>
-          <w:lang w:val="de-DE"/>
-        </w:rPr>
-        <w:t>http://www.sdmx.org/</w:t>
-      </w:r>
-    </w:p>
-    <w:p>
-      <w:pPr>
-        <w:pStyle w:val="ParagraphCharCharChar"/>
-        <w:rPr>
-          <w:lang w:val="de-DE"/>
-        </w:rPr>
-      </w:pPr>
-    </w:p>
-    <w:p>
-      <w:pPr>
-        <w:pStyle w:val="ParagraphCharCharChar"/>
-        <w:rPr>
-          <w:b/>
-          <w:sz w:val="32"/>
-          <w:szCs w:val="32"/>
-          <w:lang w:val="de-DE"/>
-        </w:rPr>
-        <w:sectPr>
-          <w:footerReference w:type="default" r:id="rId10"/>
-          <w:pgSz w:w="11906" w:h="16838" w:code="9"/>
-          <w:pgMar w:top="1440" w:right="1797" w:bottom="1440" w:left="1797" w:header="709" w:footer="709" w:gutter="0"/>
-          <w:cols w:space="708"/>
-          <w:docGrid w:linePitch="360"/>
-        </w:sectPr>
-      </w:pPr>
-    </w:p>
-    <w:p>
-      <w:pPr>
-        <w:pStyle w:val="GridTable3"/>
-        <w:rPr>
-          <w:rFonts w:ascii="Arial" w:hAnsi="Arial" w:cs="Arial"/>
-          <w:color w:val="auto"/>
-        </w:rPr>
-      </w:pPr>
-      <w:r>
-        <w:rPr>
-          <w:rFonts w:ascii="Arial" w:hAnsi="Arial" w:cs="Arial"/>
-          <w:color w:val="auto"/>
-        </w:rPr>
-        <w:lastRenderedPageBreak/>
-        <w:t>Contents</w:t>
-      </w:r>
-    </w:p>
-    <w:p>
-      <w:pPr>
-        <w:rPr>
-          <w:lang w:val="en-US"/>
-        </w:rPr>
-      </w:pPr>
-    </w:p>
-    <w:p>
-      <w:pPr>
-        <w:pStyle w:val="TOC1"/>
-        <w:tabs>
-          <w:tab w:val="left" w:pos="720"/>
-          <w:tab w:val="right" w:leader="dot" w:pos="8302"/>
-        </w:tabs>
-        <w:rPr>
-          <w:rFonts w:asciiTheme="minorHAnsi" w:eastAsiaTheme="minorEastAsia" w:hAnsiTheme="minorHAnsi" w:cstheme="minorBidi"/>
-          <w:b w:val="0"/>
-          <w:noProof/>
-          <w:sz w:val="24"/>
-          <w:szCs w:val="24"/>
-          <w:lang w:val="en-US"/>
-        </w:rPr>
-      </w:pPr>
-      <w:r>
-        <w:fldChar w:fldCharType="begin"/>
-      </w:r>
-      <w:r>
-        <w:instrText xml:space="preserve"> TOC \o "1-3" \h \z \u </w:instrText>
-      </w:r>
-      <w:r>
-        <w:fldChar w:fldCharType="separate"/>
-      </w:r>
-      <w:hyperlink w:anchor="_Toc82185849" w:history="1">
-        <w:r>
-          <w:rPr>
-            <w:rStyle w:val="Hyperlink"/>
-            <w:noProof/>
-          </w:rPr>
-          <w:t>1</w:t>
-        </w:r>
-        <w:r>
-          <w:rPr>
-            <w:rFonts w:asciiTheme="minorHAnsi" w:eastAsiaTheme="minorEastAsia" w:hAnsiTheme="minorHAnsi" w:cstheme="minorBidi"/>
-            <w:b w:val="0"/>
-            <w:noProof/>
-            <w:sz w:val="24"/>
-            <w:szCs w:val="24"/>
-            <w:lang w:val="en-US"/>
-          </w:rPr>
-          <w:tab/>
-        </w:r>
-        <w:r>
-          <w:rPr>
-            <w:rStyle w:val="Hyperlink"/>
-            <w:noProof/>
-          </w:rPr>
-          <w:t>Introduction</w:t>
-        </w:r>
-        <w:r>
-          <w:rPr>
-            <w:noProof/>
-            <w:webHidden/>
-          </w:rPr>
-          <w:tab/>
-        </w:r>
-        <w:r>
-          <w:rPr>
-            <w:noProof/>
-            <w:webHidden/>
-          </w:rPr>
-          <w:fldChar w:fldCharType="begin"/>
-        </w:r>
-        <w:r>
-          <w:rPr>
-            <w:noProof/>
-            <w:webHidden/>
-          </w:rPr>
-          <w:instrText xml:space="preserve"> PAGEREF _Toc82185849 \h </w:instrText>
-        </w:r>
-        <w:r>
-          <w:rPr>
-            <w:noProof/>
-            <w:webHidden/>
-          </w:rPr>
-        </w:r>
-        <w:r>
-          <w:rPr>
-            <w:noProof/>
-            <w:webHidden/>
-          </w:rPr>
-          <w:fldChar w:fldCharType="separate"/>
-        </w:r>
-        <w:r>
-          <w:rPr>
-            <w:noProof/>
-            <w:webHidden/>
-          </w:rPr>
-          <w:t>1</w:t>
-        </w:r>
-        <w:r>
-          <w:rPr>
-            <w:noProof/>
-            <w:webHidden/>
-          </w:rPr>
-          <w:fldChar w:fldCharType="end"/>
-        </w:r>
-      </w:hyperlink>
-    </w:p>
-    <w:p>
-      <w:pPr>
-        <w:pStyle w:val="TOC1"/>
-        <w:tabs>
-          <w:tab w:val="left" w:pos="720"/>
-          <w:tab w:val="right" w:leader="dot" w:pos="8302"/>
-        </w:tabs>
-        <w:rPr>
-          <w:rFonts w:asciiTheme="minorHAnsi" w:eastAsiaTheme="minorEastAsia" w:hAnsiTheme="minorHAnsi" w:cstheme="minorBidi"/>
-          <w:b w:val="0"/>
-          <w:noProof/>
-          <w:sz w:val="24"/>
-          <w:szCs w:val="24"/>
-          <w:lang w:val="en-US"/>
-        </w:rPr>
-      </w:pPr>
-      <w:hyperlink w:anchor="_Toc82185850" w:history="1">
-        <w:r>
-          <w:rPr>
-            <w:rStyle w:val="Hyperlink"/>
-            <w:noProof/>
-          </w:rPr>
-          <w:t>2</w:t>
-        </w:r>
-        <w:r>
-          <w:rPr>
-            <w:rFonts w:asciiTheme="minorHAnsi" w:eastAsiaTheme="minorEastAsia" w:hAnsiTheme="minorHAnsi" w:cstheme="minorBidi"/>
-            <w:b w:val="0"/>
-            <w:noProof/>
-            <w:sz w:val="24"/>
-            <w:szCs w:val="24"/>
-            <w:lang w:val="en-US"/>
-          </w:rPr>
-          <w:tab/>
-        </w:r>
-        <w:r>
-          <w:rPr>
-            <w:rStyle w:val="Hyperlink"/>
-            <w:noProof/>
-          </w:rPr>
-          <w:t>Schema Documentation</w:t>
-        </w:r>
-        <w:r>
-          <w:rPr>
-            <w:noProof/>
-            <w:webHidden/>
-          </w:rPr>
-          <w:tab/>
-        </w:r>
-        <w:r>
-          <w:rPr>
-            <w:noProof/>
-            <w:webHidden/>
-          </w:rPr>
-          <w:fldChar w:fldCharType="begin"/>
-        </w:r>
-        <w:r>
-          <w:rPr>
-            <w:noProof/>
-            <w:webHidden/>
-          </w:rPr>
-          <w:instrText xml:space="preserve"> PAGEREF _Toc82185850 \h </w:instrText>
-        </w:r>
-        <w:r>
-          <w:rPr>
-            <w:noProof/>
-            <w:webHidden/>
-          </w:rPr>
-        </w:r>
-        <w:r>
-          <w:rPr>
-            <w:noProof/>
-            <w:webHidden/>
-          </w:rPr>
-          <w:fldChar w:fldCharType="separate"/>
-        </w:r>
-        <w:r>
-          <w:rPr>
-            <w:noProof/>
-            <w:webHidden/>
-          </w:rPr>
-          <w:t>1</w:t>
-        </w:r>
-        <w:r>
-          <w:rPr>
-            <w:noProof/>
-            <w:webHidden/>
-          </w:rPr>
-          <w:fldChar w:fldCharType="end"/>
-        </w:r>
-      </w:hyperlink>
-    </w:p>
-    <w:p>
-      <w:pPr>
-        <w:pStyle w:val="TOC2"/>
-        <w:tabs>
-          <w:tab w:val="left" w:pos="720"/>
-          <w:tab w:val="right" w:leader="dot" w:pos="8302"/>
-        </w:tabs>
-        <w:rPr>
-          <w:rFonts w:asciiTheme="minorHAnsi" w:eastAsiaTheme="minorEastAsia" w:hAnsiTheme="minorHAnsi" w:cstheme="minorBidi"/>
-          <w:noProof/>
-          <w:sz w:val="24"/>
-          <w:szCs w:val="24"/>
-          <w:lang w:val="en-US"/>
-        </w:rPr>
-      </w:pPr>
-      <w:hyperlink w:anchor="_Toc82185851" w:history="1">
-        <w:r>
-          <w:rPr>
-            <w:rStyle w:val="Hyperlink"/>
-            <w:noProof/>
-          </w:rPr>
-          <w:t>2.1</w:t>
-        </w:r>
-        <w:r>
-          <w:rPr>
-            <w:rFonts w:asciiTheme="minorHAnsi" w:eastAsiaTheme="minorEastAsia" w:hAnsiTheme="minorHAnsi" w:cstheme="minorBidi"/>
-            <w:noProof/>
-            <w:sz w:val="24"/>
-            <w:szCs w:val="24"/>
-            <w:lang w:val="en-US"/>
-          </w:rPr>
-          <w:tab/>
-        </w:r>
-        <w:r>
-          <w:rPr>
-            <w:rStyle w:val="Hyperlink"/>
-            <w:noProof/>
-          </w:rPr>
-          <w:t>Common Namespace</w:t>
-        </w:r>
-        <w:r>
-          <w:rPr>
-            <w:noProof/>
-            <w:webHidden/>
-          </w:rPr>
-          <w:tab/>
-        </w:r>
-        <w:r>
-          <w:rPr>
-            <w:noProof/>
-            <w:webHidden/>
-          </w:rPr>
-          <w:fldChar w:fldCharType="begin"/>
-        </w:r>
-        <w:r>
-          <w:rPr>
-            <w:noProof/>
-            <w:webHidden/>
-          </w:rPr>
-          <w:instrText xml:space="preserve"> PAGEREF _Toc82185851 \h </w:instrText>
-        </w:r>
-        <w:r>
-          <w:rPr>
-            <w:noProof/>
-            <w:webHidden/>
-          </w:rPr>
-        </w:r>
-        <w:r>
-          <w:rPr>
-            <w:noProof/>
-            <w:webHidden/>
-          </w:rPr>
-          <w:fldChar w:fldCharType="separate"/>
-        </w:r>
-        <w:r>
-          <w:rPr>
-            <w:noProof/>
-            <w:webHidden/>
-          </w:rPr>
-          <w:t>1</w:t>
-        </w:r>
-        <w:r>
-          <w:rPr>
-            <w:noProof/>
-            <w:webHidden/>
-          </w:rPr>
-          <w:fldChar w:fldCharType="end"/>
-        </w:r>
-      </w:hyperlink>
-    </w:p>
-    <w:p>
-      <w:pPr>
-        <w:pStyle w:val="TOC3"/>
-        <w:tabs>
-          <w:tab w:val="left" w:pos="720"/>
-          <w:tab w:val="right" w:leader="dot" w:pos="8302"/>
-        </w:tabs>
-        <w:rPr>
-          <w:rFonts w:asciiTheme="minorHAnsi" w:eastAsiaTheme="minorEastAsia" w:hAnsiTheme="minorHAnsi" w:cstheme="minorBidi"/>
-          <w:noProof/>
-          <w:sz w:val="24"/>
-          <w:szCs w:val="24"/>
-          <w:lang w:val="en-US"/>
-        </w:rPr>
-      </w:pPr>
-      <w:hyperlink w:anchor="_Toc82185852" w:history="1">
-        <w:r>
-          <w:rPr>
-            <w:rStyle w:val="Hyperlink"/>
-            <w:noProof/>
-          </w:rPr>
-          <w:t>2.1.1</w:t>
-        </w:r>
-        <w:r>
-          <w:rPr>
-            <w:rFonts w:asciiTheme="minorHAnsi" w:eastAsiaTheme="minorEastAsia" w:hAnsiTheme="minorHAnsi" w:cstheme="minorBidi"/>
-            <w:noProof/>
-            <w:sz w:val="24"/>
-            <w:szCs w:val="24"/>
-            <w:lang w:val="en-US"/>
-          </w:rPr>
-          <w:tab/>
-        </w:r>
-        <w:r>
-          <w:rPr>
-            <w:rStyle w:val="Hyperlink"/>
-            <w:noProof/>
-          </w:rPr>
-          <w:t>Summary</w:t>
-        </w:r>
-        <w:r>
-          <w:rPr>
-            <w:noProof/>
-            <w:webHidden/>
-          </w:rPr>
-          <w:tab/>
-        </w:r>
-        <w:r>
-          <w:rPr>
-            <w:noProof/>
-            <w:webHidden/>
-          </w:rPr>
-          <w:fldChar w:fldCharType="begin"/>
-        </w:r>
-        <w:r>
-          <w:rPr>
-            <w:noProof/>
-            <w:webHidden/>
-          </w:rPr>
-          <w:instrText xml:space="preserve"> PAGEREF _Toc82185852 \h </w:instrText>
-        </w:r>
-        <w:r>
-          <w:rPr>
-            <w:noProof/>
-            <w:webHidden/>
-          </w:rPr>
-        </w:r>
-        <w:r>
-          <w:rPr>
-            <w:noProof/>
-            <w:webHidden/>
-          </w:rPr>
-          <w:fldChar w:fldCharType="separate"/>
-        </w:r>
-        <w:r>
-          <w:rPr>
-            <w:noProof/>
-            <w:webHidden/>
-          </w:rPr>
-          <w:t>1</w:t>
-        </w:r>
-        <w:r>
-          <w:rPr>
-            <w:noProof/>
-            <w:webHidden/>
-          </w:rPr>
-          <w:fldChar w:fldCharType="end"/>
-        </w:r>
-      </w:hyperlink>
-    </w:p>
-    <w:p>
-      <w:pPr>
-        <w:pStyle w:val="TOC3"/>
-        <w:tabs>
-          <w:tab w:val="left" w:pos="720"/>
-          <w:tab w:val="right" w:leader="dot" w:pos="8302"/>
-        </w:tabs>
-        <w:rPr>
-          <w:rFonts w:asciiTheme="minorHAnsi" w:eastAsiaTheme="minorEastAsia" w:hAnsiTheme="minorHAnsi" w:cstheme="minorBidi"/>
-          <w:noProof/>
-          <w:sz w:val="24"/>
-          <w:szCs w:val="24"/>
-          <w:lang w:val="en-US"/>
-        </w:rPr>
-      </w:pPr>
-      <w:hyperlink w:anchor="_Toc82185853" w:history="1">
-        <w:r>
-          <w:rPr>
-            <w:rStyle w:val="Hyperlink"/>
-            <w:noProof/>
-          </w:rPr>
-          <w:t>2.1.2</w:t>
-        </w:r>
-        <w:r>
-          <w:rPr>
-            <w:rFonts w:asciiTheme="minorHAnsi" w:eastAsiaTheme="minorEastAsia" w:hAnsiTheme="minorHAnsi" w:cstheme="minorBidi"/>
-            <w:noProof/>
-            <w:sz w:val="24"/>
-            <w:szCs w:val="24"/>
-            <w:lang w:val="en-US"/>
-          </w:rPr>
-          <w:tab/>
-        </w:r>
-        <w:r>
-          <w:rPr>
-            <w:rStyle w:val="Hyperlink"/>
-            <w:noProof/>
-          </w:rPr>
-          <w:t>Global Elements</w:t>
-        </w:r>
-        <w:r>
-          <w:rPr>
-            <w:noProof/>
-            <w:webHidden/>
-          </w:rPr>
-          <w:tab/>
-        </w:r>
-        <w:r>
-          <w:rPr>
-            <w:noProof/>
-            <w:webHidden/>
-          </w:rPr>
-          <w:fldChar w:fldCharType="begin"/>
-        </w:r>
-        <w:r>
-          <w:rPr>
-            <w:noProof/>
-            <w:webHidden/>
-          </w:rPr>
-          <w:instrText xml:space="preserve"> PAGEREF _Toc82185853 \h </w:instrText>
-        </w:r>
-        <w:r>
-          <w:rPr>
-            <w:noProof/>
-            <w:webHidden/>
-          </w:rPr>
-        </w:r>
-        <w:r>
-          <w:rPr>
-            <w:noProof/>
-            <w:webHidden/>
-          </w:rPr>
-          <w:fldChar w:fldCharType="separate"/>
-        </w:r>
-        <w:r>
-          <w:rPr>
-            <w:noProof/>
-            <w:webHidden/>
-          </w:rPr>
-          <w:t>2</w:t>
-        </w:r>
-        <w:r>
-          <w:rPr>
-            <w:noProof/>
-            <w:webHidden/>
-          </w:rPr>
-          <w:fldChar w:fldCharType="end"/>
-        </w:r>
-      </w:hyperlink>
-    </w:p>
-    <w:p>
-      <w:pPr>
-        <w:pStyle w:val="TOC3"/>
-        <w:tabs>
-          <w:tab w:val="left" w:pos="720"/>
-          <w:tab w:val="right" w:leader="dot" w:pos="8302"/>
-        </w:tabs>
-        <w:rPr>
-          <w:rFonts w:asciiTheme="minorHAnsi" w:eastAsiaTheme="minorEastAsia" w:hAnsiTheme="minorHAnsi" w:cstheme="minorBidi"/>
-          <w:noProof/>
-          <w:sz w:val="24"/>
-          <w:szCs w:val="24"/>
-          <w:lang w:val="en-US"/>
-        </w:rPr>
-      </w:pPr>
-      <w:hyperlink w:anchor="_Toc82185854" w:history="1">
-        <w:r>
-          <w:rPr>
-            <w:rStyle w:val="Hyperlink"/>
-            <w:noProof/>
-          </w:rPr>
-          <w:t>2.1.3</w:t>
-        </w:r>
-        <w:r>
-          <w:rPr>
-            <w:rFonts w:asciiTheme="minorHAnsi" w:eastAsiaTheme="minorEastAsia" w:hAnsiTheme="minorHAnsi" w:cstheme="minorBidi"/>
-            <w:noProof/>
-            <w:sz w:val="24"/>
-            <w:szCs w:val="24"/>
-            <w:lang w:val="en-US"/>
-          </w:rPr>
-          <w:tab/>
-        </w:r>
-        <w:r>
-          <w:rPr>
-            <w:rStyle w:val="Hyperlink"/>
-            <w:noProof/>
-          </w:rPr>
-          <w:t>Complex Types</w:t>
-        </w:r>
-        <w:r>
-          <w:rPr>
-            <w:noProof/>
-            <w:webHidden/>
-          </w:rPr>
-          <w:tab/>
-        </w:r>
-        <w:r>
-          <w:rPr>
-            <w:noProof/>
-            <w:webHidden/>
-          </w:rPr>
-          <w:fldChar w:fldCharType="begin"/>
-        </w:r>
-        <w:r>
-          <w:rPr>
-            <w:noProof/>
-            <w:webHidden/>
-          </w:rPr>
-          <w:instrText xml:space="preserve"> PAGEREF _Toc82185854 \h </w:instrText>
-        </w:r>
-        <w:r>
-          <w:rPr>
-            <w:noProof/>
-            <w:webHidden/>
-          </w:rPr>
-        </w:r>
-        <w:r>
-          <w:rPr>
-            <w:noProof/>
-            <w:webHidden/>
-          </w:rPr>
-          <w:fldChar w:fldCharType="separate"/>
-        </w:r>
-        <w:r>
-          <w:rPr>
-            <w:noProof/>
-            <w:webHidden/>
-          </w:rPr>
-          <w:t>2</w:t>
-        </w:r>
-        <w:r>
-          <w:rPr>
-            <w:noProof/>
-            <w:webHidden/>
-          </w:rPr>
-          <w:fldChar w:fldCharType="end"/>
-        </w:r>
-      </w:hyperlink>
-    </w:p>
-    <w:p>
-      <w:pPr>
-        <w:pStyle w:val="TOC3"/>
-        <w:tabs>
-          <w:tab w:val="left" w:pos="720"/>
-          <w:tab w:val="right" w:leader="dot" w:pos="8302"/>
-        </w:tabs>
-        <w:rPr>
-          <w:rFonts w:asciiTheme="minorHAnsi" w:eastAsiaTheme="minorEastAsia" w:hAnsiTheme="minorHAnsi" w:cstheme="minorBidi"/>
-          <w:noProof/>
-          <w:sz w:val="24"/>
-          <w:szCs w:val="24"/>
-          <w:lang w:val="en-US"/>
-        </w:rPr>
-      </w:pPr>
-      <w:hyperlink w:anchor="_Toc82185855" w:history="1">
-        <w:r>
-          <w:rPr>
-            <w:rStyle w:val="Hyperlink"/>
-            <w:noProof/>
-          </w:rPr>
-          <w:t>2.1.4</w:t>
-        </w:r>
-        <w:r>
-          <w:rPr>
-            <w:rFonts w:asciiTheme="minorHAnsi" w:eastAsiaTheme="minorEastAsia" w:hAnsiTheme="minorHAnsi" w:cstheme="minorBidi"/>
-            <w:noProof/>
-            <w:sz w:val="24"/>
-            <w:szCs w:val="24"/>
-            <w:lang w:val="en-US"/>
-          </w:rPr>
-          <w:tab/>
-        </w:r>
-        <w:r>
-          <w:rPr>
-            <w:rStyle w:val="Hyperlink"/>
-            <w:noProof/>
-          </w:rPr>
-          <w:t>Simple Types</w:t>
-        </w:r>
-        <w:r>
-          <w:rPr>
-            <w:noProof/>
-            <w:webHidden/>
-          </w:rPr>
-          <w:tab/>
-        </w:r>
-        <w:r>
-          <w:rPr>
-            <w:noProof/>
-            <w:webHidden/>
-          </w:rPr>
-          <w:fldChar w:fldCharType="begin"/>
-        </w:r>
-        <w:r>
-          <w:rPr>
-            <w:noProof/>
-            <w:webHidden/>
-          </w:rPr>
-          <w:instrText xml:space="preserve"> PAGEREF _Toc82185855 \h </w:instrText>
-        </w:r>
-        <w:r>
-          <w:rPr>
-            <w:noProof/>
-            <w:webHidden/>
-          </w:rPr>
-        </w:r>
-        <w:r>
-          <w:rPr>
-            <w:noProof/>
-            <w:webHidden/>
-          </w:rPr>
-          <w:fldChar w:fldCharType="separate"/>
-        </w:r>
-        <w:r>
-          <w:rPr>
-            <w:noProof/>
-            <w:webHidden/>
-          </w:rPr>
-          <w:t>26</w:t>
-        </w:r>
-        <w:r>
-          <w:rPr>
-            <w:noProof/>
-            <w:webHidden/>
-          </w:rPr>
-          <w:fldChar w:fldCharType="end"/>
-        </w:r>
-      </w:hyperlink>
-    </w:p>
-    <w:p>
-      <w:r>
-        <w:fldChar w:fldCharType="end"/>
-      </w:r>
-    </w:p>
-    <w:p>
-      <w:pPr>
-        <w:pStyle w:val="Heading1"/>
-        <w:sectPr>
-          <w:footerReference w:type="default" r:id="rId11"/>
+          <w:footerReference w:type="default" r:id="rId8"/>
           <w:pgSz w:w="11906" w:h="16838" w:code="9"/>
           <w:pgMar w:top="1440" w:right="1797" w:bottom="1440" w:left="1797" w:header="709" w:footer="709" w:gutter="0"/>
           <w:pgNumType w:start="1"/>
@@ -1488,7 +17,7 @@
     </w:p>
     <w:p>
       <w:pPr>
-        <w:pStyle w:val="Heading1"/>
+        <w:pStyle w:val="berschrift1"/>
       </w:pPr>
       <w:bookmarkStart w:id="0" w:name="_Toc278497173"/>
       <w:bookmarkStart w:id="1" w:name="_Toc290067096"/>
@@ -1539,7 +68,7 @@
     </w:p>
     <w:p>
       <w:pPr>
-        <w:pStyle w:val="Heading1"/>
+        <w:pStyle w:val="berschrift1"/>
       </w:pPr>
       <w:bookmarkStart w:id="3" w:name="_Toc278497174"/>
       <w:bookmarkStart w:id="4" w:name="_Toc290067097"/>
@@ -1553,7 +82,7 @@
     </w:p>
     <w:p>
       <w:pPr>
-        <w:pStyle w:val="Heading2"/>
+        <w:pStyle w:val="berschrift2"/>
       </w:pPr>
       <w:bookmarkStart w:id="6" w:name="_Toc290067098"/>
       <w:bookmarkStart w:id="7" w:name="_Toc82185851"/>
@@ -1568,7 +97,7 @@
     </w:p>
     <w:p>
       <w:pPr>
-        <w:pStyle w:val="NormalWeb"/>
+        <w:pStyle w:val="StandardWeb"/>
         <w:rPr>
           <w:color w:val="000000"/>
           <w:sz w:val="20"/>
@@ -1628,7 +157,7 @@
     </w:p>
     <w:p>
       <w:pPr>
-        <w:pStyle w:val="Heading3"/>
+        <w:pStyle w:val="berschrift3"/>
         <w:rPr>
           <w:color w:val="000000"/>
           <w:sz w:val="24"/>
@@ -1650,7 +179,7 @@
     </w:p>
     <w:p>
       <w:pPr>
-        <w:pStyle w:val="NormalWeb"/>
+        <w:pStyle w:val="StandardWeb"/>
         <w:rPr>
           <w:rFonts w:eastAsiaTheme="minorEastAsia"/>
         </w:rPr>
@@ -1863,7 +392,7 @@
     </w:tbl>
     <w:p>
       <w:pPr>
-        <w:pStyle w:val="NormalWeb"/>
+        <w:pStyle w:val="StandardWeb"/>
         <w:rPr>
           <w:rFonts w:eastAsiaTheme="minorEastAsia"/>
           <w:sz w:val="20"/>
@@ -1871,20 +400,20 @@
         </w:rPr>
       </w:pPr>
       <w:r>
+        <w:t xml:space="preserve">Contents: </w:t>
+      </w:r>
+    </w:p>
+    <w:p>
+      <w:pPr>
+        <w:rPr>
+          <w:rFonts w:cs="Arial"/>
+        </w:rPr>
+      </w:pPr>
+      <w:r>
+        <w:rPr>
+          <w:rFonts w:cs="Arial"/>
+        </w:rPr>
         <w:lastRenderedPageBreak/>
-        <w:t xml:space="preserve">Contents: </w:t>
-      </w:r>
-    </w:p>
-    <w:p>
-      <w:pPr>
-        <w:rPr>
-          <w:rFonts w:cs="Arial"/>
-        </w:rPr>
-      </w:pPr>
-      <w:r>
-        <w:rPr>
-          <w:rFonts w:cs="Arial"/>
-        </w:rPr>
         <w:t>6 Global Elements</w:t>
       </w:r>
       <w:r>
@@ -1904,7 +433,7 @@
     </w:p>
     <w:p>
       <w:pPr>
-        <w:pStyle w:val="Heading3"/>
+        <w:pStyle w:val="berschrift3"/>
         <w:rPr>
           <w:color w:val="000000"/>
           <w:sz w:val="24"/>
@@ -2058,7 +587,7 @@
     </w:p>
     <w:p>
       <w:pPr>
-        <w:pStyle w:val="Heading3"/>
+        <w:pStyle w:val="berschrift3"/>
         <w:rPr>
           <w:color w:val="000000"/>
           <w:sz w:val="24"/>
@@ -2113,7 +642,7 @@
     </w:p>
     <w:p>
       <w:pPr>
-        <w:pStyle w:val="NormalWeb"/>
+        <w:pStyle w:val="StandardWeb"/>
         <w:rPr>
           <w:sz w:val="20"/>
           <w:szCs w:val="20"/>
@@ -2140,7 +669,7 @@
     </w:p>
     <w:p>
       <w:pPr>
-        <w:pStyle w:val="NormalWeb"/>
+        <w:pStyle w:val="StandardWeb"/>
         <w:rPr>
           <w:rFonts w:eastAsiaTheme="minorEastAsia"/>
           <w:sz w:val="20"/>
@@ -2464,7 +993,7 @@
     </w:p>
     <w:p>
       <w:pPr>
-        <w:pStyle w:val="NormalWeb"/>
+        <w:pStyle w:val="StandardWeb"/>
         <w:rPr>
           <w:sz w:val="20"/>
           <w:szCs w:val="20"/>
@@ -2486,6 +1015,7 @@
           <w:i/>
           <w:iCs/>
         </w:rPr>
+        <w:lastRenderedPageBreak/>
         <w:t>ValueType</w:t>
       </w:r>
       <w:r>
@@ -2542,7 +1072,7 @@
                     </pic:cNvPicPr>
                   </pic:nvPicPr>
                   <pic:blipFill>
-                    <a:blip r:link="rId12">
+                    <a:blip r:link="rId9">
                       <a:extLst>
                         <a:ext uri="{28A0092B-C50C-407E-A947-70E740481C1C}">
                           <a14:useLocalDpi xmlns:a14="http://schemas.microsoft.com/office/drawing/2010/main" val="0"/>
@@ -2588,7 +1118,7 @@
     </w:p>
     <w:p>
       <w:pPr>
-        <w:pStyle w:val="NormalWeb"/>
+        <w:pStyle w:val="StandardWeb"/>
         <w:rPr>
           <w:rFonts w:eastAsiaTheme="minorEastAsia"/>
           <w:sz w:val="20"/>
@@ -2623,7 +1153,7 @@
     </w:p>
     <w:p>
       <w:pPr>
-        <w:pStyle w:val="NormalWeb"/>
+        <w:pStyle w:val="StandardWeb"/>
         <w:rPr>
           <w:sz w:val="20"/>
           <w:szCs w:val="20"/>
@@ -2701,7 +1231,7 @@
                     </pic:cNvPicPr>
                   </pic:nvPicPr>
                   <pic:blipFill>
-                    <a:blip r:link="rId12">
+                    <a:blip r:link="rId9">
                       <a:extLst>
                         <a:ext uri="{28A0092B-C50C-407E-A947-70E740481C1C}">
                           <a14:useLocalDpi xmlns:a14="http://schemas.microsoft.com/office/drawing/2010/main" val="0"/>
@@ -2747,7 +1277,7 @@
     </w:p>
     <w:p>
       <w:pPr>
-        <w:pStyle w:val="NormalWeb"/>
+        <w:pStyle w:val="StandardWeb"/>
         <w:rPr>
           <w:rFonts w:eastAsiaTheme="minorEastAsia"/>
           <w:sz w:val="20"/>
@@ -2782,7 +1312,7 @@
     </w:p>
     <w:p>
       <w:pPr>
-        <w:pStyle w:val="NormalWeb"/>
+        <w:pStyle w:val="StandardWeb"/>
         <w:rPr>
           <w:sz w:val="20"/>
           <w:szCs w:val="20"/>
@@ -2860,7 +1390,7 @@
                     </pic:cNvPicPr>
                   </pic:nvPicPr>
                   <pic:blipFill>
-                    <a:blip r:link="rId12">
+                    <a:blip r:link="rId9">
                       <a:extLst>
                         <a:ext uri="{28A0092B-C50C-407E-A947-70E740481C1C}">
                           <a14:useLocalDpi xmlns:a14="http://schemas.microsoft.com/office/drawing/2010/main" val="0"/>
@@ -2906,7 +1436,7 @@
     </w:p>
     <w:p>
       <w:pPr>
-        <w:pStyle w:val="NormalWeb"/>
+        <w:pStyle w:val="StandardWeb"/>
         <w:rPr>
           <w:rFonts w:eastAsiaTheme="minorEastAsia"/>
           <w:sz w:val="20"/>
@@ -2941,7 +1471,7 @@
     </w:p>
     <w:p>
       <w:pPr>
-        <w:pStyle w:val="NormalWeb"/>
+        <w:pStyle w:val="StandardWeb"/>
         <w:rPr>
           <w:sz w:val="20"/>
           <w:szCs w:val="20"/>
@@ -3019,7 +1549,7 @@
                     </pic:cNvPicPr>
                   </pic:nvPicPr>
                   <pic:blipFill>
-                    <a:blip r:link="rId12">
+                    <a:blip r:link="rId9">
                       <a:extLst>
                         <a:ext uri="{28A0092B-C50C-407E-A947-70E740481C1C}">
                           <a14:useLocalDpi xmlns:a14="http://schemas.microsoft.com/office/drawing/2010/main" val="0"/>
@@ -3065,7 +1595,7 @@
     </w:p>
     <w:p>
       <w:pPr>
-        <w:pStyle w:val="NormalWeb"/>
+        <w:pStyle w:val="StandardWeb"/>
         <w:rPr>
           <w:rFonts w:eastAsiaTheme="minorEastAsia"/>
           <w:sz w:val="20"/>
@@ -3100,7 +1630,7 @@
     </w:p>
     <w:p>
       <w:pPr>
-        <w:pStyle w:val="NormalWeb"/>
+        <w:pStyle w:val="StandardWeb"/>
         <w:rPr>
           <w:sz w:val="20"/>
           <w:szCs w:val="20"/>
@@ -3178,7 +1708,7 @@
                     </pic:cNvPicPr>
                   </pic:nvPicPr>
                   <pic:blipFill>
-                    <a:blip r:link="rId12">
+                    <a:blip r:link="rId9">
                       <a:extLst>
                         <a:ext uri="{28A0092B-C50C-407E-A947-70E740481C1C}">
                           <a14:useLocalDpi xmlns:a14="http://schemas.microsoft.com/office/drawing/2010/main" val="0"/>
@@ -3224,7 +1754,7 @@
     </w:p>
     <w:p>
       <w:pPr>
-        <w:pStyle w:val="NormalWeb"/>
+        <w:pStyle w:val="StandardWeb"/>
         <w:rPr>
           <w:rFonts w:eastAsiaTheme="minorEastAsia"/>
           <w:sz w:val="20"/>
@@ -3260,7 +1790,7 @@
     </w:p>
     <w:p>
       <w:pPr>
-        <w:pStyle w:val="NormalWeb"/>
+        <w:pStyle w:val="StandardWeb"/>
         <w:rPr>
           <w:sz w:val="20"/>
           <w:szCs w:val="20"/>
@@ -3338,7 +1868,7 @@
                     </pic:cNvPicPr>
                   </pic:nvPicPr>
                   <pic:blipFill>
-                    <a:blip r:link="rId12">
+                    <a:blip r:link="rId9">
                       <a:extLst>
                         <a:ext uri="{28A0092B-C50C-407E-A947-70E740481C1C}">
                           <a14:useLocalDpi xmlns:a14="http://schemas.microsoft.com/office/drawing/2010/main" val="0"/>
@@ -3384,7 +1914,7 @@
     </w:p>
     <w:p>
       <w:pPr>
-        <w:pStyle w:val="NormalWeb"/>
+        <w:pStyle w:val="StandardWeb"/>
         <w:rPr>
           <w:rFonts w:eastAsiaTheme="minorEastAsia"/>
           <w:sz w:val="20"/>
@@ -3392,6 +1922,7 @@
         </w:rPr>
       </w:pPr>
       <w:r>
+        <w:lastRenderedPageBreak/>
         <w:t xml:space="preserve">Content: </w:t>
       </w:r>
     </w:p>
@@ -3410,7 +1941,7 @@
     </w:p>
     <w:p>
       <w:pPr>
-        <w:pStyle w:val="NormalWeb"/>
+        <w:pStyle w:val="StandardWeb"/>
         <w:rPr>
           <w:rFonts w:eastAsiaTheme="minorEastAsia"/>
           <w:sz w:val="20"/>
@@ -3649,7 +2180,7 @@
     </w:p>
     <w:p>
       <w:pPr>
-        <w:pStyle w:val="NormalWeb"/>
+        <w:pStyle w:val="StandardWeb"/>
         <w:rPr>
           <w:sz w:val="20"/>
           <w:szCs w:val="20"/>
@@ -3727,7 +2258,7 @@
                     </pic:cNvPicPr>
                   </pic:nvPicPr>
                   <pic:blipFill>
-                    <a:blip r:link="rId12">
+                    <a:blip r:link="rId9">
                       <a:extLst>
                         <a:ext uri="{28A0092B-C50C-407E-A947-70E740481C1C}">
                           <a14:useLocalDpi xmlns:a14="http://schemas.microsoft.com/office/drawing/2010/main" val="0"/>
@@ -3773,7 +2304,7 @@
     </w:p>
     <w:p>
       <w:pPr>
-        <w:pStyle w:val="NormalWeb"/>
+        <w:pStyle w:val="StandardWeb"/>
         <w:rPr>
           <w:rFonts w:eastAsiaTheme="minorEastAsia"/>
           <w:sz w:val="20"/>
@@ -3799,7 +2330,7 @@
     </w:p>
     <w:p>
       <w:pPr>
-        <w:pStyle w:val="NormalWeb"/>
+        <w:pStyle w:val="StandardWeb"/>
         <w:rPr>
           <w:rFonts w:eastAsiaTheme="minorEastAsia"/>
           <w:sz w:val="20"/>
@@ -4038,7 +2569,7 @@
     </w:p>
     <w:p>
       <w:pPr>
-        <w:pStyle w:val="NormalWeb"/>
+        <w:pStyle w:val="StandardWeb"/>
         <w:rPr>
           <w:sz w:val="20"/>
           <w:szCs w:val="20"/>
@@ -4109,7 +2640,7 @@
                     </pic:cNvPicPr>
                   </pic:nvPicPr>
                   <pic:blipFill>
-                    <a:blip r:link="rId12">
+                    <a:blip r:link="rId9">
                       <a:extLst>
                         <a:ext uri="{28A0092B-C50C-407E-A947-70E740481C1C}">
                           <a14:useLocalDpi xmlns:a14="http://schemas.microsoft.com/office/drawing/2010/main" val="0"/>
@@ -4200,7 +2731,7 @@
                     </pic:cNvPicPr>
                   </pic:nvPicPr>
                   <pic:blipFill>
-                    <a:blip r:link="rId12">
+                    <a:blip r:link="rId9">
                       <a:extLst>
                         <a:ext uri="{28A0092B-C50C-407E-A947-70E740481C1C}">
                           <a14:useLocalDpi xmlns:a14="http://schemas.microsoft.com/office/drawing/2010/main" val="0"/>
@@ -4246,7 +2777,7 @@
     </w:p>
     <w:p>
       <w:pPr>
-        <w:pStyle w:val="NormalWeb"/>
+        <w:pStyle w:val="StandardWeb"/>
         <w:rPr>
           <w:rFonts w:eastAsiaTheme="minorEastAsia"/>
           <w:sz w:val="20"/>
@@ -4272,7 +2803,7 @@
     </w:p>
     <w:p>
       <w:pPr>
-        <w:pStyle w:val="NormalWeb"/>
+        <w:pStyle w:val="StandardWeb"/>
         <w:rPr>
           <w:rFonts w:eastAsiaTheme="minorEastAsia"/>
           <w:sz w:val="20"/>
@@ -4285,7 +2816,7 @@
     </w:p>
     <w:p>
       <w:pPr>
-        <w:pStyle w:val="NormalWeb"/>
+        <w:pStyle w:val="StandardWeb"/>
       </w:pPr>
       <w:r>
         <w:t xml:space="preserve">Attribute Documentation: </w:t>
@@ -4519,7 +3050,7 @@
     </w:p>
     <w:p>
       <w:pPr>
-        <w:pStyle w:val="NormalWeb"/>
+        <w:pStyle w:val="StandardWeb"/>
         <w:rPr>
           <w:sz w:val="20"/>
           <w:szCs w:val="20"/>
@@ -4550,7 +3081,7 @@
     </w:p>
     <w:p>
       <w:pPr>
-        <w:pStyle w:val="NormalWeb"/>
+        <w:pStyle w:val="StandardWeb"/>
         <w:rPr>
           <w:rFonts w:eastAsiaTheme="minorEastAsia"/>
           <w:sz w:val="20"/>
@@ -4582,7 +3113,7 @@
     </w:p>
     <w:p>
       <w:pPr>
-        <w:pStyle w:val="NormalWeb"/>
+        <w:pStyle w:val="StandardWeb"/>
         <w:rPr>
           <w:rFonts w:eastAsiaTheme="minorEastAsia"/>
           <w:sz w:val="20"/>
@@ -4802,7 +3333,7 @@
     </w:tbl>
     <w:p>
       <w:pPr>
-        <w:pStyle w:val="NormalWeb"/>
+        <w:pStyle w:val="StandardWeb"/>
         <w:rPr>
           <w:rFonts w:eastAsiaTheme="minorEastAsia"/>
           <w:sz w:val="20"/>
@@ -5041,14 +3572,13 @@
     </w:p>
     <w:p>
       <w:pPr>
-        <w:pStyle w:val="NormalWeb"/>
+        <w:pStyle w:val="StandardWeb"/>
         <w:rPr>
           <w:sz w:val="20"/>
           <w:szCs w:val="20"/>
         </w:rPr>
       </w:pPr>
       <w:r>
-        <w:lastRenderedPageBreak/>
         <w:t xml:space="preserve">Content: </w:t>
       </w:r>
     </w:p>
@@ -5090,7 +3620,7 @@
     </w:p>
     <w:p>
       <w:pPr>
-        <w:pStyle w:val="NormalWeb"/>
+        <w:pStyle w:val="StandardWeb"/>
         <w:rPr>
           <w:sz w:val="20"/>
           <w:szCs w:val="20"/>
@@ -5168,7 +3698,7 @@
                     </pic:cNvPicPr>
                   </pic:nvPicPr>
                   <pic:blipFill>
-                    <a:blip r:link="rId12">
+                    <a:blip r:link="rId9">
                       <a:extLst>
                         <a:ext uri="{28A0092B-C50C-407E-A947-70E740481C1C}">
                           <a14:useLocalDpi xmlns:a14="http://schemas.microsoft.com/office/drawing/2010/main" val="0"/>
@@ -5215,7 +3745,7 @@
     </w:p>
     <w:p>
       <w:pPr>
-        <w:pStyle w:val="NormalWeb"/>
+        <w:pStyle w:val="StandardWeb"/>
         <w:rPr>
           <w:rFonts w:eastAsiaTheme="minorEastAsia"/>
           <w:sz w:val="20"/>
@@ -5247,7 +3777,7 @@
     </w:p>
     <w:p>
       <w:pPr>
-        <w:pStyle w:val="NormalWeb"/>
+        <w:pStyle w:val="StandardWeb"/>
         <w:rPr>
           <w:rFonts w:eastAsiaTheme="minorEastAsia"/>
           <w:sz w:val="20"/>
@@ -5277,7 +3807,7 @@
     </w:p>
     <w:p>
       <w:pPr>
-        <w:pStyle w:val="NormalWeb"/>
+        <w:pStyle w:val="StandardWeb"/>
         <w:rPr>
           <w:rFonts w:eastAsiaTheme="minorEastAsia"/>
           <w:sz w:val="20"/>
@@ -5493,7 +4023,7 @@
     </w:tbl>
     <w:p>
       <w:pPr>
-        <w:pStyle w:val="NormalWeb"/>
+        <w:pStyle w:val="StandardWeb"/>
         <w:rPr>
           <w:rFonts w:eastAsiaTheme="minorEastAsia"/>
           <w:sz w:val="20"/>
@@ -5742,7 +4272,7 @@
     </w:p>
     <w:p>
       <w:pPr>
-        <w:pStyle w:val="NormalWeb"/>
+        <w:pStyle w:val="StandardWeb"/>
         <w:rPr>
           <w:sz w:val="20"/>
           <w:szCs w:val="20"/>
@@ -5767,7 +4297,7 @@
     </w:p>
     <w:p>
       <w:pPr>
-        <w:pStyle w:val="NormalWeb"/>
+        <w:pStyle w:val="StandardWeb"/>
         <w:rPr>
           <w:rFonts w:eastAsiaTheme="minorEastAsia"/>
           <w:sz w:val="20"/>
@@ -5833,7 +4363,6 @@
                 <w:b/>
                 <w:bCs/>
               </w:rPr>
-              <w:lastRenderedPageBreak/>
               <w:t>Name</w:t>
             </w:r>
           </w:p>
@@ -6007,7 +4536,7 @@
     </w:p>
     <w:p>
       <w:pPr>
-        <w:pStyle w:val="NormalWeb"/>
+        <w:pStyle w:val="StandardWeb"/>
         <w:rPr>
           <w:sz w:val="20"/>
           <w:szCs w:val="20"/>
@@ -6032,7 +4561,7 @@
     </w:p>
     <w:p>
       <w:pPr>
-        <w:pStyle w:val="NormalWeb"/>
+        <w:pStyle w:val="StandardWeb"/>
         <w:rPr>
           <w:rFonts w:eastAsiaTheme="minorEastAsia"/>
           <w:sz w:val="20"/>
@@ -6265,7 +4794,7 @@
     </w:p>
     <w:p>
       <w:pPr>
-        <w:pStyle w:val="NormalWeb"/>
+        <w:pStyle w:val="StandardWeb"/>
         <w:rPr>
           <w:sz w:val="20"/>
           <w:szCs w:val="20"/>
@@ -6290,7 +4819,7 @@
     </w:p>
     <w:p>
       <w:pPr>
-        <w:pStyle w:val="NormalWeb"/>
+        <w:pStyle w:val="StandardWeb"/>
         <w:rPr>
           <w:rFonts w:eastAsiaTheme="minorEastAsia"/>
           <w:sz w:val="20"/>
@@ -6316,7 +4845,7 @@
     </w:p>
     <w:p>
       <w:pPr>
-        <w:pStyle w:val="NormalWeb"/>
+        <w:pStyle w:val="StandardWeb"/>
         <w:rPr>
           <w:rFonts w:eastAsiaTheme="minorEastAsia"/>
           <w:sz w:val="20"/>
@@ -6532,7 +5061,7 @@
     </w:tbl>
     <w:p>
       <w:pPr>
-        <w:pStyle w:val="NormalWeb"/>
+        <w:pStyle w:val="StandardWeb"/>
         <w:rPr>
           <w:rFonts w:eastAsiaTheme="minorEastAsia"/>
           <w:sz w:val="20"/>
@@ -6770,7 +5299,6 @@
               <w:rPr>
                 <w:rFonts w:cs="Arial"/>
               </w:rPr>
-              <w:lastRenderedPageBreak/>
               <w:t>AnnotationType</w:t>
             </w:r>
           </w:p>
@@ -7092,7 +5620,7 @@
     </w:p>
     <w:p>
       <w:pPr>
-        <w:pStyle w:val="NormalWeb"/>
+        <w:pStyle w:val="StandardWeb"/>
         <w:rPr>
           <w:sz w:val="20"/>
           <w:szCs w:val="20"/>
@@ -7162,7 +5690,7 @@
                     </pic:cNvPicPr>
                   </pic:nvPicPr>
                   <pic:blipFill>
-                    <a:blip r:link="rId12">
+                    <a:blip r:link="rId9">
                       <a:extLst>
                         <a:ext uri="{28A0092B-C50C-407E-A947-70E740481C1C}">
                           <a14:useLocalDpi xmlns:a14="http://schemas.microsoft.com/office/drawing/2010/main" val="0"/>
@@ -7253,7 +5781,7 @@
                     </pic:cNvPicPr>
                   </pic:nvPicPr>
                   <pic:blipFill>
-                    <a:blip r:link="rId12">
+                    <a:blip r:link="rId9">
                       <a:extLst>
                         <a:ext uri="{28A0092B-C50C-407E-A947-70E740481C1C}">
                           <a14:useLocalDpi xmlns:a14="http://schemas.microsoft.com/office/drawing/2010/main" val="0"/>
@@ -7299,7 +5827,7 @@
     </w:p>
     <w:p>
       <w:pPr>
-        <w:pStyle w:val="NormalWeb"/>
+        <w:pStyle w:val="StandardWeb"/>
         <w:rPr>
           <w:rFonts w:eastAsiaTheme="minorEastAsia"/>
           <w:sz w:val="20"/>
@@ -7325,7 +5853,7 @@
     </w:p>
     <w:p>
       <w:pPr>
-        <w:pStyle w:val="NormalWeb"/>
+        <w:pStyle w:val="StandardWeb"/>
         <w:rPr>
           <w:rFonts w:eastAsiaTheme="minorEastAsia"/>
           <w:sz w:val="20"/>
@@ -7338,7 +5866,7 @@
     </w:p>
     <w:p>
       <w:pPr>
-        <w:pStyle w:val="NormalWeb"/>
+        <w:pStyle w:val="StandardWeb"/>
       </w:pPr>
       <w:r>
         <w:t xml:space="preserve">Attribute Documentation: </w:t>
@@ -7568,7 +6096,7 @@
     </w:p>
     <w:p>
       <w:pPr>
-        <w:pStyle w:val="NormalWeb"/>
+        <w:pStyle w:val="StandardWeb"/>
         <w:rPr>
           <w:sz w:val="20"/>
           <w:szCs w:val="20"/>
@@ -7594,13 +6122,12 @@
           <w:rStyle w:val="code1"/>
           <w:lang w:val="fr-FR"/>
         </w:rPr>
-        <w:lastRenderedPageBreak/>
         <w:t>rel, url, urn?, type?</w:t>
       </w:r>
     </w:p>
     <w:p>
       <w:pPr>
-        <w:pStyle w:val="NormalWeb"/>
+        <w:pStyle w:val="StandardWeb"/>
         <w:rPr>
           <w:rFonts w:eastAsiaTheme="minorEastAsia"/>
           <w:sz w:val="20"/>
@@ -7632,7 +6159,7 @@
     </w:p>
     <w:p>
       <w:pPr>
-        <w:pStyle w:val="NormalWeb"/>
+        <w:pStyle w:val="StandardWeb"/>
         <w:rPr>
           <w:rFonts w:eastAsiaTheme="minorEastAsia"/>
           <w:sz w:val="20"/>
@@ -8125,7 +6652,7 @@
     </w:p>
     <w:p>
       <w:pPr>
-        <w:pStyle w:val="NormalWeb"/>
+        <w:pStyle w:val="StandardWeb"/>
         <w:rPr>
           <w:sz w:val="20"/>
           <w:szCs w:val="20"/>
@@ -8203,7 +6730,7 @@
                     </pic:cNvPicPr>
                   </pic:nvPicPr>
                   <pic:blipFill>
-                    <a:blip r:link="rId12">
+                    <a:blip r:link="rId9">
                       <a:extLst>
                         <a:ext uri="{28A0092B-C50C-407E-A947-70E740481C1C}">
                           <a14:useLocalDpi xmlns:a14="http://schemas.microsoft.com/office/drawing/2010/main" val="0"/>
@@ -8251,7 +6778,7 @@
     </w:p>
     <w:p>
       <w:pPr>
-        <w:pStyle w:val="NormalWeb"/>
+        <w:pStyle w:val="StandardWeb"/>
         <w:rPr>
           <w:rFonts w:eastAsiaTheme="minorEastAsia"/>
           <w:sz w:val="20"/>
@@ -8277,7 +6804,7 @@
     </w:p>
     <w:p>
       <w:pPr>
-        <w:pStyle w:val="NormalWeb"/>
+        <w:pStyle w:val="StandardWeb"/>
         <w:rPr>
           <w:rFonts w:eastAsiaTheme="minorEastAsia"/>
           <w:sz w:val="20"/>
@@ -8303,7 +6830,7 @@
     </w:p>
     <w:p>
       <w:pPr>
-        <w:pStyle w:val="NormalWeb"/>
+        <w:pStyle w:val="StandardWeb"/>
         <w:rPr>
           <w:rFonts w:eastAsiaTheme="minorEastAsia"/>
           <w:sz w:val="20"/>
@@ -8679,7 +7206,7 @@
     </w:tbl>
     <w:p>
       <w:pPr>
-        <w:pStyle w:val="NormalWeb"/>
+        <w:pStyle w:val="StandardWeb"/>
         <w:rPr>
           <w:rFonts w:eastAsiaTheme="minorEastAsia"/>
           <w:sz w:val="20"/>
@@ -8687,7 +7214,6 @@
         </w:rPr>
       </w:pPr>
       <w:r>
-        <w:lastRenderedPageBreak/>
         <w:t xml:space="preserve">Element Documentation: </w:t>
       </w:r>
     </w:p>
@@ -9009,7 +7535,7 @@
     </w:p>
     <w:p>
       <w:pPr>
-        <w:pStyle w:val="NormalWeb"/>
+        <w:pStyle w:val="StandardWeb"/>
         <w:rPr>
           <w:sz w:val="20"/>
           <w:szCs w:val="20"/>
@@ -9087,7 +7613,7 @@
                     </pic:cNvPicPr>
                   </pic:nvPicPr>
                   <pic:blipFill>
-                    <a:blip r:link="rId12">
+                    <a:blip r:link="rId9">
                       <a:extLst>
                         <a:ext uri="{28A0092B-C50C-407E-A947-70E740481C1C}">
                           <a14:useLocalDpi xmlns:a14="http://schemas.microsoft.com/office/drawing/2010/main" val="0"/>
@@ -9186,7 +7712,7 @@
                     </pic:cNvPicPr>
                   </pic:nvPicPr>
                   <pic:blipFill>
-                    <a:blip r:link="rId12">
+                    <a:blip r:link="rId9">
                       <a:extLst>
                         <a:ext uri="{28A0092B-C50C-407E-A947-70E740481C1C}">
                           <a14:useLocalDpi xmlns:a14="http://schemas.microsoft.com/office/drawing/2010/main" val="0"/>
@@ -9234,7 +7760,7 @@
     </w:p>
     <w:p>
       <w:pPr>
-        <w:pStyle w:val="NormalWeb"/>
+        <w:pStyle w:val="StandardWeb"/>
         <w:rPr>
           <w:rFonts w:eastAsiaTheme="minorEastAsia"/>
           <w:sz w:val="20"/>
@@ -9260,7 +7786,7 @@
     </w:p>
     <w:p>
       <w:pPr>
-        <w:pStyle w:val="NormalWeb"/>
+        <w:pStyle w:val="StandardWeb"/>
         <w:rPr>
           <w:rFonts w:eastAsiaTheme="minorEastAsia"/>
           <w:sz w:val="20"/>
@@ -9286,7 +7812,7 @@
     </w:p>
     <w:p>
       <w:pPr>
-        <w:pStyle w:val="NormalWeb"/>
+        <w:pStyle w:val="StandardWeb"/>
         <w:rPr>
           <w:rFonts w:eastAsiaTheme="minorEastAsia"/>
           <w:sz w:val="20"/>
@@ -9662,7 +8188,7 @@
     </w:tbl>
     <w:p>
       <w:pPr>
-        <w:pStyle w:val="NormalWeb"/>
+        <w:pStyle w:val="StandardWeb"/>
         <w:rPr>
           <w:rFonts w:eastAsiaTheme="minorEastAsia"/>
           <w:sz w:val="20"/>
@@ -9728,7 +8254,6 @@
                 <w:b/>
                 <w:bCs/>
               </w:rPr>
-              <w:lastRenderedPageBreak/>
               <w:t>Name</w:t>
             </w:r>
           </w:p>
@@ -10152,7 +8677,7 @@
     </w:p>
     <w:p>
       <w:pPr>
-        <w:pStyle w:val="NormalWeb"/>
+        <w:pStyle w:val="StandardWeb"/>
         <w:rPr>
           <w:sz w:val="20"/>
           <w:szCs w:val="20"/>
@@ -10230,7 +8755,7 @@
                     </pic:cNvPicPr>
                   </pic:nvPicPr>
                   <pic:blipFill>
-                    <a:blip r:link="rId12">
+                    <a:blip r:link="rId9">
                       <a:extLst>
                         <a:ext uri="{28A0092B-C50C-407E-A947-70E740481C1C}">
                           <a14:useLocalDpi xmlns:a14="http://schemas.microsoft.com/office/drawing/2010/main" val="0"/>
@@ -10329,7 +8854,7 @@
                     </pic:cNvPicPr>
                   </pic:nvPicPr>
                   <pic:blipFill>
-                    <a:blip r:link="rId12">
+                    <a:blip r:link="rId9">
                       <a:extLst>
                         <a:ext uri="{28A0092B-C50C-407E-A947-70E740481C1C}">
                           <a14:useLocalDpi xmlns:a14="http://schemas.microsoft.com/office/drawing/2010/main" val="0"/>
@@ -10428,7 +8953,7 @@
                     </pic:cNvPicPr>
                   </pic:nvPicPr>
                   <pic:blipFill>
-                    <a:blip r:link="rId12">
+                    <a:blip r:link="rId9">
                       <a:extLst>
                         <a:ext uri="{28A0092B-C50C-407E-A947-70E740481C1C}">
                           <a14:useLocalDpi xmlns:a14="http://schemas.microsoft.com/office/drawing/2010/main" val="0"/>
@@ -10476,7 +9001,7 @@
     </w:p>
     <w:p>
       <w:pPr>
-        <w:pStyle w:val="NormalWeb"/>
+        <w:pStyle w:val="StandardWeb"/>
         <w:rPr>
           <w:rFonts w:eastAsiaTheme="minorEastAsia"/>
           <w:sz w:val="20"/>
@@ -10502,7 +9027,7 @@
     </w:p>
     <w:p>
       <w:pPr>
-        <w:pStyle w:val="NormalWeb"/>
+        <w:pStyle w:val="StandardWeb"/>
         <w:rPr>
           <w:rFonts w:eastAsiaTheme="minorEastAsia"/>
           <w:sz w:val="20"/>
@@ -10528,7 +9053,7 @@
     </w:p>
     <w:p>
       <w:pPr>
-        <w:pStyle w:val="NormalWeb"/>
+        <w:pStyle w:val="StandardWeb"/>
         <w:rPr>
           <w:rFonts w:eastAsiaTheme="minorEastAsia"/>
           <w:sz w:val="20"/>
@@ -10846,7 +9371,6 @@
               <w:rPr>
                 <w:rFonts w:cs="Arial"/>
               </w:rPr>
-              <w:lastRenderedPageBreak/>
               <w:t>uri</w:t>
             </w:r>
           </w:p>
@@ -11145,7 +9669,7 @@
     </w:tbl>
     <w:p>
       <w:pPr>
-        <w:pStyle w:val="NormalWeb"/>
+        <w:pStyle w:val="StandardWeb"/>
         <w:rPr>
           <w:rFonts w:eastAsiaTheme="minorEastAsia"/>
           <w:sz w:val="20"/>
@@ -11634,7 +10158,7 @@
     </w:p>
     <w:p>
       <w:pPr>
-        <w:pStyle w:val="NormalWeb"/>
+        <w:pStyle w:val="StandardWeb"/>
         <w:rPr>
           <w:sz w:val="20"/>
           <w:szCs w:val="20"/>
@@ -11712,7 +10236,7 @@
                     </pic:cNvPicPr>
                   </pic:nvPicPr>
                   <pic:blipFill>
-                    <a:blip r:link="rId12">
+                    <a:blip r:link="rId9">
                       <a:extLst>
                         <a:ext uri="{28A0092B-C50C-407E-A947-70E740481C1C}">
                           <a14:useLocalDpi xmlns:a14="http://schemas.microsoft.com/office/drawing/2010/main" val="0"/>
@@ -11811,7 +10335,7 @@
                     </pic:cNvPicPr>
                   </pic:nvPicPr>
                   <pic:blipFill>
-                    <a:blip r:link="rId12">
+                    <a:blip r:link="rId9">
                       <a:extLst>
                         <a:ext uri="{28A0092B-C50C-407E-A947-70E740481C1C}">
                           <a14:useLocalDpi xmlns:a14="http://schemas.microsoft.com/office/drawing/2010/main" val="0"/>
@@ -11867,12 +10391,6 @@
           <w:rFonts w:cs="Arial"/>
         </w:rPr>
         <w:br/>
-      </w:r>
-      <w:r>
-        <w:rPr>
-          <w:rFonts w:cs="Arial"/>
-        </w:rPr>
-        <w:lastRenderedPageBreak/>
         <w:t>               </w:t>
       </w:r>
       <w:r>
@@ -11916,7 +10434,7 @@
                     </pic:cNvPicPr>
                   </pic:nvPicPr>
                   <pic:blipFill>
-                    <a:blip r:link="rId12">
+                    <a:blip r:link="rId9">
                       <a:extLst>
                         <a:ext uri="{28A0092B-C50C-407E-A947-70E740481C1C}">
                           <a14:useLocalDpi xmlns:a14="http://schemas.microsoft.com/office/drawing/2010/main" val="0"/>
@@ -12015,7 +10533,7 @@
                     </pic:cNvPicPr>
                   </pic:nvPicPr>
                   <pic:blipFill>
-                    <a:blip r:link="rId12">
+                    <a:blip r:link="rId9">
                       <a:extLst>
                         <a:ext uri="{28A0092B-C50C-407E-A947-70E740481C1C}">
                           <a14:useLocalDpi xmlns:a14="http://schemas.microsoft.com/office/drawing/2010/main" val="0"/>
@@ -12063,7 +10581,7 @@
     </w:p>
     <w:p>
       <w:pPr>
-        <w:pStyle w:val="NormalWeb"/>
+        <w:pStyle w:val="StandardWeb"/>
         <w:rPr>
           <w:rFonts w:eastAsiaTheme="minorEastAsia"/>
           <w:sz w:val="20"/>
@@ -12089,7 +10607,7 @@
     </w:p>
     <w:p>
       <w:pPr>
-        <w:pStyle w:val="NormalWeb"/>
+        <w:pStyle w:val="StandardWeb"/>
         <w:rPr>
           <w:rFonts w:eastAsiaTheme="minorEastAsia"/>
           <w:sz w:val="20"/>
@@ -12115,7 +10633,7 @@
     </w:p>
     <w:p>
       <w:pPr>
-        <w:pStyle w:val="NormalWeb"/>
+        <w:pStyle w:val="StandardWeb"/>
         <w:rPr>
           <w:rFonts w:eastAsiaTheme="minorEastAsia"/>
           <w:sz w:val="20"/>
@@ -12731,7 +11249,7 @@
     </w:tbl>
     <w:p>
       <w:pPr>
-        <w:pStyle w:val="NormalWeb"/>
+        <w:pStyle w:val="StandardWeb"/>
         <w:rPr>
           <w:rFonts w:eastAsiaTheme="minorEastAsia"/>
           <w:sz w:val="20"/>
@@ -13019,14 +11537,7 @@
               <w:rPr>
                 <w:rFonts w:cs="Arial"/>
               </w:rPr>
-              <w:t xml:space="preserve">Allows for the linking of other resources to identifiable objects. For example, if there is reference metadata </w:t>
-            </w:r>
-            <w:r>
-              <w:rPr>
-                <w:rFonts w:cs="Arial"/>
-              </w:rPr>
-              <w:lastRenderedPageBreak/>
-              <w:t xml:space="preserve">associated with a structure, a link to the meatadata report can be dynamically inserted in the structure metadata. </w:t>
+              <w:t xml:space="preserve">Allows for the linking of other resources to identifiable objects. For example, if there is reference metadata associated with a structure, a link to the meatadata report can be dynamically inserted in the structure metadata. </w:t>
             </w:r>
           </w:p>
         </w:tc>
@@ -13056,7 +11567,6 @@
               <w:rPr>
                 <w:rFonts w:cs="Arial"/>
               </w:rPr>
-              <w:lastRenderedPageBreak/>
               <w:t>Name</w:t>
             </w:r>
           </w:p>
@@ -13228,7 +11738,7 @@
     </w:p>
     <w:p>
       <w:pPr>
-        <w:pStyle w:val="NormalWeb"/>
+        <w:pStyle w:val="StandardWeb"/>
         <w:rPr>
           <w:sz w:val="20"/>
           <w:szCs w:val="20"/>
@@ -13306,7 +11816,7 @@
                     </pic:cNvPicPr>
                   </pic:nvPicPr>
                   <pic:blipFill>
-                    <a:blip r:link="rId12">
+                    <a:blip r:link="rId9">
                       <a:extLst>
                         <a:ext uri="{28A0092B-C50C-407E-A947-70E740481C1C}">
                           <a14:useLocalDpi xmlns:a14="http://schemas.microsoft.com/office/drawing/2010/main" val="0"/>
@@ -13405,7 +11915,7 @@
                     </pic:cNvPicPr>
                   </pic:nvPicPr>
                   <pic:blipFill>
-                    <a:blip r:link="rId12">
+                    <a:blip r:link="rId9">
                       <a:extLst>
                         <a:ext uri="{28A0092B-C50C-407E-A947-70E740481C1C}">
                           <a14:useLocalDpi xmlns:a14="http://schemas.microsoft.com/office/drawing/2010/main" val="0"/>
@@ -13504,7 +12014,7 @@
                     </pic:cNvPicPr>
                   </pic:nvPicPr>
                   <pic:blipFill>
-                    <a:blip r:link="rId12">
+                    <a:blip r:link="rId9">
                       <a:extLst>
                         <a:ext uri="{28A0092B-C50C-407E-A947-70E740481C1C}">
                           <a14:useLocalDpi xmlns:a14="http://schemas.microsoft.com/office/drawing/2010/main" val="0"/>
@@ -13603,7 +12113,7 @@
                     </pic:cNvPicPr>
                   </pic:nvPicPr>
                   <pic:blipFill>
-                    <a:blip r:link="rId12">
+                    <a:blip r:link="rId9">
                       <a:extLst>
                         <a:ext uri="{28A0092B-C50C-407E-A947-70E740481C1C}">
                           <a14:useLocalDpi xmlns:a14="http://schemas.microsoft.com/office/drawing/2010/main" val="0"/>
@@ -13702,7 +12212,7 @@
                     </pic:cNvPicPr>
                   </pic:nvPicPr>
                   <pic:blipFill>
-                    <a:blip r:link="rId12">
+                    <a:blip r:link="rId9">
                       <a:extLst>
                         <a:ext uri="{28A0092B-C50C-407E-A947-70E740481C1C}">
                           <a14:useLocalDpi xmlns:a14="http://schemas.microsoft.com/office/drawing/2010/main" val="0"/>
@@ -13750,7 +12260,7 @@
     </w:p>
     <w:p>
       <w:pPr>
-        <w:pStyle w:val="NormalWeb"/>
+        <w:pStyle w:val="StandardWeb"/>
         <w:rPr>
           <w:rFonts w:eastAsiaTheme="minorEastAsia"/>
           <w:sz w:val="20"/>
@@ -13776,7 +12286,7 @@
     </w:p>
     <w:p>
       <w:pPr>
-        <w:pStyle w:val="NormalWeb"/>
+        <w:pStyle w:val="StandardWeb"/>
         <w:rPr>
           <w:rFonts w:eastAsiaTheme="minorEastAsia"/>
           <w:sz w:val="20"/>
@@ -13808,7 +12318,7 @@
     </w:p>
     <w:p>
       <w:pPr>
-        <w:pStyle w:val="NormalWeb"/>
+        <w:pStyle w:val="StandardWeb"/>
         <w:rPr>
           <w:rFonts w:eastAsiaTheme="minorEastAsia"/>
           <w:sz w:val="20"/>
@@ -14210,7 +12720,6 @@
               <w:rPr>
                 <w:rFonts w:cs="Arial"/>
               </w:rPr>
-              <w:lastRenderedPageBreak/>
               <w:t>version</w:t>
             </w:r>
           </w:p>
@@ -14741,14 +13250,7 @@
               <w:rPr>
                 <w:rFonts w:cs="Arial"/>
               </w:rPr>
-              <w:t xml:space="preserve">The structureURL attribute indicates the URL of a SDMX-ML structure message (in the same version as the source document) in which the externally referenced object is contained. Note that this may be a URL of </w:t>
-            </w:r>
-            <w:r>
-              <w:rPr>
-                <w:rFonts w:cs="Arial"/>
-              </w:rPr>
-              <w:lastRenderedPageBreak/>
-              <w:t xml:space="preserve">an SDMX RESTful web service which will return the referenced object. </w:t>
+              <w:t xml:space="preserve">The structureURL attribute indicates the URL of a SDMX-ML structure message (in the same version as the source document) in which the externally referenced object is contained. Note that this may be a URL of an SDMX RESTful web service which will return the referenced object. </w:t>
             </w:r>
           </w:p>
         </w:tc>
@@ -14756,7 +13258,7 @@
     </w:tbl>
     <w:p>
       <w:pPr>
-        <w:pStyle w:val="NormalWeb"/>
+        <w:pStyle w:val="StandardWeb"/>
         <w:rPr>
           <w:rFonts w:eastAsiaTheme="minorEastAsia"/>
           <w:sz w:val="20"/>
@@ -14764,7 +13266,6 @@
         </w:rPr>
       </w:pPr>
       <w:r>
-        <w:lastRenderedPageBreak/>
         <w:t xml:space="preserve">Element Documentation: </w:t>
       </w:r>
     </w:p>
@@ -15236,7 +13737,7 @@
     </w:p>
     <w:p>
       <w:pPr>
-        <w:pStyle w:val="NormalWeb"/>
+        <w:pStyle w:val="StandardWeb"/>
         <w:rPr>
           <w:sz w:val="20"/>
           <w:szCs w:val="20"/>
@@ -15267,7 +13768,7 @@
     </w:p>
     <w:p>
       <w:pPr>
-        <w:pStyle w:val="NormalWeb"/>
+        <w:pStyle w:val="StandardWeb"/>
         <w:rPr>
           <w:rFonts w:eastAsiaTheme="minorEastAsia"/>
           <w:sz w:val="20"/>
@@ -15299,7 +13800,7 @@
     </w:p>
     <w:p>
       <w:pPr>
-        <w:pStyle w:val="NormalWeb"/>
+        <w:pStyle w:val="StandardWeb"/>
         <w:rPr>
           <w:rFonts w:eastAsiaTheme="minorEastAsia"/>
           <w:sz w:val="20"/>
@@ -15611,7 +14112,6 @@
           <w:bCs/>
           <w:sz w:val="20"/>
         </w:rPr>
-        <w:lastRenderedPageBreak/>
         <w:t xml:space="preserve">QueryableDataSourceType: </w:t>
       </w:r>
       <w:r>
@@ -15623,7 +14123,7 @@
     </w:p>
     <w:p>
       <w:pPr>
-        <w:pStyle w:val="NormalWeb"/>
+        <w:pStyle w:val="StandardWeb"/>
         <w:rPr>
           <w:sz w:val="20"/>
           <w:szCs w:val="20"/>
@@ -15648,7 +14148,7 @@
     </w:p>
     <w:p>
       <w:pPr>
-        <w:pStyle w:val="NormalWeb"/>
+        <w:pStyle w:val="StandardWeb"/>
         <w:rPr>
           <w:rFonts w:eastAsiaTheme="minorEastAsia"/>
           <w:sz w:val="20"/>
@@ -15674,7 +14174,7 @@
     </w:p>
     <w:p>
       <w:pPr>
-        <w:pStyle w:val="NormalWeb"/>
+        <w:pStyle w:val="StandardWeb"/>
         <w:rPr>
           <w:rFonts w:eastAsiaTheme="minorEastAsia"/>
           <w:sz w:val="20"/>
@@ -15970,7 +14470,7 @@
     </w:tbl>
     <w:p>
       <w:pPr>
-        <w:pStyle w:val="NormalWeb"/>
+        <w:pStyle w:val="StandardWeb"/>
         <w:rPr>
           <w:rFonts w:eastAsiaTheme="minorEastAsia"/>
           <w:sz w:val="20"/>
@@ -16369,7 +14869,7 @@
     </w:p>
     <w:p>
       <w:pPr>
-        <w:pStyle w:val="NormalWeb"/>
+        <w:pStyle w:val="StandardWeb"/>
         <w:rPr>
           <w:sz w:val="20"/>
           <w:szCs w:val="20"/>
@@ -16394,7 +14894,7 @@
     </w:p>
     <w:p>
       <w:pPr>
-        <w:pStyle w:val="NormalWeb"/>
+        <w:pStyle w:val="StandardWeb"/>
         <w:rPr>
           <w:rFonts w:eastAsiaTheme="minorEastAsia"/>
           <w:sz w:val="20"/>
@@ -16420,7 +14920,7 @@
     </w:p>
     <w:p>
       <w:pPr>
-        <w:pStyle w:val="NormalWeb"/>
+        <w:pStyle w:val="StandardWeb"/>
         <w:rPr>
           <w:rFonts w:eastAsiaTheme="minorEastAsia"/>
           <w:sz w:val="20"/>
@@ -16428,7 +14928,6 @@
         </w:rPr>
       </w:pPr>
       <w:r>
-        <w:lastRenderedPageBreak/>
         <w:t xml:space="preserve">Attribute Documentation: </w:t>
       </w:r>
     </w:p>
@@ -16664,7 +15163,7 @@
     </w:p>
     <w:p>
       <w:pPr>
-        <w:pStyle w:val="NormalWeb"/>
+        <w:pStyle w:val="StandardWeb"/>
         <w:rPr>
           <w:sz w:val="20"/>
           <w:szCs w:val="20"/>
@@ -16695,7 +15194,7 @@
     </w:p>
     <w:p>
       <w:pPr>
-        <w:pStyle w:val="NormalWeb"/>
+        <w:pStyle w:val="StandardWeb"/>
         <w:rPr>
           <w:rFonts w:eastAsiaTheme="minorEastAsia"/>
           <w:sz w:val="20"/>
@@ -16727,7 +15226,7 @@
     </w:p>
     <w:p>
       <w:pPr>
-        <w:pStyle w:val="NormalWeb"/>
+        <w:pStyle w:val="StandardWeb"/>
         <w:rPr>
           <w:rFonts w:eastAsiaTheme="minorEastAsia"/>
           <w:sz w:val="20"/>
@@ -17209,7 +15708,6 @@
               <w:rPr>
                 <w:rFonts w:cs="Arial"/>
               </w:rPr>
-              <w:lastRenderedPageBreak/>
               <w:t>explicitMeasures</w:t>
             </w:r>
           </w:p>
@@ -17428,7 +15926,7 @@
     </w:tbl>
     <w:p>
       <w:pPr>
-        <w:pStyle w:val="NormalWeb"/>
+        <w:pStyle w:val="StandardWeb"/>
         <w:rPr>
           <w:rFonts w:eastAsiaTheme="minorEastAsia"/>
           <w:sz w:val="20"/>
@@ -17837,7 +16335,7 @@
     </w:p>
     <w:p>
       <w:pPr>
-        <w:pStyle w:val="NormalWeb"/>
+        <w:pStyle w:val="StandardWeb"/>
         <w:rPr>
           <w:sz w:val="20"/>
           <w:szCs w:val="20"/>
@@ -17915,7 +16413,7 @@
                     </pic:cNvPicPr>
                   </pic:nvPicPr>
                   <pic:blipFill>
-                    <a:blip r:link="rId12">
+                    <a:blip r:link="rId9">
                       <a:extLst>
                         <a:ext uri="{28A0092B-C50C-407E-A947-70E740481C1C}">
                           <a14:useLocalDpi xmlns:a14="http://schemas.microsoft.com/office/drawing/2010/main" val="0"/>
@@ -17963,7 +16461,7 @@
     </w:p>
     <w:p>
       <w:pPr>
-        <w:pStyle w:val="NormalWeb"/>
+        <w:pStyle w:val="StandardWeb"/>
         <w:rPr>
           <w:rFonts w:eastAsiaTheme="minorEastAsia"/>
           <w:sz w:val="20"/>
@@ -17971,7 +16469,6 @@
         </w:rPr>
       </w:pPr>
       <w:r>
-        <w:lastRenderedPageBreak/>
         <w:t xml:space="preserve">Attributes: </w:t>
       </w:r>
     </w:p>
@@ -17990,7 +16487,7 @@
     </w:p>
     <w:p>
       <w:pPr>
-        <w:pStyle w:val="NormalWeb"/>
+        <w:pStyle w:val="StandardWeb"/>
         <w:rPr>
           <w:rFonts w:eastAsiaTheme="minorEastAsia"/>
           <w:sz w:val="20"/>
@@ -18016,7 +16513,7 @@
     </w:p>
     <w:p>
       <w:pPr>
-        <w:pStyle w:val="NormalWeb"/>
+        <w:pStyle w:val="StandardWeb"/>
         <w:rPr>
           <w:rFonts w:eastAsiaTheme="minorEastAsia"/>
           <w:sz w:val="20"/>
@@ -18624,14 +17121,7 @@
               <w:rPr>
                 <w:rFonts w:cs="Arial"/>
               </w:rPr>
-              <w:t xml:space="preserve">The serviceURL attribute indicates the URL of an SDMX SOAP web service from which the details of the object can be retrieved. Note that this can be a registry or and SDMX structural </w:t>
-            </w:r>
-            <w:r>
-              <w:rPr>
-                <w:rFonts w:cs="Arial"/>
-              </w:rPr>
-              <w:lastRenderedPageBreak/>
-              <w:t xml:space="preserve">metadata repository, as they both implement that same web service interface. </w:t>
+              <w:t xml:space="preserve">The serviceURL attribute indicates the URL of an SDMX SOAP web service from which the details of the object can be retrieved. Note that this can be a registry or and SDMX structural metadata repository, as they both implement that same web service interface. </w:t>
             </w:r>
           </w:p>
         </w:tc>
@@ -18661,7 +17151,6 @@
               <w:rPr>
                 <w:rFonts w:cs="Arial"/>
               </w:rPr>
-              <w:lastRenderedPageBreak/>
               <w:t>structureURL</w:t>
             </w:r>
           </w:p>
@@ -18720,7 +17209,7 @@
     </w:tbl>
     <w:p>
       <w:pPr>
-        <w:pStyle w:val="NormalWeb"/>
+        <w:pStyle w:val="StandardWeb"/>
         <w:rPr>
           <w:rFonts w:eastAsiaTheme="minorEastAsia"/>
           <w:sz w:val="20"/>
@@ -19119,7 +17608,7 @@
     </w:p>
     <w:p>
       <w:pPr>
-        <w:pStyle w:val="NormalWeb"/>
+        <w:pStyle w:val="StandardWeb"/>
         <w:rPr>
           <w:sz w:val="20"/>
           <w:szCs w:val="20"/>
@@ -19197,7 +17686,7 @@
                     </pic:cNvPicPr>
                   </pic:nvPicPr>
                   <pic:blipFill>
-                    <a:blip r:link="rId12">
+                    <a:blip r:link="rId9">
                       <a:extLst>
                         <a:ext uri="{28A0092B-C50C-407E-A947-70E740481C1C}">
                           <a14:useLocalDpi xmlns:a14="http://schemas.microsoft.com/office/drawing/2010/main" val="0"/>
@@ -19296,7 +17785,7 @@
                     </pic:cNvPicPr>
                   </pic:nvPicPr>
                   <pic:blipFill>
-                    <a:blip r:link="rId12">
+                    <a:blip r:link="rId9">
                       <a:extLst>
                         <a:ext uri="{28A0092B-C50C-407E-A947-70E740481C1C}">
                           <a14:useLocalDpi xmlns:a14="http://schemas.microsoft.com/office/drawing/2010/main" val="0"/>
@@ -19342,7 +17831,7 @@
     </w:p>
     <w:p>
       <w:pPr>
-        <w:pStyle w:val="NormalWeb"/>
+        <w:pStyle w:val="StandardWeb"/>
         <w:rPr>
           <w:rFonts w:eastAsiaTheme="minorEastAsia"/>
           <w:sz w:val="20"/>
@@ -19368,7 +17857,7 @@
     </w:p>
     <w:p>
       <w:pPr>
-        <w:pStyle w:val="NormalWeb"/>
+        <w:pStyle w:val="StandardWeb"/>
         <w:rPr>
           <w:rFonts w:eastAsiaTheme="minorEastAsia"/>
           <w:sz w:val="20"/>
@@ -19389,13 +17878,12 @@
         <w:rPr>
           <w:rStyle w:val="code1"/>
         </w:rPr>
-        <w:lastRenderedPageBreak/>
         <w:t>(ProvisionAgreement | StructureUsage | Structure)</w:t>
       </w:r>
     </w:p>
     <w:p>
       <w:pPr>
-        <w:pStyle w:val="NormalWeb"/>
+        <w:pStyle w:val="StandardWeb"/>
         <w:rPr>
           <w:rFonts w:eastAsiaTheme="minorEastAsia"/>
           <w:sz w:val="20"/>
@@ -20083,14 +18571,7 @@
               <w:rPr>
                 <w:rFonts w:cs="Arial"/>
               </w:rPr>
-              <w:t xml:space="preserve">The structureURL attribute indicates the URL of a SDMX-ML structure message (in the same version as the source document) in which the externally </w:t>
-            </w:r>
-            <w:r>
-              <w:rPr>
-                <w:rFonts w:cs="Arial"/>
-              </w:rPr>
-              <w:lastRenderedPageBreak/>
-              <w:t xml:space="preserve">referenced object is contained. Note that this may be a URL of an SDMX RESTful web service which will return the referenced object. </w:t>
+              <w:t xml:space="preserve">The structureURL attribute indicates the URL of a SDMX-ML structure message (in the same version as the source document) in which the externally referenced object is contained. Note that this may be a URL of an SDMX RESTful web service which will return the referenced object. </w:t>
             </w:r>
           </w:p>
         </w:tc>
@@ -20098,7 +18579,7 @@
     </w:tbl>
     <w:p>
       <w:pPr>
-        <w:pStyle w:val="NormalWeb"/>
+        <w:pStyle w:val="StandardWeb"/>
         <w:rPr>
           <w:rFonts w:eastAsiaTheme="minorEastAsia"/>
           <w:sz w:val="20"/>
@@ -20106,7 +18587,6 @@
         </w:rPr>
       </w:pPr>
       <w:r>
-        <w:lastRenderedPageBreak/>
         <w:t xml:space="preserve">Element Documentation: </w:t>
       </w:r>
     </w:p>
@@ -20508,7 +18988,7 @@
     </w:p>
     <w:p>
       <w:pPr>
-        <w:pStyle w:val="NormalWeb"/>
+        <w:pStyle w:val="StandardWeb"/>
         <w:rPr>
           <w:sz w:val="20"/>
           <w:szCs w:val="20"/>
@@ -20586,7 +19066,7 @@
                     </pic:cNvPicPr>
                   </pic:nvPicPr>
                   <pic:blipFill>
-                    <a:blip r:link="rId12">
+                    <a:blip r:link="rId9">
                       <a:extLst>
                         <a:ext uri="{28A0092B-C50C-407E-A947-70E740481C1C}">
                           <a14:useLocalDpi xmlns:a14="http://schemas.microsoft.com/office/drawing/2010/main" val="0"/>
@@ -20634,7 +19114,7 @@
     </w:p>
     <w:p>
       <w:pPr>
-        <w:pStyle w:val="NormalWeb"/>
+        <w:pStyle w:val="StandardWeb"/>
         <w:rPr>
           <w:rFonts w:eastAsiaTheme="minorEastAsia"/>
           <w:sz w:val="20"/>
@@ -20660,7 +19140,7 @@
     </w:p>
     <w:p>
       <w:pPr>
-        <w:pStyle w:val="NormalWeb"/>
+        <w:pStyle w:val="StandardWeb"/>
         <w:rPr>
           <w:rFonts w:eastAsiaTheme="minorEastAsia"/>
           <w:sz w:val="20"/>
@@ -20686,7 +19166,7 @@
     </w:p>
     <w:p>
       <w:pPr>
-        <w:pStyle w:val="NormalWeb"/>
+        <w:pStyle w:val="StandardWeb"/>
         <w:rPr>
           <w:rFonts w:eastAsiaTheme="minorEastAsia"/>
           <w:sz w:val="20"/>
@@ -20924,7 +19404,6 @@
               <w:rPr>
                 <w:rFonts w:cs="Arial"/>
               </w:rPr>
-              <w:lastRenderedPageBreak/>
               <w:t>schemaURL</w:t>
             </w:r>
           </w:p>
@@ -21223,7 +19702,7 @@
     </w:tbl>
     <w:p>
       <w:pPr>
-        <w:pStyle w:val="NormalWeb"/>
+        <w:pStyle w:val="StandardWeb"/>
         <w:rPr>
           <w:rFonts w:eastAsiaTheme="minorEastAsia"/>
           <w:sz w:val="20"/>
@@ -21622,7 +20101,7 @@
     </w:p>
     <w:p>
       <w:pPr>
-        <w:pStyle w:val="NormalWeb"/>
+        <w:pStyle w:val="StandardWeb"/>
         <w:rPr>
           <w:sz w:val="20"/>
           <w:szCs w:val="20"/>
@@ -21700,7 +20179,7 @@
                     </pic:cNvPicPr>
                   </pic:nvPicPr>
                   <pic:blipFill>
-                    <a:blip r:link="rId12">
+                    <a:blip r:link="rId9">
                       <a:extLst>
                         <a:ext uri="{28A0092B-C50C-407E-A947-70E740481C1C}">
                           <a14:useLocalDpi xmlns:a14="http://schemas.microsoft.com/office/drawing/2010/main" val="0"/>
@@ -21799,7 +20278,7 @@
                     </pic:cNvPicPr>
                   </pic:nvPicPr>
                   <pic:blipFill>
-                    <a:blip r:link="rId12">
+                    <a:blip r:link="rId9">
                       <a:extLst>
                         <a:ext uri="{28A0092B-C50C-407E-A947-70E740481C1C}">
                           <a14:useLocalDpi xmlns:a14="http://schemas.microsoft.com/office/drawing/2010/main" val="0"/>
@@ -21845,7 +20324,7 @@
     </w:p>
     <w:p>
       <w:pPr>
-        <w:pStyle w:val="NormalWeb"/>
+        <w:pStyle w:val="StandardWeb"/>
         <w:rPr>
           <w:rFonts w:eastAsiaTheme="minorEastAsia"/>
           <w:sz w:val="20"/>
@@ -21868,13 +20347,12 @@
           <w:rStyle w:val="code1"/>
           <w:lang w:val="fr-FR"/>
         </w:rPr>
-        <w:lastRenderedPageBreak/>
         <w:t>structureID, schemaURL?, serviceURL?, structureURL?</w:t>
       </w:r>
     </w:p>
     <w:p>
       <w:pPr>
-        <w:pStyle w:val="NormalWeb"/>
+        <w:pStyle w:val="StandardWeb"/>
         <w:rPr>
           <w:rFonts w:eastAsiaTheme="minorEastAsia"/>
           <w:sz w:val="20"/>
@@ -21906,7 +20384,7 @@
     </w:p>
     <w:p>
       <w:pPr>
-        <w:pStyle w:val="NormalWeb"/>
+        <w:pStyle w:val="StandardWeb"/>
         <w:rPr>
           <w:rFonts w:eastAsiaTheme="minorEastAsia"/>
           <w:sz w:val="20"/>
@@ -22366,7 +20844,7 @@
     </w:tbl>
     <w:p>
       <w:pPr>
-        <w:pStyle w:val="NormalWeb"/>
+        <w:pStyle w:val="StandardWeb"/>
         <w:rPr>
           <w:rFonts w:eastAsiaTheme="minorEastAsia"/>
           <w:sz w:val="20"/>
@@ -22747,7 +21225,7 @@
     </w:p>
     <w:p>
       <w:pPr>
-        <w:pStyle w:val="Heading3"/>
+        <w:pStyle w:val="berschrift3"/>
         <w:rPr>
           <w:color w:val="000000"/>
           <w:sz w:val="24"/>
@@ -22762,7 +21240,6 @@
           <w:sz w:val="24"/>
           <w:szCs w:val="24"/>
         </w:rPr>
-        <w:lastRenderedPageBreak/>
         <w:t>Simple Types</w:t>
       </w:r>
       <w:bookmarkEnd w:id="14"/>
@@ -22976,7 +21453,7 @@
     </w:p>
     <w:p>
       <w:pPr>
-        <w:pStyle w:val="NormalWeb"/>
+        <w:pStyle w:val="StandardWeb"/>
         <w:rPr>
           <w:sz w:val="20"/>
           <w:szCs w:val="20"/>
@@ -23030,7 +21507,7 @@
     </w:p>
     <w:p>
       <w:pPr>
-        <w:pStyle w:val="NormalWeb"/>
+        <w:pStyle w:val="StandardWeb"/>
         <w:rPr>
           <w:sz w:val="20"/>
           <w:szCs w:val="20"/>
@@ -23084,7 +21561,7 @@
     </w:p>
     <w:p>
       <w:pPr>
-        <w:pStyle w:val="NormalWeb"/>
+        <w:pStyle w:val="StandardWeb"/>
         <w:rPr>
           <w:sz w:val="20"/>
           <w:szCs w:val="20"/>
@@ -23138,14 +21615,13 @@
     </w:p>
     <w:p>
       <w:pPr>
-        <w:pStyle w:val="NormalWeb"/>
+        <w:pStyle w:val="StandardWeb"/>
         <w:rPr>
           <w:sz w:val="20"/>
           <w:szCs w:val="20"/>
         </w:rPr>
       </w:pPr>
       <w:r>
-        <w:lastRenderedPageBreak/>
         <w:t xml:space="preserve">Union of: </w:t>
       </w:r>
     </w:p>
@@ -23193,7 +21669,7 @@
     </w:p>
     <w:p>
       <w:pPr>
-        <w:pStyle w:val="NormalWeb"/>
+        <w:pStyle w:val="StandardWeb"/>
         <w:rPr>
           <w:sz w:val="20"/>
           <w:szCs w:val="20"/>
@@ -23438,7 +21914,6 @@
         <w:rPr>
           <w:rFonts w:cs="Arial"/>
         </w:rPr>
-        <w:lastRenderedPageBreak/>
         <w:t xml:space="preserve">Derived by restriction of </w:t>
       </w:r>
       <w:r>
@@ -23805,7 +22280,6 @@
         <w:rPr>
           <w:rFonts w:cs="Arial"/>
         </w:rPr>
-        <w:lastRenderedPageBreak/>
         <w:t xml:space="preserve">Derived by restriction of </w:t>
       </w:r>
       <w:r>
@@ -24111,7 +22585,6 @@
         <w:rPr>
           <w:rFonts w:cs="Arial"/>
         </w:rPr>
-        <w:lastRenderedPageBreak/>
         <w:t xml:space="preserve">Derived by restriction of </w:t>
       </w:r>
       <w:r>
@@ -24287,7 +22760,7 @@
     </w:p>
     <w:p>
       <w:pPr>
-        <w:pStyle w:val="NormalWeb"/>
+        <w:pStyle w:val="StandardWeb"/>
         <w:rPr>
           <w:sz w:val="20"/>
           <w:szCs w:val="20"/>
@@ -24440,7 +22913,7 @@
     </w:p>
     <w:p>
       <w:pPr>
-        <w:pStyle w:val="NormalWeb"/>
+        <w:pStyle w:val="StandardWeb"/>
         <w:rPr>
           <w:rFonts w:eastAsiaTheme="minorEastAsia"/>
           <w:sz w:val="20"/>
@@ -24646,7 +23119,7 @@
     </w:p>
     <w:p>
       <w:pPr>
-        <w:pStyle w:val="NormalWeb"/>
+        <w:pStyle w:val="StandardWeb"/>
         <w:rPr>
           <w:rFonts w:eastAsiaTheme="minorEastAsia"/>
           <w:sz w:val="20"/>
@@ -24654,7 +23127,6 @@
         </w:rPr>
       </w:pPr>
       <w:r>
-        <w:lastRenderedPageBreak/>
         <w:t xml:space="preserve">Enumerations: </w:t>
       </w:r>
     </w:p>
@@ -25018,7 +23490,7 @@
     </w:p>
     <w:p>
       <w:pPr>
-        <w:pStyle w:val="NormalWeb"/>
+        <w:pStyle w:val="StandardWeb"/>
         <w:rPr>
           <w:rFonts w:eastAsiaTheme="minorEastAsia"/>
           <w:sz w:val="20"/>
@@ -25193,7 +23665,7 @@
     </w:p>
     <w:p>
       <w:pPr>
-        <w:pStyle w:val="NormalWeb"/>
+        <w:pStyle w:val="StandardWeb"/>
         <w:rPr>
           <w:sz w:val="20"/>
           <w:szCs w:val="20"/>
@@ -25272,7 +23744,7 @@
     </w:p>
     <w:p>
       <w:pPr>
-        <w:pStyle w:val="NormalWeb"/>
+        <w:pStyle w:val="StandardWeb"/>
         <w:rPr>
           <w:rFonts w:eastAsiaTheme="minorEastAsia"/>
           <w:sz w:val="20"/>
@@ -25336,7 +23808,6 @@
                 <w:b/>
                 <w:bCs/>
               </w:rPr>
-              <w:lastRenderedPageBreak/>
               <w:t>Value</w:t>
             </w:r>
           </w:p>
@@ -25448,7 +23919,7 @@
     </w:p>
     <w:p>
       <w:pPr>
-        <w:pStyle w:val="NormalWeb"/>
+        <w:pStyle w:val="StandardWeb"/>
         <w:rPr>
           <w:sz w:val="20"/>
           <w:szCs w:val="20"/>
@@ -25527,7 +23998,7 @@
     </w:p>
     <w:p>
       <w:pPr>
-        <w:pStyle w:val="NormalWeb"/>
+        <w:pStyle w:val="StandardWeb"/>
         <w:rPr>
           <w:rFonts w:eastAsiaTheme="minorEastAsia"/>
           <w:sz w:val="20"/>
@@ -25788,7 +24259,7 @@
     </w:p>
     <w:p>
       <w:pPr>
-        <w:pStyle w:val="NormalWeb"/>
+        <w:pStyle w:val="StandardWeb"/>
         <w:rPr>
           <w:rFonts w:eastAsiaTheme="minorEastAsia"/>
           <w:sz w:val="20"/>
@@ -26078,7 +24549,6 @@
               <w:rPr>
                 <w:rFonts w:cs="Arial"/>
               </w:rPr>
-              <w:lastRenderedPageBreak/>
               <w:t>Numeric</w:t>
             </w:r>
           </w:p>
@@ -26904,7 +25374,6 @@
               <w:rPr>
                 <w:rFonts w:cs="Arial"/>
               </w:rPr>
-              <w:lastRenderedPageBreak/>
               <w:t>StandardTimePeriod</w:t>
             </w:r>
           </w:p>
@@ -27620,7 +26089,6 @@
               <w:rPr>
                 <w:rFonts w:cs="Arial"/>
               </w:rPr>
-              <w:lastRenderedPageBreak/>
               <w:t>ReportingDay</w:t>
             </w:r>
           </w:p>
@@ -28362,7 +26830,7 @@
     </w:p>
     <w:p>
       <w:pPr>
-        <w:pStyle w:val="NormalWeb"/>
+        <w:pStyle w:val="StandardWeb"/>
         <w:rPr>
           <w:rFonts w:eastAsiaTheme="minorEastAsia"/>
           <w:sz w:val="20"/>
@@ -28370,7 +26838,6 @@
         </w:rPr>
       </w:pPr>
       <w:r>
-        <w:lastRenderedPageBreak/>
         <w:t xml:space="preserve">Enumerations: </w:t>
       </w:r>
     </w:p>
@@ -29313,7 +27780,6 @@
               <w:rPr>
                 <w:rFonts w:cs="Arial"/>
               </w:rPr>
-              <w:lastRenderedPageBreak/>
               <w:t>ExclusiveValueRange</w:t>
             </w:r>
           </w:p>
@@ -30029,7 +28495,6 @@
               <w:rPr>
                 <w:rFonts w:cs="Arial"/>
               </w:rPr>
-              <w:lastRenderedPageBreak/>
               <w:t>ReportingQuarter</w:t>
             </w:r>
           </w:p>
@@ -30754,7 +29219,6 @@
         <w:rPr>
           <w:rFonts w:cs="Arial"/>
         </w:rPr>
-        <w:lastRenderedPageBreak/>
         <w:t xml:space="preserve">Derived by restriction of </w:t>
       </w:r>
       <w:r>
@@ -30772,7 +29236,7 @@
     </w:p>
     <w:p>
       <w:pPr>
-        <w:pStyle w:val="NormalWeb"/>
+        <w:pStyle w:val="StandardWeb"/>
         <w:rPr>
           <w:rFonts w:eastAsiaTheme="minorEastAsia"/>
           <w:sz w:val="20"/>
@@ -31667,7 +30131,6 @@
               <w:rPr>
                 <w:rFonts w:cs="Arial"/>
               </w:rPr>
-              <w:lastRenderedPageBreak/>
               <w:t>InclusiveValueRange</w:t>
             </w:r>
           </w:p>
@@ -32383,7 +30846,6 @@
               <w:rPr>
                 <w:rFonts w:cs="Arial"/>
               </w:rPr>
-              <w:lastRenderedPageBreak/>
               <w:t>ReportingTrimester</w:t>
             </w:r>
           </w:p>
@@ -33108,7 +31570,6 @@
         <w:rPr>
           <w:rFonts w:cs="Arial"/>
         </w:rPr>
-        <w:lastRenderedPageBreak/>
         <w:t xml:space="preserve">Derived by restriction of </w:t>
       </w:r>
       <w:r>
@@ -33126,7 +31587,7 @@
     </w:p>
     <w:p>
       <w:pPr>
-        <w:pStyle w:val="NormalWeb"/>
+        <w:pStyle w:val="StandardWeb"/>
         <w:rPr>
           <w:rFonts w:eastAsiaTheme="minorEastAsia"/>
           <w:sz w:val="20"/>
@@ -33856,7 +32317,6 @@
               <w:rPr>
                 <w:rFonts w:cs="Arial"/>
               </w:rPr>
-              <w:lastRenderedPageBreak/>
               <w:t>ReportingQuarter</w:t>
             </w:r>
           </w:p>
@@ -34282,14 +32742,7 @@
         <w:rPr>
           <w:rStyle w:val="code1"/>
         </w:rPr>
-        <w:t>.+\.base\.Agency=.+.+\.base\.AgencyScheme=.+.+\.base\.Any=.+.+\.base\.DataConsumer=.+.+\.base\.DataConsumerScheme=.+.+\.base\.DataProvider=.+.+\.base\.DataProviderScheme=.+.+\.base\.MetadataProvider=.+.+\.base\.MetadataProviderScheme=.+.+\.base\.OrganisationUnit=.+.+\.base\.OrganisationUnitScheme=.+.+\.categoryscheme\.Categorisation=.+.+\.categoryscheme\.Category=.+.+\.categoryscheme\.CategoryScheme=.+.+\.categoryscheme\.ReportingCategory=.+.+\.categoryscheme\.ReportingTaxonomy=.+.+\.codelist\.Code=.+.+\.codelist\.Codelist=.+.+\.codelist\.HierarchicalCode=.+.+\.codelist\.Hierarchy=.+.+\.codelist\.HierarchyAssociation=.+.+\.codelist\.Level=.+.+\.codelist\.ValueList=.+.+\.conceptscheme\.Concept=.+.+\.conceptscheme\.ConceptScheme=.+.+\.datastructure\.AttributeDescriptor=.+.+\.datastructure\.DataAttribute=.+.+\.datastructure\.Dataflow=.+.+\.datastructure\.DataStructure=.+.+\.datastructure\.Dimension=.+.+\.datastructure\.DimensionDescriptor=.+.+\.datastructure\.GroupDimensionDescriptor=.+.+\.datastructure\.Measure=.+.+\.datastructure\.MeasureDescriptor=.+.+\.datastructure\.TimeDimension=.+.+\.metadatastructure\.MetadataAttribute=.+.+\.metadata</w:t>
-      </w:r>
-      <w:r>
-        <w:rPr>
-          <w:rStyle w:val="code1"/>
-        </w:rPr>
-        <w:lastRenderedPageBreak/>
-        <w:t>structure\.Metadataflow=.+.+\.metadatastructure\.MetadataSet=.+.+\.metadatastructure\.MetadataStructure=.+.+\.process\.Process=.+.+\.process\.ProcessStep=.+.+\.process\.Transition=.+.+\.registry\.DataConstraint=.+.+\.registry\.MetadataConstraint=.+.+\.registry\.MetadataProvisionAgreement=.+.+\.registry\.ProvisionAgreement=.+.+\.structuremapping\.CategorySchemeMap=.+.+\.structuremapping\.ConceptSchemeMap=.+.+\.structuremapping\.DatePatternMap=.+.+\.structuremapping\.EpochMap=.+.+\.structuremapping\.FrequencyFormatMapping=.+.+\.structuremapping\.OrganisationSchemeMap=.+.+\.structuremapping\.ReportingTaxonomyMap=.+.+\.structuremapping\.RepresentationMap=.+.+\.structuremapping\.StructureMap=.+.+\.transformation\.CustomType=.+.+\.transformation\.CustomTypeScheme=.+.+\.transformation\.NamePersonalisation=.+.+\.transformation\.NamePersonalisationScheme=.+.+\.transformation\.Ruleset=.+.+\.transformation\.RulesetScheme=.+.+\.transformation\.Transformation=.+.+\.transformation\.TransformationScheme=.+.+\.transformation\.UserDefinedOperator=.+.+\.transformation\.UserDefinedOperatorScheme=.+.+\.transformation\.VtlCodelistMapping=.+.+\.transformation\.VtlConceptMapping=.+.+\.transformation\.VtlDataflowMapping=.+.+\.transformation\.VtlMappingScheme=.+</w:t>
+        <w:t>.+\.base\.Agency=.+.+\.base\.AgencyScheme=.+.+\.base\.Any=.+.+\.base\.DataConsumer=.+.+\.base\.DataConsumerScheme=.+.+\.base\.DataProvider=.+.+\.base\.DataProviderScheme=.+.+\.base\.MetadataProvider=.+.+\.base\.MetadataProviderScheme=.+.+\.base\.OrganisationUnit=.+.+\.base\.OrganisationUnitScheme=.+.+\.categoryscheme\.Categorisation=.+.+\.categoryscheme\.Category=.+.+\.categoryscheme\.CategoryScheme=.+.+\.categoryscheme\.ReportingCategory=.+.+\.categoryscheme\.ReportingTaxonomy=.+.+\.codelist\.Code=.+.+\.codelist\.Codelist=.+.+\.codelist\.HierarchicalCode=.+.+\.codelist\.Hierarchy=.+.+\.codelist\.HierarchyAssociation=.+.+\.codelist\.Level=.+.+\.codelist\.ValueList=.+.+\.conceptscheme\.Concept=.+.+\.conceptscheme\.ConceptScheme=.+.+\.datastructure\.AttributeDescriptor=.+.+\.datastructure\.DataAttribute=.+.+\.datastructure\.Dataflow=.+.+\.datastructure\.DataStructure=.+.+\.datastructure\.Dimension=.+.+\.datastructure\.DimensionDescriptor=.+.+\.datastructure\.GroupDimensionDescriptor=.+.+\.datastructure\.Measure=.+.+\.datastructure\.MeasureDescriptor=.+.+\.datastructure\.TimeDimension=.+.+\.metadatastructure\.MetadataAttribute=.+.+\.metadatastructure\.Metadataflow=.+.+\.metadatastructure\.MetadataSet=.+.+\.metadatastructure\.MetadataStructure=.+.+\.process\.Process=.+.+\.process\.ProcessStep=.+.+\.process\.Transition=.+.+\.registry\.DataConstraint=.+.+\.registry\.MetadataConstraint=.+.+\.registry\.MetadataProvisionAgreement=.+.+\.registry\.ProvisionAgreement=.+.+\.structuremapping\.CategorySchemeMap=.+.+\.structuremapping\.ConceptSchemeMap=.+.+\.structuremapping\.DatePatternMap=.+.+\.structuremapping\.EpochMap=.+.+\.structuremapping\.FrequencyFormatMapping=.+.+\.structuremapping\.OrganisationSchemeMap=.+.+\.structuremapping\.ReportingTaxonomyMap=.+.+\.structuremapping\.RepresentationMap=.+.+\.structuremapping\.StructureMap=.+.+\.transformation\.CustomType=.+.+\.transformation\.CustomTypeScheme=.+.+\.transformation\.NamePersonalisation=.+.+\.transformation\.NamePersonalisationScheme=.+.+\.transformation\.Ruleset=.+.+\.transformation\.RulesetScheme=.+.+\.transformation\.Transformation=.+.+\.transformation\.TransformationScheme=.+.+\.transformation\.UserDefinedOperator=.+.+\.transformation\.UserDefinedOperatorScheme=.+.+\.transformation\.VtlCodelistMapping=.+.+\.transformation\.VtlConceptMapping=.+.+\.transformation\.VtlDataflowMapping=.+.+\.transformation\.VtlMappingScheme=.+</w:t>
       </w:r>
     </w:p>
     <w:p>
@@ -34569,7 +33022,6 @@
         <w:rPr>
           <w:rFonts w:cs="Arial"/>
         </w:rPr>
-        <w:lastRenderedPageBreak/>
         <w:t xml:space="preserve">Derived by restriction of </w:t>
       </w:r>
       <w:r>
@@ -34856,7 +33308,6 @@
           <w:bCs/>
           <w:sz w:val="20"/>
         </w:rPr>
-        <w:lastRenderedPageBreak/>
         <w:t xml:space="preserve">WildcardUrnType: </w:t>
       </w:r>
       <w:r>
@@ -35406,7 +33857,6 @@
           <w:bCs/>
           <w:sz w:val="20"/>
         </w:rPr>
-        <w:lastRenderedPageBreak/>
         <w:t xml:space="preserve">DataProviderUrnType: </w:t>
       </w:r>
       <w:r>
@@ -35975,7 +34425,6 @@
         <w:rPr>
           <w:rFonts w:cs="Arial"/>
         </w:rPr>
-        <w:lastRenderedPageBreak/>
         <w:t xml:space="preserve">Derived by restriction of </w:t>
       </w:r>
       <w:r>
@@ -36628,7 +35077,6 @@
           <w:bCs/>
           <w:sz w:val="20"/>
         </w:rPr>
-        <w:lastRenderedPageBreak/>
         <w:t xml:space="preserve">AttributeDescriptorUrnType: </w:t>
       </w:r>
       <w:r>
@@ -37258,7 +35706,6 @@
         <w:rPr>
           <w:rFonts w:cs="Arial"/>
         </w:rPr>
-        <w:lastRenderedPageBreak/>
         <w:t xml:space="preserve">Derived by restriction of </w:t>
       </w:r>
       <w:r>
@@ -37911,7 +36358,6 @@
           <w:bCs/>
           <w:sz w:val="20"/>
         </w:rPr>
-        <w:lastRenderedPageBreak/>
         <w:t xml:space="preserve">CategorySchemeMapUrnType: </w:t>
       </w:r>
       <w:r>
@@ -38541,7 +36987,6 @@
         <w:rPr>
           <w:rFonts w:cs="Arial"/>
         </w:rPr>
-        <w:lastRenderedPageBreak/>
         <w:t xml:space="preserve">Derived by restriction of </w:t>
       </w:r>
       <w:r>
@@ -39152,7 +37597,6 @@
         <w:rPr>
           <w:rFonts w:cs="Arial"/>
         </w:rPr>
-        <w:lastRenderedPageBreak/>
         <w:t xml:space="preserve">Derived by restriction of </w:t>
       </w:r>
       <w:r>
@@ -39622,7 +38066,6 @@
           <w:bCs/>
           <w:sz w:val="20"/>
         </w:rPr>
-        <w:lastRenderedPageBreak/>
         <w:t xml:space="preserve">AgencyReferenceType: </w:t>
       </w:r>
       <w:r>
@@ -40191,7 +38634,6 @@
         <w:rPr>
           <w:rFonts w:cs="Arial"/>
         </w:rPr>
-        <w:lastRenderedPageBreak/>
         <w:t xml:space="preserve">Derived by restriction of </w:t>
       </w:r>
       <w:r>
@@ -40844,7 +39286,6 @@
           <w:bCs/>
           <w:sz w:val="20"/>
         </w:rPr>
-        <w:lastRenderedPageBreak/>
         <w:t xml:space="preserve">LevelReferenceType: </w:t>
       </w:r>
       <w:r>
@@ -41474,7 +39915,6 @@
         <w:rPr>
           <w:rFonts w:cs="Arial"/>
         </w:rPr>
-        <w:lastRenderedPageBreak/>
         <w:t xml:space="preserve">Derived by restriction of </w:t>
       </w:r>
       <w:r>
@@ -42127,7 +40567,6 @@
           <w:bCs/>
           <w:sz w:val="20"/>
         </w:rPr>
-        <w:lastRenderedPageBreak/>
         <w:t xml:space="preserve">DataConstraintReferenceType: </w:t>
       </w:r>
       <w:r>
@@ -42757,7 +41196,6 @@
         <w:rPr>
           <w:rFonts w:cs="Arial"/>
         </w:rPr>
-        <w:lastRenderedPageBreak/>
         <w:t xml:space="preserve">Derived by restriction of </w:t>
       </w:r>
       <w:r>
@@ -43368,7 +41806,6 @@
         <w:rPr>
           <w:rFonts w:cs="Arial"/>
         </w:rPr>
-        <w:lastRenderedPageBreak/>
         <w:t xml:space="preserve">Derived by restriction of </w:t>
       </w:r>
       <w:r>
@@ -43666,7 +42103,7 @@
     </w:p>
     <w:p>
       <w:pPr>
-        <w:pStyle w:val="NormalWeb"/>
+        <w:pStyle w:val="StandardWeb"/>
         <w:rPr>
           <w:sz w:val="20"/>
           <w:szCs w:val="20"/>
@@ -43781,7 +42218,7 @@
     </w:p>
     <w:p>
       <w:pPr>
-        <w:pStyle w:val="NormalWeb"/>
+        <w:pStyle w:val="StandardWeb"/>
         <w:rPr>
           <w:sz w:val="20"/>
           <w:szCs w:val="20"/>
@@ -43801,7 +42238,6 @@
         <w:rPr>
           <w:rStyle w:val="code1"/>
         </w:rPr>
-        <w:lastRenderedPageBreak/>
         <w:t>LegacyVersionNumberType, SemanticVersionNumberType, SemanticVersionReferenceType, WildcardType</w:t>
       </w:r>
       <w:r>
@@ -43861,7 +42297,7 @@
     </w:p>
     <w:p>
       <w:pPr>
-        <w:pStyle w:val="NormalWeb"/>
+        <w:pStyle w:val="StandardWeb"/>
         <w:rPr>
           <w:rFonts w:eastAsiaTheme="minorEastAsia"/>
           <w:sz w:val="20"/>
@@ -44355,7 +42791,6 @@
         <w:rPr>
           <w:rFonts w:cs="Arial"/>
         </w:rPr>
-        <w:lastRenderedPageBreak/>
         <w:t xml:space="preserve">Derived by restriction of </w:t>
       </w:r>
       <w:r>
@@ -44409,7 +42844,7 @@
     </w:p>
     <w:p>
       <w:pPr>
-        <w:pStyle w:val="NormalWeb"/>
+        <w:pStyle w:val="StandardWeb"/>
         <w:rPr>
           <w:sz w:val="20"/>
           <w:szCs w:val="20"/>
@@ -44561,10 +42996,9 @@
       </w:r>
     </w:p>
     <w:sectPr>
-      <w:footerReference w:type="default" r:id="rId13"/>
+      <w:footerReference w:type="default" r:id="rId10"/>
       <w:pgSz w:w="11906" w:h="16838"/>
       <w:pgMar w:top="1440" w:right="1440" w:bottom="1440" w:left="1440" w:header="720" w:footer="720" w:gutter="0"/>
-      <w:lnNumType w:countBy="1" w:restart="continuous"/>
       <w:pgNumType w:start="1"/>
       <w:cols w:space="720"/>
       <w:docGrid w:linePitch="360"/>
@@ -44574,7 +43008,7 @@
 </file>
 
 <file path=word/endnotes.xml><?xml version="1.0" encoding="utf-8"?>
-<w:endnotes xmlns:wpc="http://schemas.microsoft.com/office/word/2010/wordprocessingCanvas" xmlns:cx="http://schemas.microsoft.com/office/drawing/2014/chartex" xmlns:cx1="http://schemas.microsoft.com/office/drawing/2015/9/8/chartex" xmlns:cx2="http://schemas.microsoft.com/office/drawing/2015/10/21/chartex" xmlns:cx3="http://schemas.microsoft.com/office/drawing/2016/5/9/chartex" xmlns:cx4="http://schemas.microsoft.com/office/drawing/2016/5/10/chartex" xmlns:cx5="http://schemas.microsoft.com/office/drawing/2016/5/11/chartex" xmlns:cx6="http://schemas.microsoft.com/office/drawing/2016/5/12/chartex" xmlns:cx7="http://schemas.microsoft.com/office/drawing/2016/5/13/chartex" xmlns:cx8="http://schemas.microsoft.com/office/drawing/2016/5/14/chartex" xmlns:mc="http://schemas.openxmlformats.org/markup-compatibility/2006" xmlns:aink="http://schemas.microsoft.com/office/drawing/2016/ink" xmlns:am3d="http://schemas.microsoft.com/office/drawing/2017/model3d" xmlns:o="urn:schemas-microsoft-com:office:office" xmlns:r="http://schemas.openxmlformats.org/officeDocument/2006/relationships" xmlns:m="http://schemas.openxmlformats.org/officeDocument/2006/math" xmlns:v="urn:schemas-microsoft-com:vml" xmlns:wp14="http://schemas.microsoft.com/office/word/2010/wordprocessingDrawing" xmlns:wp="http://schemas.openxmlformats.org/drawingml/2006/wordprocessingDrawing" xmlns:w10="urn:schemas-microsoft-com:office:word" xmlns:w="http://schemas.openxmlformats.org/wordprocessingml/2006/main" xmlns:w14="http://schemas.microsoft.com/office/word/2010/wordml" xmlns:w15="http://schemas.microsoft.com/office/word/2012/wordml" xmlns:w16cex="http://schemas.microsoft.com/office/word/2018/wordml/cex" xmlns:w16cid="http://schemas.microsoft.com/office/word/2016/wordml/cid" xmlns:w16="http://schemas.microsoft.com/office/word/2018/wordml" xmlns:w16sdtdh="http://schemas.microsoft.com/office/word/2020/wordml/sdtdatahash" xmlns:w16se="http://schemas.microsoft.com/office/word/2015/wordml/symex" xmlns:wpg="http://schemas.microsoft.com/office/word/2010/wordprocessingGroup" xmlns:wpi="http://schemas.microsoft.com/office/word/2010/wordprocessingInk" xmlns:wne="http://schemas.microsoft.com/office/word/2006/wordml" xmlns:wps="http://schemas.microsoft.com/office/word/2010/wordprocessingShape" mc:Ignorable="w14 w15 w16se w16cid w16 w16cex w16sdtdh wp14">
+<w:endnotes xmlns:wpc="http://schemas.microsoft.com/office/word/2010/wordprocessingCanvas" xmlns:cx="http://schemas.microsoft.com/office/drawing/2014/chartex" xmlns:cx1="http://schemas.microsoft.com/office/drawing/2015/9/8/chartex" xmlns:cx2="http://schemas.microsoft.com/office/drawing/2015/10/21/chartex" xmlns:cx3="http://schemas.microsoft.com/office/drawing/2016/5/9/chartex" xmlns:cx4="http://schemas.microsoft.com/office/drawing/2016/5/10/chartex" xmlns:cx5="http://schemas.microsoft.com/office/drawing/2016/5/11/chartex" xmlns:cx6="http://schemas.microsoft.com/office/drawing/2016/5/12/chartex" xmlns:cx7="http://schemas.microsoft.com/office/drawing/2016/5/13/chartex" xmlns:cx8="http://schemas.microsoft.com/office/drawing/2016/5/14/chartex" xmlns:mc="http://schemas.openxmlformats.org/markup-compatibility/2006" xmlns:aink="http://schemas.microsoft.com/office/drawing/2016/ink" xmlns:am3d="http://schemas.microsoft.com/office/drawing/2017/model3d" xmlns:o="urn:schemas-microsoft-com:office:office" xmlns:oel="http://schemas.microsoft.com/office/2019/extlst" xmlns:r="http://schemas.openxmlformats.org/officeDocument/2006/relationships" xmlns:m="http://schemas.openxmlformats.org/officeDocument/2006/math" xmlns:v="urn:schemas-microsoft-com:vml" xmlns:wp14="http://schemas.microsoft.com/office/word/2010/wordprocessingDrawing" xmlns:wp="http://schemas.openxmlformats.org/drawingml/2006/wordprocessingDrawing" xmlns:w10="urn:schemas-microsoft-com:office:word" xmlns:w="http://schemas.openxmlformats.org/wordprocessingml/2006/main" xmlns:w14="http://schemas.microsoft.com/office/word/2010/wordml" xmlns:w15="http://schemas.microsoft.com/office/word/2012/wordml" xmlns:w16cex="http://schemas.microsoft.com/office/word/2018/wordml/cex" xmlns:w16cid="http://schemas.microsoft.com/office/word/2016/wordml/cid" xmlns:w16="http://schemas.microsoft.com/office/word/2018/wordml" xmlns:w16du="http://schemas.microsoft.com/office/word/2023/wordml/word16du" xmlns:w16sdtdh="http://schemas.microsoft.com/office/word/2020/wordml/sdtdatahash" xmlns:w16sdtfl="http://schemas.microsoft.com/office/word/2024/wordml/sdtformatlock" xmlns:w16se="http://schemas.microsoft.com/office/word/2015/wordml/symex" xmlns:wpg="http://schemas.microsoft.com/office/word/2010/wordprocessingGroup" xmlns:wpi="http://schemas.microsoft.com/office/word/2010/wordprocessingInk" xmlns:wne="http://schemas.microsoft.com/office/word/2006/wordml" xmlns:wps="http://schemas.microsoft.com/office/word/2010/wordprocessingShape" mc:Ignorable="w14 w15 w16se w16cid w16 w16cex w16sdtdh w16sdtfl w16du wp14">
   <w:endnote w:type="separator" w:id="-1">
     <w:p>
       <w:pPr>
@@ -44605,10 +43039,10 @@
 </file>
 
 <file path=word/footer1.xml><?xml version="1.0" encoding="utf-8"?>
-<w:ftr xmlns:wpc="http://schemas.microsoft.com/office/word/2010/wordprocessingCanvas" xmlns:cx="http://schemas.microsoft.com/office/drawing/2014/chartex" xmlns:cx1="http://schemas.microsoft.com/office/drawing/2015/9/8/chartex" xmlns:cx2="http://schemas.microsoft.com/office/drawing/2015/10/21/chartex" xmlns:cx3="http://schemas.microsoft.com/office/drawing/2016/5/9/chartex" xmlns:cx4="http://schemas.microsoft.com/office/drawing/2016/5/10/chartex" xmlns:cx5="http://schemas.microsoft.com/office/drawing/2016/5/11/chartex" xmlns:cx6="http://schemas.microsoft.com/office/drawing/2016/5/12/chartex" xmlns:cx7="http://schemas.microsoft.com/office/drawing/2016/5/13/chartex" xmlns:cx8="http://schemas.microsoft.com/office/drawing/2016/5/14/chartex" xmlns:mc="http://schemas.openxmlformats.org/markup-compatibility/2006" xmlns:aink="http://schemas.microsoft.com/office/drawing/2016/ink" xmlns:am3d="http://schemas.microsoft.com/office/drawing/2017/model3d" xmlns:o="urn:schemas-microsoft-com:office:office" xmlns:r="http://schemas.openxmlformats.org/officeDocument/2006/relationships" xmlns:m="http://schemas.openxmlformats.org/officeDocument/2006/math" xmlns:v="urn:schemas-microsoft-com:vml" xmlns:wp14="http://schemas.microsoft.com/office/word/2010/wordprocessingDrawing" xmlns:wp="http://schemas.openxmlformats.org/drawingml/2006/wordprocessingDrawing" xmlns:w10="urn:schemas-microsoft-com:office:word" xmlns:w="http://schemas.openxmlformats.org/wordprocessingml/2006/main" xmlns:w14="http://schemas.microsoft.com/office/word/2010/wordml" xmlns:w15="http://schemas.microsoft.com/office/word/2012/wordml" xmlns:w16cex="http://schemas.microsoft.com/office/word/2018/wordml/cex" xmlns:w16cid="http://schemas.microsoft.com/office/word/2016/wordml/cid" xmlns:w16="http://schemas.microsoft.com/office/word/2018/wordml" xmlns:w16sdtdh="http://schemas.microsoft.com/office/word/2020/wordml/sdtdatahash" xmlns:w16se="http://schemas.microsoft.com/office/word/2015/wordml/symex" xmlns:wpg="http://schemas.microsoft.com/office/word/2010/wordprocessingGroup" xmlns:wpi="http://schemas.microsoft.com/office/word/2010/wordprocessingInk" xmlns:wne="http://schemas.microsoft.com/office/word/2006/wordml" xmlns:wps="http://schemas.microsoft.com/office/word/2010/wordprocessingShape" mc:Ignorable="w14 w15 w16se w16cid w16 w16cex w16sdtdh wp14">
+<w:ftr xmlns:wpc="http://schemas.microsoft.com/office/word/2010/wordprocessingCanvas" xmlns:cx="http://schemas.microsoft.com/office/drawing/2014/chartex" xmlns:cx1="http://schemas.microsoft.com/office/drawing/2015/9/8/chartex" xmlns:cx2="http://schemas.microsoft.com/office/drawing/2015/10/21/chartex" xmlns:cx3="http://schemas.microsoft.com/office/drawing/2016/5/9/chartex" xmlns:cx4="http://schemas.microsoft.com/office/drawing/2016/5/10/chartex" xmlns:cx5="http://schemas.microsoft.com/office/drawing/2016/5/11/chartex" xmlns:cx6="http://schemas.microsoft.com/office/drawing/2016/5/12/chartex" xmlns:cx7="http://schemas.microsoft.com/office/drawing/2016/5/13/chartex" xmlns:cx8="http://schemas.microsoft.com/office/drawing/2016/5/14/chartex" xmlns:mc="http://schemas.openxmlformats.org/markup-compatibility/2006" xmlns:aink="http://schemas.microsoft.com/office/drawing/2016/ink" xmlns:am3d="http://schemas.microsoft.com/office/drawing/2017/model3d" xmlns:o="urn:schemas-microsoft-com:office:office" xmlns:oel="http://schemas.microsoft.com/office/2019/extlst" xmlns:r="http://schemas.openxmlformats.org/officeDocument/2006/relationships" xmlns:m="http://schemas.openxmlformats.org/officeDocument/2006/math" xmlns:v="urn:schemas-microsoft-com:vml" xmlns:wp14="http://schemas.microsoft.com/office/word/2010/wordprocessingDrawing" xmlns:wp="http://schemas.openxmlformats.org/drawingml/2006/wordprocessingDrawing" xmlns:w10="urn:schemas-microsoft-com:office:word" xmlns:w="http://schemas.openxmlformats.org/wordprocessingml/2006/main" xmlns:w14="http://schemas.microsoft.com/office/word/2010/wordml" xmlns:w15="http://schemas.microsoft.com/office/word/2012/wordml" xmlns:w16cex="http://schemas.microsoft.com/office/word/2018/wordml/cex" xmlns:w16cid="http://schemas.microsoft.com/office/word/2016/wordml/cid" xmlns:w16="http://schemas.microsoft.com/office/word/2018/wordml" xmlns:w16du="http://schemas.microsoft.com/office/word/2023/wordml/word16du" xmlns:w16sdtdh="http://schemas.microsoft.com/office/word/2020/wordml/sdtdatahash" xmlns:w16sdtfl="http://schemas.microsoft.com/office/word/2024/wordml/sdtformatlock" xmlns:w16se="http://schemas.microsoft.com/office/word/2015/wordml/symex" xmlns:wpg="http://schemas.microsoft.com/office/word/2010/wordprocessingGroup" xmlns:wpi="http://schemas.microsoft.com/office/word/2010/wordprocessingInk" xmlns:wne="http://schemas.microsoft.com/office/word/2006/wordml" xmlns:wps="http://schemas.microsoft.com/office/word/2010/wordprocessingShape" mc:Ignorable="w14 w15 w16se w16cid w16 w16cex w16sdtdh w16sdtfl w16du wp14">
   <w:p>
     <w:pPr>
-      <w:pStyle w:val="Footer"/>
+      <w:pStyle w:val="Fuzeile"/>
       <w:jc w:val="center"/>
     </w:pPr>
   </w:p>
@@ -44616,31 +43050,10 @@
 </file>
 
 <file path=word/footer2.xml><?xml version="1.0" encoding="utf-8"?>
-<w:ftr xmlns:wpc="http://schemas.microsoft.com/office/word/2010/wordprocessingCanvas" xmlns:cx="http://schemas.microsoft.com/office/drawing/2014/chartex" xmlns:cx1="http://schemas.microsoft.com/office/drawing/2015/9/8/chartex" xmlns:cx2="http://schemas.microsoft.com/office/drawing/2015/10/21/chartex" xmlns:cx3="http://schemas.microsoft.com/office/drawing/2016/5/9/chartex" xmlns:cx4="http://schemas.microsoft.com/office/drawing/2016/5/10/chartex" xmlns:cx5="http://schemas.microsoft.com/office/drawing/2016/5/11/chartex" xmlns:cx6="http://schemas.microsoft.com/office/drawing/2016/5/12/chartex" xmlns:cx7="http://schemas.microsoft.com/office/drawing/2016/5/13/chartex" xmlns:cx8="http://schemas.microsoft.com/office/drawing/2016/5/14/chartex" xmlns:mc="http://schemas.openxmlformats.org/markup-compatibility/2006" xmlns:aink="http://schemas.microsoft.com/office/drawing/2016/ink" xmlns:am3d="http://schemas.microsoft.com/office/drawing/2017/model3d" xmlns:o="urn:schemas-microsoft-com:office:office" xmlns:r="http://schemas.openxmlformats.org/officeDocument/2006/relationships" xmlns:m="http://schemas.openxmlformats.org/officeDocument/2006/math" xmlns:v="urn:schemas-microsoft-com:vml" xmlns:wp14="http://schemas.microsoft.com/office/word/2010/wordprocessingDrawing" xmlns:wp="http://schemas.openxmlformats.org/drawingml/2006/wordprocessingDrawing" xmlns:w10="urn:schemas-microsoft-com:office:word" xmlns:w="http://schemas.openxmlformats.org/wordprocessingml/2006/main" xmlns:w14="http://schemas.microsoft.com/office/word/2010/wordml" xmlns:w15="http://schemas.microsoft.com/office/word/2012/wordml" xmlns:w16cex="http://schemas.microsoft.com/office/word/2018/wordml/cex" xmlns:w16cid="http://schemas.microsoft.com/office/word/2016/wordml/cid" xmlns:w16="http://schemas.microsoft.com/office/word/2018/wordml" xmlns:w16sdtdh="http://schemas.microsoft.com/office/word/2020/wordml/sdtdatahash" xmlns:w16se="http://schemas.microsoft.com/office/word/2015/wordml/symex" xmlns:wpg="http://schemas.microsoft.com/office/word/2010/wordprocessingGroup" xmlns:wpi="http://schemas.microsoft.com/office/word/2010/wordprocessingInk" xmlns:wne="http://schemas.microsoft.com/office/word/2006/wordml" xmlns:wps="http://schemas.microsoft.com/office/word/2010/wordprocessingShape" mc:Ignorable="w14 w15 w16se w16cid w16 w16cex w16sdtdh wp14">
+<w:ftr xmlns:wpc="http://schemas.microsoft.com/office/word/2010/wordprocessingCanvas" xmlns:cx="http://schemas.microsoft.com/office/drawing/2014/chartex" xmlns:cx1="http://schemas.microsoft.com/office/drawing/2015/9/8/chartex" xmlns:cx2="http://schemas.microsoft.com/office/drawing/2015/10/21/chartex" xmlns:cx3="http://schemas.microsoft.com/office/drawing/2016/5/9/chartex" xmlns:cx4="http://schemas.microsoft.com/office/drawing/2016/5/10/chartex" xmlns:cx5="http://schemas.microsoft.com/office/drawing/2016/5/11/chartex" xmlns:cx6="http://schemas.microsoft.com/office/drawing/2016/5/12/chartex" xmlns:cx7="http://schemas.microsoft.com/office/drawing/2016/5/13/chartex" xmlns:cx8="http://schemas.microsoft.com/office/drawing/2016/5/14/chartex" xmlns:mc="http://schemas.openxmlformats.org/markup-compatibility/2006" xmlns:aink="http://schemas.microsoft.com/office/drawing/2016/ink" xmlns:am3d="http://schemas.microsoft.com/office/drawing/2017/model3d" xmlns:o="urn:schemas-microsoft-com:office:office" xmlns:oel="http://schemas.microsoft.com/office/2019/extlst" xmlns:r="http://schemas.openxmlformats.org/officeDocument/2006/relationships" xmlns:m="http://schemas.openxmlformats.org/officeDocument/2006/math" xmlns:v="urn:schemas-microsoft-com:vml" xmlns:wp14="http://schemas.microsoft.com/office/word/2010/wordprocessingDrawing" xmlns:wp="http://schemas.openxmlformats.org/drawingml/2006/wordprocessingDrawing" xmlns:w10="urn:schemas-microsoft-com:office:word" xmlns:w="http://schemas.openxmlformats.org/wordprocessingml/2006/main" xmlns:w14="http://schemas.microsoft.com/office/word/2010/wordml" xmlns:w15="http://schemas.microsoft.com/office/word/2012/wordml" xmlns:w16cex="http://schemas.microsoft.com/office/word/2018/wordml/cex" xmlns:w16cid="http://schemas.microsoft.com/office/word/2016/wordml/cid" xmlns:w16="http://schemas.microsoft.com/office/word/2018/wordml" xmlns:w16du="http://schemas.microsoft.com/office/word/2023/wordml/word16du" xmlns:w16sdtdh="http://schemas.microsoft.com/office/word/2020/wordml/sdtdatahash" xmlns:w16sdtfl="http://schemas.microsoft.com/office/word/2024/wordml/sdtformatlock" xmlns:w16se="http://schemas.microsoft.com/office/word/2015/wordml/symex" xmlns:wpg="http://schemas.microsoft.com/office/word/2010/wordprocessingGroup" xmlns:wpi="http://schemas.microsoft.com/office/word/2010/wordprocessingInk" xmlns:wne="http://schemas.microsoft.com/office/word/2006/wordml" xmlns:wps="http://schemas.microsoft.com/office/word/2010/wordprocessingShape" mc:Ignorable="w14 w15 w16se w16cid w16 w16cex w16sdtdh w16sdtfl w16du wp14">
   <w:p>
     <w:pPr>
-      <w:pStyle w:val="Footer"/>
-    </w:pPr>
-  </w:p>
-</w:ftr>
-</file>
-
-<file path=word/footer3.xml><?xml version="1.0" encoding="utf-8"?>
-<w:ftr xmlns:wpc="http://schemas.microsoft.com/office/word/2010/wordprocessingCanvas" xmlns:cx="http://schemas.microsoft.com/office/drawing/2014/chartex" xmlns:cx1="http://schemas.microsoft.com/office/drawing/2015/9/8/chartex" xmlns:cx2="http://schemas.microsoft.com/office/drawing/2015/10/21/chartex" xmlns:cx3="http://schemas.microsoft.com/office/drawing/2016/5/9/chartex" xmlns:cx4="http://schemas.microsoft.com/office/drawing/2016/5/10/chartex" xmlns:cx5="http://schemas.microsoft.com/office/drawing/2016/5/11/chartex" xmlns:cx6="http://schemas.microsoft.com/office/drawing/2016/5/12/chartex" xmlns:cx7="http://schemas.microsoft.com/office/drawing/2016/5/13/chartex" xmlns:cx8="http://schemas.microsoft.com/office/drawing/2016/5/14/chartex" xmlns:mc="http://schemas.openxmlformats.org/markup-compatibility/2006" xmlns:aink="http://schemas.microsoft.com/office/drawing/2016/ink" xmlns:am3d="http://schemas.microsoft.com/office/drawing/2017/model3d" xmlns:o="urn:schemas-microsoft-com:office:office" xmlns:r="http://schemas.openxmlformats.org/officeDocument/2006/relationships" xmlns:m="http://schemas.openxmlformats.org/officeDocument/2006/math" xmlns:v="urn:schemas-microsoft-com:vml" xmlns:wp14="http://schemas.microsoft.com/office/word/2010/wordprocessingDrawing" xmlns:wp="http://schemas.openxmlformats.org/drawingml/2006/wordprocessingDrawing" xmlns:w10="urn:schemas-microsoft-com:office:word" xmlns:w="http://schemas.openxmlformats.org/wordprocessingml/2006/main" xmlns:w14="http://schemas.microsoft.com/office/word/2010/wordml" xmlns:w15="http://schemas.microsoft.com/office/word/2012/wordml" xmlns:w16cex="http://schemas.microsoft.com/office/word/2018/wordml/cex" xmlns:w16cid="http://schemas.microsoft.com/office/word/2016/wordml/cid" xmlns:w16="http://schemas.microsoft.com/office/word/2018/wordml" xmlns:w16sdtdh="http://schemas.microsoft.com/office/word/2020/wordml/sdtdatahash" xmlns:w16se="http://schemas.microsoft.com/office/word/2015/wordml/symex" xmlns:wpg="http://schemas.microsoft.com/office/word/2010/wordprocessingGroup" xmlns:wpi="http://schemas.microsoft.com/office/word/2010/wordprocessingInk" xmlns:wne="http://schemas.microsoft.com/office/word/2006/wordml" xmlns:wps="http://schemas.microsoft.com/office/word/2010/wordprocessingShape" mc:Ignorable="w14 w15 w16se w16cid w16 w16cex w16sdtdh wp14">
-  <w:p>
-    <w:pPr>
-      <w:pStyle w:val="Footer"/>
-      <w:jc w:val="center"/>
-    </w:pPr>
-  </w:p>
-</w:ftr>
-</file>
-
-<file path=word/footer4.xml><?xml version="1.0" encoding="utf-8"?>
-<w:ftr xmlns:wpc="http://schemas.microsoft.com/office/word/2010/wordprocessingCanvas" xmlns:cx="http://schemas.microsoft.com/office/drawing/2014/chartex" xmlns:cx1="http://schemas.microsoft.com/office/drawing/2015/9/8/chartex" xmlns:cx2="http://schemas.microsoft.com/office/drawing/2015/10/21/chartex" xmlns:cx3="http://schemas.microsoft.com/office/drawing/2016/5/9/chartex" xmlns:cx4="http://schemas.microsoft.com/office/drawing/2016/5/10/chartex" xmlns:cx5="http://schemas.microsoft.com/office/drawing/2016/5/11/chartex" xmlns:cx6="http://schemas.microsoft.com/office/drawing/2016/5/12/chartex" xmlns:cx7="http://schemas.microsoft.com/office/drawing/2016/5/13/chartex" xmlns:cx8="http://schemas.microsoft.com/office/drawing/2016/5/14/chartex" xmlns:mc="http://schemas.openxmlformats.org/markup-compatibility/2006" xmlns:aink="http://schemas.microsoft.com/office/drawing/2016/ink" xmlns:am3d="http://schemas.microsoft.com/office/drawing/2017/model3d" xmlns:o="urn:schemas-microsoft-com:office:office" xmlns:r="http://schemas.openxmlformats.org/officeDocument/2006/relationships" xmlns:m="http://schemas.openxmlformats.org/officeDocument/2006/math" xmlns:v="urn:schemas-microsoft-com:vml" xmlns:wp14="http://schemas.microsoft.com/office/word/2010/wordprocessingDrawing" xmlns:wp="http://schemas.openxmlformats.org/drawingml/2006/wordprocessingDrawing" xmlns:w10="urn:schemas-microsoft-com:office:word" xmlns:w="http://schemas.openxmlformats.org/wordprocessingml/2006/main" xmlns:w14="http://schemas.microsoft.com/office/word/2010/wordml" xmlns:w15="http://schemas.microsoft.com/office/word/2012/wordml" xmlns:w16cex="http://schemas.microsoft.com/office/word/2018/wordml/cex" xmlns:w16cid="http://schemas.microsoft.com/office/word/2016/wordml/cid" xmlns:w16="http://schemas.microsoft.com/office/word/2018/wordml" xmlns:w16sdtdh="http://schemas.microsoft.com/office/word/2020/wordml/sdtdatahash" xmlns:w16se="http://schemas.microsoft.com/office/word/2015/wordml/symex" xmlns:wpg="http://schemas.microsoft.com/office/word/2010/wordprocessingGroup" xmlns:wpi="http://schemas.microsoft.com/office/word/2010/wordprocessingInk" xmlns:wne="http://schemas.microsoft.com/office/word/2006/wordml" xmlns:wps="http://schemas.microsoft.com/office/word/2010/wordprocessingShape" mc:Ignorable="w14 w15 w16se w16cid w16 w16cex w16sdtdh wp14">
-  <w:p>
-    <w:pPr>
-      <w:pStyle w:val="Footer"/>
+      <w:pStyle w:val="Fuzeile"/>
       <w:jc w:val="center"/>
     </w:pPr>
     <w:r>
@@ -44664,14 +43077,14 @@
   </w:p>
   <w:p>
     <w:pPr>
-      <w:pStyle w:val="Footer"/>
+      <w:pStyle w:val="Fuzeile"/>
     </w:pPr>
   </w:p>
 </w:ftr>
 </file>
 
 <file path=word/footnotes.xml><?xml version="1.0" encoding="utf-8"?>
-<w:footnotes xmlns:wpc="http://schemas.microsoft.com/office/word/2010/wordprocessingCanvas" xmlns:cx="http://schemas.microsoft.com/office/drawing/2014/chartex" xmlns:cx1="http://schemas.microsoft.com/office/drawing/2015/9/8/chartex" xmlns:cx2="http://schemas.microsoft.com/office/drawing/2015/10/21/chartex" xmlns:cx3="http://schemas.microsoft.com/office/drawing/2016/5/9/chartex" xmlns:cx4="http://schemas.microsoft.com/office/drawing/2016/5/10/chartex" xmlns:cx5="http://schemas.microsoft.com/office/drawing/2016/5/11/chartex" xmlns:cx6="http://schemas.microsoft.com/office/drawing/2016/5/12/chartex" xmlns:cx7="http://schemas.microsoft.com/office/drawing/2016/5/13/chartex" xmlns:cx8="http://schemas.microsoft.com/office/drawing/2016/5/14/chartex" xmlns:mc="http://schemas.openxmlformats.org/markup-compatibility/2006" xmlns:aink="http://schemas.microsoft.com/office/drawing/2016/ink" xmlns:am3d="http://schemas.microsoft.com/office/drawing/2017/model3d" xmlns:o="urn:schemas-microsoft-com:office:office" xmlns:r="http://schemas.openxmlformats.org/officeDocument/2006/relationships" xmlns:m="http://schemas.openxmlformats.org/officeDocument/2006/math" xmlns:v="urn:schemas-microsoft-com:vml" xmlns:wp14="http://schemas.microsoft.com/office/word/2010/wordprocessingDrawing" xmlns:wp="http://schemas.openxmlformats.org/drawingml/2006/wordprocessingDrawing" xmlns:w10="urn:schemas-microsoft-com:office:word" xmlns:w="http://schemas.openxmlformats.org/wordprocessingml/2006/main" xmlns:w14="http://schemas.microsoft.com/office/word/2010/wordml" xmlns:w15="http://schemas.microsoft.com/office/word/2012/wordml" xmlns:w16cex="http://schemas.microsoft.com/office/word/2018/wordml/cex" xmlns:w16cid="http://schemas.microsoft.com/office/word/2016/wordml/cid" xmlns:w16="http://schemas.microsoft.com/office/word/2018/wordml" xmlns:w16sdtdh="http://schemas.microsoft.com/office/word/2020/wordml/sdtdatahash" xmlns:w16se="http://schemas.microsoft.com/office/word/2015/wordml/symex" xmlns:wpg="http://schemas.microsoft.com/office/word/2010/wordprocessingGroup" xmlns:wpi="http://schemas.microsoft.com/office/word/2010/wordprocessingInk" xmlns:wne="http://schemas.microsoft.com/office/word/2006/wordml" xmlns:wps="http://schemas.microsoft.com/office/word/2010/wordprocessingShape" mc:Ignorable="w14 w15 w16se w16cid w16 w16cex w16sdtdh wp14">
+<w:footnotes xmlns:wpc="http://schemas.microsoft.com/office/word/2010/wordprocessingCanvas" xmlns:cx="http://schemas.microsoft.com/office/drawing/2014/chartex" xmlns:cx1="http://schemas.microsoft.com/office/drawing/2015/9/8/chartex" xmlns:cx2="http://schemas.microsoft.com/office/drawing/2015/10/21/chartex" xmlns:cx3="http://schemas.microsoft.com/office/drawing/2016/5/9/chartex" xmlns:cx4="http://schemas.microsoft.com/office/drawing/2016/5/10/chartex" xmlns:cx5="http://schemas.microsoft.com/office/drawing/2016/5/11/chartex" xmlns:cx6="http://schemas.microsoft.com/office/drawing/2016/5/12/chartex" xmlns:cx7="http://schemas.microsoft.com/office/drawing/2016/5/13/chartex" xmlns:cx8="http://schemas.microsoft.com/office/drawing/2016/5/14/chartex" xmlns:mc="http://schemas.openxmlformats.org/markup-compatibility/2006" xmlns:aink="http://schemas.microsoft.com/office/drawing/2016/ink" xmlns:am3d="http://schemas.microsoft.com/office/drawing/2017/model3d" xmlns:o="urn:schemas-microsoft-com:office:office" xmlns:oel="http://schemas.microsoft.com/office/2019/extlst" xmlns:r="http://schemas.openxmlformats.org/officeDocument/2006/relationships" xmlns:m="http://schemas.openxmlformats.org/officeDocument/2006/math" xmlns:v="urn:schemas-microsoft-com:vml" xmlns:wp14="http://schemas.microsoft.com/office/word/2010/wordprocessingDrawing" xmlns:wp="http://schemas.openxmlformats.org/drawingml/2006/wordprocessingDrawing" xmlns:w10="urn:schemas-microsoft-com:office:word" xmlns:w="http://schemas.openxmlformats.org/wordprocessingml/2006/main" xmlns:w14="http://schemas.microsoft.com/office/word/2010/wordml" xmlns:w15="http://schemas.microsoft.com/office/word/2012/wordml" xmlns:w16cex="http://schemas.microsoft.com/office/word/2018/wordml/cex" xmlns:w16cid="http://schemas.microsoft.com/office/word/2016/wordml/cid" xmlns:w16="http://schemas.microsoft.com/office/word/2018/wordml" xmlns:w16du="http://schemas.microsoft.com/office/word/2023/wordml/word16du" xmlns:w16sdtdh="http://schemas.microsoft.com/office/word/2020/wordml/sdtdatahash" xmlns:w16sdtfl="http://schemas.microsoft.com/office/word/2024/wordml/sdtformatlock" xmlns:w16se="http://schemas.microsoft.com/office/word/2015/wordml/symex" xmlns:wpg="http://schemas.microsoft.com/office/word/2010/wordprocessingGroup" xmlns:wpi="http://schemas.microsoft.com/office/word/2010/wordprocessingInk" xmlns:wne="http://schemas.microsoft.com/office/word/2006/wordml" xmlns:wps="http://schemas.microsoft.com/office/word/2010/wordprocessingShape" mc:Ignorable="w14 w15 w16se w16cid w16 w16cex w16sdtdh w16sdtfl w16du wp14">
   <w:footnote w:type="separator" w:id="-1">
     <w:p>
       <w:pPr>
@@ -44701,117 +43114,8 @@
 </w:footnotes>
 </file>
 
-<file path=word/header1.xml><?xml version="1.0" encoding="utf-8"?>
-<w:hdr xmlns:wpc="http://schemas.microsoft.com/office/word/2010/wordprocessingCanvas" xmlns:cx="http://schemas.microsoft.com/office/drawing/2014/chartex" xmlns:cx1="http://schemas.microsoft.com/office/drawing/2015/9/8/chartex" xmlns:cx2="http://schemas.microsoft.com/office/drawing/2015/10/21/chartex" xmlns:cx3="http://schemas.microsoft.com/office/drawing/2016/5/9/chartex" xmlns:cx4="http://schemas.microsoft.com/office/drawing/2016/5/10/chartex" xmlns:cx5="http://schemas.microsoft.com/office/drawing/2016/5/11/chartex" xmlns:cx6="http://schemas.microsoft.com/office/drawing/2016/5/12/chartex" xmlns:cx7="http://schemas.microsoft.com/office/drawing/2016/5/13/chartex" xmlns:cx8="http://schemas.microsoft.com/office/drawing/2016/5/14/chartex" xmlns:mc="http://schemas.openxmlformats.org/markup-compatibility/2006" xmlns:aink="http://schemas.microsoft.com/office/drawing/2016/ink" xmlns:am3d="http://schemas.microsoft.com/office/drawing/2017/model3d" xmlns:o="urn:schemas-microsoft-com:office:office" xmlns:r="http://schemas.openxmlformats.org/officeDocument/2006/relationships" xmlns:m="http://schemas.openxmlformats.org/officeDocument/2006/math" xmlns:v="urn:schemas-microsoft-com:vml" xmlns:wp14="http://schemas.microsoft.com/office/word/2010/wordprocessingDrawing" xmlns:wp="http://schemas.openxmlformats.org/drawingml/2006/wordprocessingDrawing" xmlns:w10="urn:schemas-microsoft-com:office:word" xmlns:w="http://schemas.openxmlformats.org/wordprocessingml/2006/main" xmlns:w14="http://schemas.microsoft.com/office/word/2010/wordml" xmlns:w15="http://schemas.microsoft.com/office/word/2012/wordml" xmlns:w16cex="http://schemas.microsoft.com/office/word/2018/wordml/cex" xmlns:w16cid="http://schemas.microsoft.com/office/word/2016/wordml/cid" xmlns:w16="http://schemas.microsoft.com/office/word/2018/wordml" xmlns:w16sdtdh="http://schemas.microsoft.com/office/word/2020/wordml/sdtdatahash" xmlns:w16se="http://schemas.microsoft.com/office/word/2015/wordml/symex" xmlns:wpg="http://schemas.microsoft.com/office/word/2010/wordprocessingGroup" xmlns:wpi="http://schemas.microsoft.com/office/word/2010/wordprocessingInk" xmlns:wne="http://schemas.microsoft.com/office/word/2006/wordml" xmlns:wps="http://schemas.microsoft.com/office/word/2010/wordprocessingShape" mc:Ignorable="w14 w15 w16se w16cid w16 w16cex w16sdtdh wp14">
-  <w:p>
-    <w:pPr>
-      <w:pStyle w:val="Footerempty"/>
-      <w:ind w:right="-508"/>
-      <w:rPr>
-        <w:rFonts w:cs="Arial"/>
-        <w:color w:val="000080"/>
-      </w:rPr>
-    </w:pPr>
-    <w:r>
-      <w:rPr>
-        <w:rFonts w:cs="Arial"/>
-        <w:sz w:val="16"/>
-      </w:rPr>
-      <w:t xml:space="preserve"> </w:t>
-    </w:r>
-  </w:p>
-  <w:p>
-    <w:pPr>
-      <w:pStyle w:val="Footerempty"/>
-      <w:rPr>
-        <w:rFonts w:cs="Arial"/>
-        <w:color w:val="000080"/>
-        <w:sz w:val="20"/>
-      </w:rPr>
-    </w:pPr>
-    <w:r>
-      <w:rPr>
-        <w:rFonts w:cs="Arial"/>
-        <w:smallCaps/>
-        <w:noProof/>
-        <w:color w:val="000080"/>
-        <w:spacing w:val="20"/>
-        <w:sz w:val="22"/>
-      </w:rPr>
-      <w:drawing>
-        <wp:inline distT="0" distB="0" distL="0" distR="0" wp14:anchorId="36E5CDC0" wp14:editId="29131C7D">
-          <wp:extent cx="1346200" cy="533400"/>
-          <wp:effectExtent l="0" t="0" r="0" b="0"/>
-          <wp:docPr id="834" name="Picture 833"/>
-          <wp:cNvGraphicFramePr>
-            <a:graphicFrameLocks xmlns:a="http://schemas.openxmlformats.org/drawingml/2006/main"/>
-          </wp:cNvGraphicFramePr>
-          <a:graphic xmlns:a="http://schemas.openxmlformats.org/drawingml/2006/main">
-            <a:graphicData uri="http://schemas.openxmlformats.org/drawingml/2006/picture">
-              <pic:pic xmlns:pic="http://schemas.openxmlformats.org/drawingml/2006/picture">
-                <pic:nvPicPr>
-                  <pic:cNvPr id="0" name="Picture 833"/>
-                  <pic:cNvPicPr>
-                    <a:picLocks/>
-                  </pic:cNvPicPr>
-                </pic:nvPicPr>
-                <pic:blipFill>
-                  <a:blip r:embed="rId1">
-                    <a:extLst>
-                      <a:ext uri="{28A0092B-C50C-407E-A947-70E740481C1C}">
-                        <a14:useLocalDpi xmlns:a14="http://schemas.microsoft.com/office/drawing/2010/main" val="0"/>
-                      </a:ext>
-                    </a:extLst>
-                  </a:blip>
-                  <a:srcRect/>
-                  <a:stretch>
-                    <a:fillRect/>
-                  </a:stretch>
-                </pic:blipFill>
-                <pic:spPr bwMode="auto">
-                  <a:xfrm>
-                    <a:off x="0" y="0"/>
-                    <a:ext cx="1346200" cy="533400"/>
-                  </a:xfrm>
-                  <a:prstGeom prst="rect">
-                    <a:avLst/>
-                  </a:prstGeom>
-                  <a:noFill/>
-                  <a:ln>
-                    <a:noFill/>
-                  </a:ln>
-                </pic:spPr>
-              </pic:pic>
-            </a:graphicData>
-          </a:graphic>
-        </wp:inline>
-      </w:drawing>
-    </w:r>
-  </w:p>
-  <w:p>
-    <w:pPr>
-      <w:pStyle w:val="Footerempty"/>
-      <w:rPr>
-        <w:rFonts w:cs="Arial"/>
-        <w:color w:val="000080"/>
-        <w:sz w:val="20"/>
-      </w:rPr>
-    </w:pPr>
-  </w:p>
-  <w:p>
-    <w:pPr>
-      <w:pStyle w:val="Footerempty"/>
-      <w:rPr>
-        <w:rFonts w:cs="Arial"/>
-        <w:color w:val="000080"/>
-      </w:rPr>
-    </w:pPr>
-  </w:p>
-</w:hdr>
-</file>
-
 <file path=word/numbering.xml><?xml version="1.0" encoding="utf-8"?>
-<w:numbering xmlns:wpc="http://schemas.microsoft.com/office/word/2010/wordprocessingCanvas" xmlns:cx="http://schemas.microsoft.com/office/drawing/2014/chartex" xmlns:cx1="http://schemas.microsoft.com/office/drawing/2015/9/8/chartex" xmlns:cx2="http://schemas.microsoft.com/office/drawing/2015/10/21/chartex" xmlns:cx3="http://schemas.microsoft.com/office/drawing/2016/5/9/chartex" xmlns:cx4="http://schemas.microsoft.com/office/drawing/2016/5/10/chartex" xmlns:cx5="http://schemas.microsoft.com/office/drawing/2016/5/11/chartex" xmlns:cx6="http://schemas.microsoft.com/office/drawing/2016/5/12/chartex" xmlns:cx7="http://schemas.microsoft.com/office/drawing/2016/5/13/chartex" xmlns:cx8="http://schemas.microsoft.com/office/drawing/2016/5/14/chartex" xmlns:mc="http://schemas.openxmlformats.org/markup-compatibility/2006" xmlns:aink="http://schemas.microsoft.com/office/drawing/2016/ink" xmlns:am3d="http://schemas.microsoft.com/office/drawing/2017/model3d" xmlns:o="urn:schemas-microsoft-com:office:office" xmlns:r="http://schemas.openxmlformats.org/officeDocument/2006/relationships" xmlns:m="http://schemas.openxmlformats.org/officeDocument/2006/math" xmlns:v="urn:schemas-microsoft-com:vml" xmlns:wp14="http://schemas.microsoft.com/office/word/2010/wordprocessingDrawing" xmlns:wp="http://schemas.openxmlformats.org/drawingml/2006/wordprocessingDrawing" xmlns:w10="urn:schemas-microsoft-com:office:word" xmlns:w="http://schemas.openxmlformats.org/wordprocessingml/2006/main" xmlns:w14="http://schemas.microsoft.com/office/word/2010/wordml" xmlns:w15="http://schemas.microsoft.com/office/word/2012/wordml" xmlns:w16cex="http://schemas.microsoft.com/office/word/2018/wordml/cex" xmlns:w16cid="http://schemas.microsoft.com/office/word/2016/wordml/cid" xmlns:w16="http://schemas.microsoft.com/office/word/2018/wordml" xmlns:w16sdtdh="http://schemas.microsoft.com/office/word/2020/wordml/sdtdatahash" xmlns:w16se="http://schemas.microsoft.com/office/word/2015/wordml/symex" xmlns:wpg="http://schemas.microsoft.com/office/word/2010/wordprocessingGroup" xmlns:wpi="http://schemas.microsoft.com/office/word/2010/wordprocessingInk" xmlns:wne="http://schemas.microsoft.com/office/word/2006/wordml" xmlns:wps="http://schemas.microsoft.com/office/word/2010/wordprocessingShape" mc:Ignorable="w14 w15 w16se w16cid w16 w16cex w16sdtdh wp14">
+<w:numbering xmlns:wpc="http://schemas.microsoft.com/office/word/2010/wordprocessingCanvas" xmlns:cx="http://schemas.microsoft.com/office/drawing/2014/chartex" xmlns:cx1="http://schemas.microsoft.com/office/drawing/2015/9/8/chartex" xmlns:cx2="http://schemas.microsoft.com/office/drawing/2015/10/21/chartex" xmlns:cx3="http://schemas.microsoft.com/office/drawing/2016/5/9/chartex" xmlns:cx4="http://schemas.microsoft.com/office/drawing/2016/5/10/chartex" xmlns:cx5="http://schemas.microsoft.com/office/drawing/2016/5/11/chartex" xmlns:cx6="http://schemas.microsoft.com/office/drawing/2016/5/12/chartex" xmlns:cx7="http://schemas.microsoft.com/office/drawing/2016/5/13/chartex" xmlns:cx8="http://schemas.microsoft.com/office/drawing/2016/5/14/chartex" xmlns:mc="http://schemas.openxmlformats.org/markup-compatibility/2006" xmlns:aink="http://schemas.microsoft.com/office/drawing/2016/ink" xmlns:am3d="http://schemas.microsoft.com/office/drawing/2017/model3d" xmlns:o="urn:schemas-microsoft-com:office:office" xmlns:oel="http://schemas.microsoft.com/office/2019/extlst" xmlns:r="http://schemas.openxmlformats.org/officeDocument/2006/relationships" xmlns:m="http://schemas.openxmlformats.org/officeDocument/2006/math" xmlns:v="urn:schemas-microsoft-com:vml" xmlns:wp14="http://schemas.microsoft.com/office/word/2010/wordprocessingDrawing" xmlns:wp="http://schemas.openxmlformats.org/drawingml/2006/wordprocessingDrawing" xmlns:w10="urn:schemas-microsoft-com:office:word" xmlns:w="http://schemas.openxmlformats.org/wordprocessingml/2006/main" xmlns:w14="http://schemas.microsoft.com/office/word/2010/wordml" xmlns:w15="http://schemas.microsoft.com/office/word/2012/wordml" xmlns:w16cex="http://schemas.microsoft.com/office/word/2018/wordml/cex" xmlns:w16cid="http://schemas.microsoft.com/office/word/2016/wordml/cid" xmlns:w16="http://schemas.microsoft.com/office/word/2018/wordml" xmlns:w16du="http://schemas.microsoft.com/office/word/2023/wordml/word16du" xmlns:w16sdtdh="http://schemas.microsoft.com/office/word/2020/wordml/sdtdatahash" xmlns:w16sdtfl="http://schemas.microsoft.com/office/word/2024/wordml/sdtformatlock" xmlns:w16se="http://schemas.microsoft.com/office/word/2015/wordml/symex" xmlns:wpg="http://schemas.microsoft.com/office/word/2010/wordprocessingGroup" xmlns:wpi="http://schemas.microsoft.com/office/word/2010/wordprocessingInk" xmlns:wne="http://schemas.microsoft.com/office/word/2006/wordml" xmlns:wps="http://schemas.microsoft.com/office/word/2010/wordprocessingShape" mc:Ignorable="w14 w15 w16se w16cid w16 w16cex w16sdtdh w16sdtfl w16du wp14">
   <w:abstractNum w:abstractNumId="0" w15:restartNumberingAfterBreak="0">
     <w:nsid w:val="FFFFFF1D"/>
     <w:multiLevelType w:val="multilevel"/>
@@ -47606,7 +45910,7 @@
     <w:lvl w:ilvl="3">
       <w:start w:val="1"/>
       <w:numFmt w:val="decimal"/>
-      <w:pStyle w:val="Heading4"/>
+      <w:pStyle w:val="berschrift4"/>
       <w:lvlText w:val="%1.%2.%3.%4"/>
       <w:lvlJc w:val="left"/>
       <w:pPr>
@@ -47928,7 +46232,7 @@
     <w:lvl w:ilvl="0">
       <w:start w:val="1"/>
       <w:numFmt w:val="decimal"/>
-      <w:pStyle w:val="Heading1"/>
+      <w:pStyle w:val="berschrift1"/>
       <w:lvlText w:val="%1"/>
       <w:lvlJc w:val="left"/>
       <w:pPr>
@@ -47944,7 +46248,7 @@
     <w:lvl w:ilvl="1">
       <w:start w:val="1"/>
       <w:numFmt w:val="decimal"/>
-      <w:pStyle w:val="Heading2"/>
+      <w:pStyle w:val="berschrift2"/>
       <w:lvlText w:val="%1.%2"/>
       <w:lvlJc w:val="left"/>
       <w:pPr>
@@ -47960,7 +46264,7 @@
     <w:lvl w:ilvl="2">
       <w:start w:val="1"/>
       <w:numFmt w:val="decimal"/>
-      <w:pStyle w:val="Heading3"/>
+      <w:pStyle w:val="berschrift3"/>
       <w:lvlText w:val="%1.%2.%3"/>
       <w:lvlJc w:val="left"/>
       <w:pPr>
@@ -49321,7 +47625,7 @@
     <w:lvl w:ilvl="0" w:tplc="FFFFFFFF">
       <w:start w:val="1"/>
       <w:numFmt w:val="bullet"/>
-      <w:pStyle w:val="Caption"/>
+      <w:pStyle w:val="Beschriftung"/>
       <w:lvlText w:val=""/>
       <w:lvlJc w:val="left"/>
       <w:pPr>
@@ -49594,130 +47898,130 @@
       </w:rPr>
     </w:lvl>
   </w:abstractNum>
-  <w:num w:numId="1">
+  <w:num w:numId="1" w16cid:durableId="1631396160">
     <w:abstractNumId w:val="38"/>
   </w:num>
-  <w:num w:numId="2">
+  <w:num w:numId="2" w16cid:durableId="1159077700">
     <w:abstractNumId w:val="23"/>
   </w:num>
-  <w:num w:numId="3">
+  <w:num w:numId="3" w16cid:durableId="105590319">
     <w:abstractNumId w:val="33"/>
   </w:num>
-  <w:num w:numId="4">
+  <w:num w:numId="4" w16cid:durableId="1256553243">
     <w:abstractNumId w:val="15"/>
   </w:num>
-  <w:num w:numId="5">
+  <w:num w:numId="5" w16cid:durableId="1279411370">
     <w:abstractNumId w:val="9"/>
   </w:num>
-  <w:num w:numId="6">
+  <w:num w:numId="6" w16cid:durableId="48918200">
     <w:abstractNumId w:val="39"/>
   </w:num>
-  <w:num w:numId="7">
+  <w:num w:numId="7" w16cid:durableId="1779060150">
     <w:abstractNumId w:val="21"/>
   </w:num>
-  <w:num w:numId="8">
+  <w:num w:numId="8" w16cid:durableId="1255285576">
     <w:abstractNumId w:val="14"/>
   </w:num>
-  <w:num w:numId="9">
+  <w:num w:numId="9" w16cid:durableId="328602819">
     <w:abstractNumId w:val="36"/>
   </w:num>
-  <w:num w:numId="10">
+  <w:num w:numId="10" w16cid:durableId="1280143201">
     <w:abstractNumId w:val="26"/>
   </w:num>
-  <w:num w:numId="11">
+  <w:num w:numId="11" w16cid:durableId="1358699497">
     <w:abstractNumId w:val="2"/>
   </w:num>
-  <w:num w:numId="12">
+  <w:num w:numId="12" w16cid:durableId="613170419">
     <w:abstractNumId w:val="19"/>
   </w:num>
-  <w:num w:numId="13">
+  <w:num w:numId="13" w16cid:durableId="8603978">
     <w:abstractNumId w:val="18"/>
   </w:num>
-  <w:num w:numId="14">
+  <w:num w:numId="14" w16cid:durableId="49118111">
     <w:abstractNumId w:val="34"/>
   </w:num>
-  <w:num w:numId="15">
+  <w:num w:numId="15" w16cid:durableId="1861701390">
     <w:abstractNumId w:val="37"/>
   </w:num>
-  <w:num w:numId="16">
+  <w:num w:numId="16" w16cid:durableId="1961834258">
     <w:abstractNumId w:val="8"/>
   </w:num>
-  <w:num w:numId="17">
+  <w:num w:numId="17" w16cid:durableId="2024165626">
     <w:abstractNumId w:val="4"/>
   </w:num>
-  <w:num w:numId="18">
+  <w:num w:numId="18" w16cid:durableId="1508057357">
     <w:abstractNumId w:val="20"/>
   </w:num>
-  <w:num w:numId="19">
+  <w:num w:numId="19" w16cid:durableId="658079450">
     <w:abstractNumId w:val="11"/>
   </w:num>
-  <w:num w:numId="20">
+  <w:num w:numId="20" w16cid:durableId="89395963">
     <w:abstractNumId w:val="3"/>
   </w:num>
-  <w:num w:numId="21">
+  <w:num w:numId="21" w16cid:durableId="882595941">
     <w:abstractNumId w:val="35"/>
   </w:num>
-  <w:num w:numId="22">
+  <w:num w:numId="22" w16cid:durableId="1383095521">
     <w:abstractNumId w:val="25"/>
   </w:num>
-  <w:num w:numId="23">
+  <w:num w:numId="23" w16cid:durableId="1560087891">
     <w:abstractNumId w:val="17"/>
   </w:num>
-  <w:num w:numId="24">
+  <w:num w:numId="24" w16cid:durableId="386103429">
     <w:abstractNumId w:val="7"/>
   </w:num>
-  <w:num w:numId="25">
+  <w:num w:numId="25" w16cid:durableId="1745031929">
     <w:abstractNumId w:val="30"/>
   </w:num>
-  <w:num w:numId="26">
+  <w:num w:numId="26" w16cid:durableId="212234762">
     <w:abstractNumId w:val="24"/>
   </w:num>
-  <w:num w:numId="27">
+  <w:num w:numId="27" w16cid:durableId="1286699352">
     <w:abstractNumId w:val="28"/>
   </w:num>
-  <w:num w:numId="28">
+  <w:num w:numId="28" w16cid:durableId="1320038283">
     <w:abstractNumId w:val="22"/>
   </w:num>
-  <w:num w:numId="29">
+  <w:num w:numId="29" w16cid:durableId="1205368486">
     <w:abstractNumId w:val="16"/>
   </w:num>
-  <w:num w:numId="30">
+  <w:num w:numId="30" w16cid:durableId="1161776066">
     <w:abstractNumId w:val="13"/>
   </w:num>
-  <w:num w:numId="31">
+  <w:num w:numId="31" w16cid:durableId="350036580">
     <w:abstractNumId w:val="31"/>
   </w:num>
-  <w:num w:numId="32">
+  <w:num w:numId="32" w16cid:durableId="1536969585">
     <w:abstractNumId w:val="32"/>
   </w:num>
-  <w:num w:numId="33">
+  <w:num w:numId="33" w16cid:durableId="962614569">
     <w:abstractNumId w:val="1"/>
   </w:num>
-  <w:num w:numId="34">
+  <w:num w:numId="34" w16cid:durableId="1920409968">
     <w:abstractNumId w:val="27"/>
   </w:num>
-  <w:num w:numId="35">
+  <w:num w:numId="35" w16cid:durableId="902177154">
     <w:abstractNumId w:val="10"/>
   </w:num>
-  <w:num w:numId="36">
+  <w:num w:numId="36" w16cid:durableId="370956601">
     <w:abstractNumId w:val="12"/>
   </w:num>
-  <w:num w:numId="37">
+  <w:num w:numId="37" w16cid:durableId="1253783731">
     <w:abstractNumId w:val="6"/>
   </w:num>
-  <w:num w:numId="38">
+  <w:num w:numId="38" w16cid:durableId="1306395751">
     <w:abstractNumId w:val="29"/>
   </w:num>
-  <w:num w:numId="39">
+  <w:num w:numId="39" w16cid:durableId="951858566">
     <w:abstractNumId w:val="23"/>
   </w:num>
-  <w:num w:numId="40">
+  <w:num w:numId="40" w16cid:durableId="819887773">
     <w:abstractNumId w:val="26"/>
   </w:num>
-  <w:num w:numId="41">
+  <w:num w:numId="41" w16cid:durableId="1103189974">
     <w:abstractNumId w:val="5"/>
   </w:num>
-  <w:num w:numId="42">
+  <w:num w:numId="42" w16cid:durableId="793867276">
     <w:abstractNumId w:val="0"/>
   </w:num>
   <w:numIdMacAtCleanup w:val="37"/>
@@ -49725,7 +48029,7 @@
 </file>
 
 <file path=word/styles.xml><?xml version="1.0" encoding="utf-8"?>
-<w:styles xmlns:mc="http://schemas.openxmlformats.org/markup-compatibility/2006" xmlns:r="http://schemas.openxmlformats.org/officeDocument/2006/relationships" xmlns:w="http://schemas.openxmlformats.org/wordprocessingml/2006/main" xmlns:w14="http://schemas.microsoft.com/office/word/2010/wordml" xmlns:w15="http://schemas.microsoft.com/office/word/2012/wordml" xmlns:w16cex="http://schemas.microsoft.com/office/word/2018/wordml/cex" xmlns:w16cid="http://schemas.microsoft.com/office/word/2016/wordml/cid" xmlns:w16="http://schemas.microsoft.com/office/word/2018/wordml" xmlns:w16sdtdh="http://schemas.microsoft.com/office/word/2020/wordml/sdtdatahash" xmlns:w16se="http://schemas.microsoft.com/office/word/2015/wordml/symex" mc:Ignorable="w14 w15 w16se w16cid w16 w16cex w16sdtdh">
+<w:styles xmlns:mc="http://schemas.openxmlformats.org/markup-compatibility/2006" xmlns:r="http://schemas.openxmlformats.org/officeDocument/2006/relationships" xmlns:w="http://schemas.openxmlformats.org/wordprocessingml/2006/main" xmlns:w14="http://schemas.microsoft.com/office/word/2010/wordml" xmlns:w15="http://schemas.microsoft.com/office/word/2012/wordml" xmlns:w16cex="http://schemas.microsoft.com/office/word/2018/wordml/cex" xmlns:w16cid="http://schemas.microsoft.com/office/word/2016/wordml/cid" xmlns:w16="http://schemas.microsoft.com/office/word/2018/wordml" xmlns:w16du="http://schemas.microsoft.com/office/word/2023/wordml/word16du" xmlns:w16sdtdh="http://schemas.microsoft.com/office/word/2020/wordml/sdtdatahash" xmlns:w16sdtfl="http://schemas.microsoft.com/office/word/2024/wordml/sdtformatlock" xmlns:w16se="http://schemas.microsoft.com/office/word/2015/wordml/symex" mc:Ignorable="w14 w15 w16se w16cid w16 w16cex w16sdtdh w16sdtfl w16du">
   <w:docDefaults>
     <w:rPrDefault>
       <w:rPr>
@@ -49759,8 +48063,52 @@
     <w:lsdException w:name="Strong" w:qFormat="1"/>
     <w:lsdException w:name="Emphasis" w:qFormat="1"/>
     <w:lsdException w:name="Normal (Web)" w:uiPriority="99"/>
+    <w:lsdException w:name="Normal Table" w:semiHidden="1" w:unhideWhenUsed="1"/>
     <w:lsdException w:name="No List" w:uiPriority="99"/>
+    <w:lsdException w:name="Table Simple 1" w:semiHidden="1" w:unhideWhenUsed="1"/>
+    <w:lsdException w:name="Table Simple 2" w:semiHidden="1" w:unhideWhenUsed="1"/>
+    <w:lsdException w:name="Table Simple 3" w:semiHidden="1" w:unhideWhenUsed="1"/>
+    <w:lsdException w:name="Table Classic 1" w:semiHidden="1" w:unhideWhenUsed="1"/>
+    <w:lsdException w:name="Table Classic 2" w:semiHidden="1" w:unhideWhenUsed="1"/>
+    <w:lsdException w:name="Table Classic 3" w:semiHidden="1" w:unhideWhenUsed="1"/>
+    <w:lsdException w:name="Table Classic 4" w:semiHidden="1" w:unhideWhenUsed="1"/>
+    <w:lsdException w:name="Table Colorful 1" w:semiHidden="1" w:unhideWhenUsed="1"/>
+    <w:lsdException w:name="Table Colorful 2" w:semiHidden="1" w:unhideWhenUsed="1"/>
+    <w:lsdException w:name="Table Colorful 3" w:semiHidden="1" w:unhideWhenUsed="1"/>
+    <w:lsdException w:name="Table Columns 1" w:semiHidden="1" w:unhideWhenUsed="1"/>
+    <w:lsdException w:name="Table Columns 2" w:semiHidden="1" w:unhideWhenUsed="1"/>
+    <w:lsdException w:name="Table Columns 3" w:semiHidden="1" w:unhideWhenUsed="1"/>
+    <w:lsdException w:name="Table Columns 4" w:semiHidden="1" w:unhideWhenUsed="1"/>
+    <w:lsdException w:name="Table Columns 5" w:semiHidden="1" w:unhideWhenUsed="1"/>
+    <w:lsdException w:name="Table Grid 1" w:semiHidden="1" w:unhideWhenUsed="1"/>
+    <w:lsdException w:name="Table Grid 2" w:semiHidden="1" w:unhideWhenUsed="1"/>
+    <w:lsdException w:name="Table Grid 3" w:semiHidden="1" w:unhideWhenUsed="1"/>
+    <w:lsdException w:name="Table Grid 4" w:semiHidden="1" w:unhideWhenUsed="1"/>
+    <w:lsdException w:name="Table Grid 5" w:semiHidden="1" w:unhideWhenUsed="1"/>
+    <w:lsdException w:name="Table Grid 6" w:semiHidden="1" w:unhideWhenUsed="1"/>
+    <w:lsdException w:name="Table Grid 7" w:semiHidden="1" w:unhideWhenUsed="1"/>
+    <w:lsdException w:name="Table Grid 8" w:semiHidden="1" w:unhideWhenUsed="1"/>
+    <w:lsdException w:name="Table List 1" w:semiHidden="1" w:unhideWhenUsed="1"/>
+    <w:lsdException w:name="Table List 2" w:semiHidden="1" w:unhideWhenUsed="1"/>
+    <w:lsdException w:name="Table List 3" w:semiHidden="1" w:unhideWhenUsed="1"/>
+    <w:lsdException w:name="Table List 4" w:semiHidden="1" w:unhideWhenUsed="1"/>
+    <w:lsdException w:name="Table List 5" w:semiHidden="1" w:unhideWhenUsed="1"/>
+    <w:lsdException w:name="Table List 6" w:semiHidden="1" w:unhideWhenUsed="1"/>
+    <w:lsdException w:name="Table List 7" w:semiHidden="1" w:unhideWhenUsed="1"/>
+    <w:lsdException w:name="Table List 8" w:semiHidden="1" w:unhideWhenUsed="1"/>
+    <w:lsdException w:name="Table 3D effects 1" w:semiHidden="1" w:unhideWhenUsed="1"/>
+    <w:lsdException w:name="Table 3D effects 2" w:semiHidden="1" w:unhideWhenUsed="1"/>
+    <w:lsdException w:name="Table 3D effects 3" w:semiHidden="1" w:unhideWhenUsed="1"/>
+    <w:lsdException w:name="Table Contemporary" w:semiHidden="1" w:unhideWhenUsed="1"/>
+    <w:lsdException w:name="Table Elegant" w:semiHidden="1" w:unhideWhenUsed="1"/>
+    <w:lsdException w:name="Table Professional" w:semiHidden="1" w:unhideWhenUsed="1"/>
+    <w:lsdException w:name="Table Subtle 1" w:semiHidden="1" w:unhideWhenUsed="1"/>
+    <w:lsdException w:name="Table Subtle 2" w:semiHidden="1" w:unhideWhenUsed="1"/>
+    <w:lsdException w:name="Table Web 1" w:semiHidden="1" w:unhideWhenUsed="1"/>
+    <w:lsdException w:name="Table Web 2" w:semiHidden="1" w:unhideWhenUsed="1"/>
+    <w:lsdException w:name="Table Web 3" w:semiHidden="1" w:unhideWhenUsed="1"/>
     <w:lsdException w:name="Balloon Text" w:uiPriority="99"/>
+    <w:lsdException w:name="Table Theme" w:semiHidden="1" w:unhideWhenUsed="1"/>
     <w:lsdException w:name="Placeholder Text" w:semiHidden="1" w:uiPriority="99"/>
     <w:lsdException w:name="No Spacing" w:uiPriority="1" w:qFormat="1"/>
     <w:lsdException w:name="Light Shading" w:uiPriority="60"/>
@@ -49879,8 +48227,8 @@
     <w:lsdException w:name="Plain Table 5" w:uiPriority="31" w:qFormat="1"/>
     <w:lsdException w:name="Grid Table Light" w:uiPriority="32" w:qFormat="1"/>
     <w:lsdException w:name="Grid Table 1 Light" w:uiPriority="33" w:qFormat="1"/>
-    <w:lsdException w:name="Grid Table 2" w:semiHidden="1" w:uiPriority="37" w:unhideWhenUsed="1"/>
-    <w:lsdException w:name="Grid Table 3" w:semiHidden="1" w:uiPriority="39" w:unhideWhenUsed="1" w:qFormat="1"/>
+    <w:lsdException w:name="Grid Table 2" w:uiPriority="37"/>
+    <w:lsdException w:name="Grid Table 3" w:uiPriority="39" w:qFormat="1"/>
     <w:lsdException w:name="Grid Table 4" w:uiPriority="49"/>
     <w:lsdException w:name="Grid Table 5 Dark" w:uiPriority="50"/>
     <w:lsdException w:name="Grid Table 6 Colorful" w:uiPriority="51"/>
@@ -49982,7 +48330,7 @@
     <w:lsdException w:name="Unresolved Mention" w:semiHidden="1" w:uiPriority="99" w:unhideWhenUsed="1"/>
     <w:lsdException w:name="Smart Link" w:semiHidden="1" w:uiPriority="99" w:unhideWhenUsed="1"/>
   </w:latentStyles>
-  <w:style w:type="paragraph" w:default="1" w:styleId="Normal">
+  <w:style w:type="paragraph" w:default="1" w:styleId="Standard">
     <w:name w:val="Normal"/>
     <w:qFormat/>
     <w:rsid w:val="004C6BD6"/>
@@ -49994,11 +48342,11 @@
       <w:lang w:val="en-GB"/>
     </w:rPr>
   </w:style>
-  <w:style w:type="paragraph" w:styleId="Heading1">
+  <w:style w:type="paragraph" w:styleId="berschrift1">
     <w:name w:val="heading 1"/>
-    <w:basedOn w:val="Normal"/>
+    <w:basedOn w:val="Standard"/>
     <w:next w:val="ParagraphCharCharChar"/>
-    <w:link w:val="Heading1Char"/>
+    <w:link w:val="berschrift1Zchn"/>
     <w:autoRedefine/>
     <w:uiPriority w:val="9"/>
     <w:qFormat/>
@@ -50019,11 +48367,11 @@
       <w:szCs w:val="32"/>
     </w:rPr>
   </w:style>
-  <w:style w:type="paragraph" w:styleId="Heading2">
+  <w:style w:type="paragraph" w:styleId="berschrift2">
     <w:name w:val="heading 2"/>
-    <w:basedOn w:val="Normal"/>
+    <w:basedOn w:val="Standard"/>
     <w:next w:val="ParagraphCharCharChar"/>
-    <w:link w:val="Heading2Char"/>
+    <w:link w:val="berschrift2Zchn"/>
     <w:autoRedefine/>
     <w:uiPriority w:val="9"/>
     <w:qFormat/>
@@ -50047,11 +48395,11 @@
       <w:szCs w:val="24"/>
     </w:rPr>
   </w:style>
-  <w:style w:type="paragraph" w:styleId="Heading3">
+  <w:style w:type="paragraph" w:styleId="berschrift3">
     <w:name w:val="heading 3"/>
-    <w:basedOn w:val="Normal"/>
+    <w:basedOn w:val="Standard"/>
     <w:next w:val="ParagraphCharCharChar"/>
-    <w:link w:val="Heading3Char"/>
+    <w:link w:val="berschrift3Zchn"/>
     <w:autoRedefine/>
     <w:uiPriority w:val="9"/>
     <w:qFormat/>
@@ -50073,11 +48421,11 @@
       <w:sz w:val="22"/>
     </w:rPr>
   </w:style>
-  <w:style w:type="paragraph" w:styleId="Heading4">
+  <w:style w:type="paragraph" w:styleId="berschrift4">
     <w:name w:val="heading 4"/>
-    <w:basedOn w:val="Normal"/>
+    <w:basedOn w:val="Standard"/>
     <w:next w:val="ParagraphCharCharChar"/>
-    <w:link w:val="Heading4Char"/>
+    <w:link w:val="berschrift4Zchn"/>
     <w:uiPriority w:val="9"/>
     <w:qFormat/>
     <w:rsid w:val="00CB3F58"/>
@@ -50097,9 +48445,9 @@
       <w:szCs w:val="28"/>
     </w:rPr>
   </w:style>
-  <w:style w:type="paragraph" w:styleId="Heading5">
+  <w:style w:type="paragraph" w:styleId="berschrift5">
     <w:name w:val="heading 5"/>
-    <w:basedOn w:val="Normal"/>
+    <w:basedOn w:val="Standard"/>
     <w:next w:val="ParagraphCharCharChar"/>
     <w:qFormat/>
     <w:rsid w:val="00A57DDB"/>
@@ -50116,9 +48464,9 @@
       <w:szCs w:val="26"/>
     </w:rPr>
   </w:style>
-  <w:style w:type="paragraph" w:styleId="Heading6">
+  <w:style w:type="paragraph" w:styleId="berschrift6">
     <w:name w:val="heading 6"/>
-    <w:basedOn w:val="Normal"/>
+    <w:basedOn w:val="Standard"/>
     <w:next w:val="ParagraphCharCharChar"/>
     <w:qFormat/>
     <w:rsid w:val="00A57DDB"/>
@@ -50134,9 +48482,9 @@
       <w:szCs w:val="22"/>
     </w:rPr>
   </w:style>
-  <w:style w:type="paragraph" w:styleId="Heading7">
+  <w:style w:type="paragraph" w:styleId="berschrift7">
     <w:name w:val="heading 7"/>
-    <w:basedOn w:val="Normal"/>
+    <w:basedOn w:val="Standard"/>
     <w:next w:val="ParagraphCharCharChar"/>
     <w:qFormat/>
     <w:rsid w:val="00A57DDB"/>
@@ -50150,9 +48498,9 @@
       <w:szCs w:val="24"/>
     </w:rPr>
   </w:style>
-  <w:style w:type="paragraph" w:styleId="Heading8">
+  <w:style w:type="paragraph" w:styleId="berschrift8">
     <w:name w:val="heading 8"/>
-    <w:basedOn w:val="Normal"/>
+    <w:basedOn w:val="Standard"/>
     <w:next w:val="ParagraphCharCharChar"/>
     <w:qFormat/>
     <w:rsid w:val="00A57DDB"/>
@@ -50168,9 +48516,9 @@
       <w:szCs w:val="24"/>
     </w:rPr>
   </w:style>
-  <w:style w:type="paragraph" w:styleId="Heading9">
+  <w:style w:type="paragraph" w:styleId="berschrift9">
     <w:name w:val="heading 9"/>
-    <w:basedOn w:val="Normal"/>
+    <w:basedOn w:val="Standard"/>
     <w:next w:val="ParagraphCharCharChar"/>
     <w:qFormat/>
     <w:rsid w:val="00A57DDB"/>
@@ -50184,18 +48532,17 @@
       <w:szCs w:val="22"/>
     </w:rPr>
   </w:style>
-  <w:style w:type="character" w:default="1" w:styleId="DefaultParagraphFont">
+  <w:style w:type="character" w:default="1" w:styleId="Absatz-Standardschriftart">
     <w:name w:val="Default Paragraph Font"/>
     <w:uiPriority w:val="1"/>
     <w:semiHidden/>
     <w:unhideWhenUsed/>
   </w:style>
-  <w:style w:type="table" w:default="1" w:styleId="TableNormal">
+  <w:style w:type="table" w:default="1" w:styleId="NormaleTabelle">
     <w:name w:val="Normal Table"/>
     <w:uiPriority w:val="99"/>
     <w:semiHidden/>
     <w:unhideWhenUsed/>
-    <w:qFormat/>
     <w:tblPr>
       <w:tblInd w:w="0" w:type="dxa"/>
       <w:tblCellMar>
@@ -50206,7 +48553,7 @@
       </w:tblCellMar>
     </w:tblPr>
   </w:style>
-  <w:style w:type="numbering" w:default="1" w:styleId="NoList">
+  <w:style w:type="numbering" w:default="1" w:styleId="KeineListe">
     <w:name w:val="No List"/>
     <w:uiPriority w:val="99"/>
     <w:semiHidden/>
@@ -50235,9 +48582,9 @@
       <w:lang w:val="en-GB" w:eastAsia="en-US" w:bidi="ar-SA"/>
     </w:rPr>
   </w:style>
-  <w:style w:type="character" w:customStyle="1" w:styleId="Heading2Char">
-    <w:name w:val="Heading 2 Char"/>
-    <w:link w:val="Heading2"/>
+  <w:style w:type="character" w:customStyle="1" w:styleId="berschrift2Zchn">
+    <w:name w:val="Überschrift 2 Zchn"/>
+    <w:link w:val="berschrift2"/>
     <w:uiPriority w:val="9"/>
     <w:rsid w:val="00CB3F58"/>
     <w:rPr>
@@ -50252,9 +48599,9 @@
       <w:lang w:val="en-GB"/>
     </w:rPr>
   </w:style>
-  <w:style w:type="character" w:customStyle="1" w:styleId="Heading3Char">
-    <w:name w:val="Heading 3 Char"/>
-    <w:link w:val="Heading3"/>
+  <w:style w:type="character" w:customStyle="1" w:styleId="berschrift3Zchn">
+    <w:name w:val="Überschrift 3 Zchn"/>
+    <w:link w:val="berschrift3"/>
     <w:uiPriority w:val="9"/>
     <w:rsid w:val="00CB3F58"/>
     <w:rPr>
@@ -50266,9 +48613,9 @@
       <w:lang w:val="en-GB"/>
     </w:rPr>
   </w:style>
-  <w:style w:type="table" w:styleId="TableGrid">
+  <w:style w:type="table" w:styleId="Tabellenraster">
     <w:name w:val="Table Grid"/>
-    <w:basedOn w:val="TableNormal"/>
+    <w:basedOn w:val="NormaleTabelle"/>
     <w:rsid w:val="00BD611B"/>
     <w:tblPr>
       <w:tblBorders>
@@ -50283,7 +48630,7 @@
   </w:style>
   <w:style w:type="paragraph" w:customStyle="1" w:styleId="Chapterhead">
     <w:name w:val="Chapter head"/>
-    <w:basedOn w:val="Normal"/>
+    <w:basedOn w:val="Standard"/>
     <w:rsid w:val="00B716F7"/>
     <w:pPr>
       <w:jc w:val="center"/>
@@ -50295,10 +48642,10 @@
       <w:lang w:val="en-US"/>
     </w:rPr>
   </w:style>
-  <w:style w:type="paragraph" w:styleId="Header">
+  <w:style w:type="paragraph" w:styleId="Kopfzeile">
     <w:name w:val="header"/>
-    <w:basedOn w:val="Normal"/>
-    <w:link w:val="HeaderChar"/>
+    <w:basedOn w:val="Standard"/>
+    <w:link w:val="KopfzeileZchn"/>
     <w:uiPriority w:val="99"/>
     <w:rsid w:val="00F73369"/>
     <w:pPr>
@@ -50308,10 +48655,10 @@
       </w:tabs>
     </w:pPr>
   </w:style>
-  <w:style w:type="paragraph" w:styleId="Footer">
+  <w:style w:type="paragraph" w:styleId="Fuzeile">
     <w:name w:val="footer"/>
-    <w:basedOn w:val="Normal"/>
-    <w:link w:val="FooterChar"/>
+    <w:basedOn w:val="Standard"/>
+    <w:link w:val="FuzeileZchn"/>
     <w:uiPriority w:val="99"/>
     <w:rsid w:val="00F73369"/>
     <w:pPr>
@@ -50321,15 +48668,15 @@
       </w:tabs>
     </w:pPr>
   </w:style>
-  <w:style w:type="character" w:styleId="PageNumber">
+  <w:style w:type="character" w:styleId="Seitenzahl">
     <w:name w:val="page number"/>
-    <w:basedOn w:val="DefaultParagraphFont"/>
+    <w:basedOn w:val="Absatz-Standardschriftart"/>
     <w:rsid w:val="00F73369"/>
   </w:style>
-  <w:style w:type="paragraph" w:styleId="TOC1">
+  <w:style w:type="paragraph" w:styleId="Verzeichnis1">
     <w:name w:val="toc 1"/>
-    <w:basedOn w:val="Normal"/>
-    <w:next w:val="Normal"/>
+    <w:basedOn w:val="Standard"/>
+    <w:next w:val="Standard"/>
     <w:autoRedefine/>
     <w:uiPriority w:val="39"/>
     <w:rsid w:val="006D0B74"/>
@@ -50337,18 +48684,18 @@
       <w:b/>
     </w:rPr>
   </w:style>
-  <w:style w:type="paragraph" w:styleId="TOC2">
+  <w:style w:type="paragraph" w:styleId="Verzeichnis2">
     <w:name w:val="toc 2"/>
-    <w:basedOn w:val="Normal"/>
-    <w:next w:val="Normal"/>
+    <w:basedOn w:val="Standard"/>
+    <w:next w:val="Standard"/>
     <w:autoRedefine/>
     <w:uiPriority w:val="39"/>
     <w:rsid w:val="00C466D0"/>
   </w:style>
-  <w:style w:type="paragraph" w:styleId="TOC3">
+  <w:style w:type="paragraph" w:styleId="Verzeichnis3">
     <w:name w:val="toc 3"/>
-    <w:basedOn w:val="Normal"/>
-    <w:next w:val="Normal"/>
+    <w:basedOn w:val="Standard"/>
+    <w:next w:val="Standard"/>
     <w:autoRedefine/>
     <w:uiPriority w:val="39"/>
     <w:rsid w:val="00C466D0"/>
@@ -50362,9 +48709,9 @@
       <w:u w:val="single"/>
     </w:rPr>
   </w:style>
-  <w:style w:type="character" w:styleId="LineNumber">
+  <w:style w:type="character" w:styleId="Zeilennummer">
     <w:name w:val="line number"/>
-    <w:basedOn w:val="DefaultParagraphFont"/>
+    <w:basedOn w:val="Absatz-Standardschriftart"/>
     <w:uiPriority w:val="99"/>
     <w:rsid w:val="009D6B51"/>
   </w:style>
@@ -50377,10 +48724,10 @@
       <w:szCs w:val="20"/>
     </w:rPr>
   </w:style>
-  <w:style w:type="paragraph" w:styleId="Caption">
+  <w:style w:type="paragraph" w:styleId="Beschriftung">
     <w:name w:val="caption"/>
-    <w:basedOn w:val="Normal"/>
-    <w:next w:val="Normal"/>
+    <w:basedOn w:val="Standard"/>
+    <w:next w:val="Standard"/>
     <w:qFormat/>
     <w:rsid w:val="00A93869"/>
     <w:pPr>
@@ -50397,10 +48744,10 @@
       <w:lang w:val="en-US"/>
     </w:rPr>
   </w:style>
-  <w:style w:type="paragraph" w:styleId="NormalWeb">
+  <w:style w:type="paragraph" w:styleId="StandardWeb">
     <w:name w:val="Normal (Web)"/>
-    <w:basedOn w:val="Normal"/>
-    <w:link w:val="NormalWebChar"/>
+    <w:basedOn w:val="Standard"/>
+    <w:link w:val="StandardWebZchn"/>
     <w:uiPriority w:val="99"/>
     <w:rsid w:val="00EA24D4"/>
     <w:pPr>
@@ -50413,9 +48760,9 @@
       <w:lang w:val="en-US"/>
     </w:rPr>
   </w:style>
-  <w:style w:type="character" w:customStyle="1" w:styleId="NormalWebChar">
-    <w:name w:val="Normal (Web) Char"/>
-    <w:link w:val="NormalWeb"/>
+  <w:style w:type="character" w:customStyle="1" w:styleId="StandardWebZchn">
+    <w:name w:val="Standard (Web) Zchn"/>
+    <w:link w:val="StandardWeb"/>
     <w:rsid w:val="00EA24D4"/>
     <w:rPr>
       <w:rFonts w:ascii="Arial" w:hAnsi="Arial" w:cs="Arial"/>
@@ -50424,9 +48771,9 @@
       <w:lang w:val="en-US" w:eastAsia="en-US" w:bidi="ar-SA"/>
     </w:rPr>
   </w:style>
-  <w:style w:type="paragraph" w:styleId="BodyText">
+  <w:style w:type="paragraph" w:styleId="Textkrper">
     <w:name w:val="Body Text"/>
-    <w:basedOn w:val="Normal"/>
+    <w:basedOn w:val="Standard"/>
     <w:rsid w:val="00A93869"/>
     <w:pPr>
       <w:widowControl w:val="0"/>
@@ -50442,7 +48789,7 @@
   </w:style>
   <w:style w:type="paragraph" w:customStyle="1" w:styleId="Footerempty">
     <w:name w:val="Footerempty"/>
-    <w:basedOn w:val="Footer"/>
+    <w:basedOn w:val="Fuzeile"/>
     <w:rsid w:val="00A83C8D"/>
     <w:pPr>
       <w:tabs>
@@ -50460,7 +48807,7 @@
   </w:style>
   <w:style w:type="paragraph" w:customStyle="1" w:styleId="FrontPage">
     <w:name w:val="FrontPage"/>
-    <w:basedOn w:val="Normal"/>
+    <w:basedOn w:val="Standard"/>
     <w:link w:val="FrontPageChar"/>
     <w:rsid w:val="00DA2710"/>
     <w:pPr>
@@ -50474,7 +48821,7 @@
   </w:style>
   <w:style w:type="paragraph" w:customStyle="1" w:styleId="DatePub">
     <w:name w:val="DatePub"/>
-    <w:basedOn w:val="Normal"/>
+    <w:basedOn w:val="Standard"/>
     <w:rsid w:val="00DA2710"/>
     <w:pPr>
       <w:jc w:val="center"/>
@@ -50486,7 +48833,7 @@
   </w:style>
   <w:style w:type="paragraph" w:customStyle="1" w:styleId="TableHeading">
     <w:name w:val="TableHeading"/>
-    <w:basedOn w:val="Normal"/>
+    <w:basedOn w:val="Standard"/>
     <w:rsid w:val="00CD2966"/>
     <w:rPr>
       <w:rFonts w:cs="Arial"/>
@@ -50495,8 +48842,8 @@
       <w:szCs w:val="32"/>
     </w:rPr>
   </w:style>
-  <w:style w:type="paragraph" w:styleId="ColorfulGrid-Accent1">
-    <w:name w:val="Colorful Grid Accent 1"/>
+  <w:style w:type="paragraph" w:customStyle="1" w:styleId="FarbigesRaster-Akzent11">
+    <w:name w:val="Farbiges Raster - Akzent 11"/>
     <w:basedOn w:val="ParagraphCharCharChar"/>
     <w:qFormat/>
     <w:rsid w:val="00CD2966"/>
@@ -50511,7 +48858,7 @@
   </w:style>
   <w:style w:type="paragraph" w:customStyle="1" w:styleId="AttributeName">
     <w:name w:val="AttributeName"/>
-    <w:basedOn w:val="Normal"/>
+    <w:basedOn w:val="Standard"/>
     <w:link w:val="AttributeNameChar"/>
     <w:rsid w:val="00CD2966"/>
     <w:rPr>
@@ -50587,7 +48934,7 @@
   </w:style>
   <w:style w:type="paragraph" w:customStyle="1" w:styleId="Nurbered1">
     <w:name w:val="Nurbered1"/>
-    <w:basedOn w:val="Normal"/>
+    <w:basedOn w:val="Standard"/>
     <w:rsid w:val="00AF7C93"/>
     <w:pPr>
       <w:numPr>
@@ -50603,7 +48950,7 @@
   </w:style>
   <w:style w:type="paragraph" w:customStyle="1" w:styleId="Numbered2">
     <w:name w:val="Numbered2"/>
-    <w:basedOn w:val="Normal"/>
+    <w:basedOn w:val="Standard"/>
     <w:rsid w:val="00AF7C93"/>
     <w:pPr>
       <w:numPr>
@@ -50618,7 +48965,7 @@
   </w:style>
   <w:style w:type="paragraph" w:customStyle="1" w:styleId="Bulleted">
     <w:name w:val="Bulleted"/>
-    <w:basedOn w:val="Normal"/>
+    <w:basedOn w:val="Standard"/>
     <w:rsid w:val="006E62CE"/>
     <w:pPr>
       <w:numPr>
@@ -50708,7 +49055,7 @@
   </w:style>
   <w:style w:type="paragraph" w:customStyle="1" w:styleId="Text2">
     <w:name w:val="Text 2"/>
-    <w:basedOn w:val="Normal"/>
+    <w:basedOn w:val="Standard"/>
     <w:rsid w:val="00434E41"/>
     <w:pPr>
       <w:tabs>
@@ -50725,10 +49072,10 @@
       <w:sz w:val="24"/>
     </w:rPr>
   </w:style>
-  <w:style w:type="paragraph" w:styleId="BalloonText">
+  <w:style w:type="paragraph" w:styleId="Sprechblasentext">
     <w:name w:val="Balloon Text"/>
-    <w:basedOn w:val="Normal"/>
-    <w:link w:val="BalloonTextChar"/>
+    <w:basedOn w:val="Standard"/>
+    <w:link w:val="SprechblasentextZchn"/>
     <w:uiPriority w:val="99"/>
     <w:semiHidden/>
     <w:rsid w:val="00FC384C"/>
@@ -50762,7 +49109,7 @@
   </w:style>
   <w:style w:type="paragraph" w:customStyle="1" w:styleId="section">
     <w:name w:val="section"/>
-    <w:basedOn w:val="Normal"/>
+    <w:basedOn w:val="Standard"/>
     <w:link w:val="sectionChar"/>
     <w:rsid w:val="004A0958"/>
     <w:pPr>
@@ -50799,7 +49146,7 @@
   </w:style>
   <w:style w:type="paragraph" w:customStyle="1" w:styleId="content">
     <w:name w:val="content"/>
-    <w:basedOn w:val="Normal"/>
+    <w:basedOn w:val="Standard"/>
     <w:rsid w:val="00856DDB"/>
     <w:pPr>
       <w:spacing w:before="100" w:beforeAutospacing="1" w:after="100" w:afterAutospacing="1"/>
@@ -50811,7 +49158,7 @@
   </w:style>
   <w:style w:type="paragraph" w:customStyle="1" w:styleId="code">
     <w:name w:val="code"/>
-    <w:basedOn w:val="Normal"/>
+    <w:basedOn w:val="Standard"/>
     <w:rsid w:val="00856DDB"/>
     <w:pPr>
       <w:numPr>
@@ -50829,7 +49176,7 @@
   </w:style>
   <w:style w:type="paragraph" w:customStyle="1" w:styleId="StyleNormalWebComplexTimesNewRoman">
     <w:name w:val="Style Normal (Web) + (Complex) Times New Roman"/>
-    <w:basedOn w:val="NormalWeb"/>
+    <w:basedOn w:val="StandardWeb"/>
     <w:link w:val="StyleNormalWebComplexTimesNewRomanChar"/>
     <w:rsid w:val="00221DD3"/>
     <w:rPr>
@@ -50849,7 +49196,7 @@
   </w:style>
   <w:style w:type="paragraph" w:customStyle="1" w:styleId="StyleHeading2ComplexTimesNewRoman2">
     <w:name w:val="Style Heading 2 + (Complex) Times New Roman2"/>
-    <w:basedOn w:val="Normal"/>
+    <w:basedOn w:val="Standard"/>
     <w:rsid w:val="00A57DDB"/>
     <w:pPr>
       <w:tabs>
@@ -50860,7 +49207,7 @@
   </w:style>
   <w:style w:type="paragraph" w:customStyle="1" w:styleId="StyleHeading3ComplexTimesNewRoman1">
     <w:name w:val="Style Heading 3 + (Complex) Times New Roman1"/>
-    <w:basedOn w:val="Normal"/>
+    <w:basedOn w:val="Standard"/>
     <w:rsid w:val="00A57DDB"/>
     <w:pPr>
       <w:numPr>
@@ -50871,7 +49218,7 @@
   </w:style>
   <w:style w:type="paragraph" w:customStyle="1" w:styleId="StyleNormalWebComplexTimesNewRomanBold">
     <w:name w:val="Style Normal (Web) + (Complex) Times New Roman Bold"/>
-    <w:basedOn w:val="NormalWeb"/>
+    <w:basedOn w:val="StandardWeb"/>
     <w:link w:val="StyleNormalWebComplexTimesNewRomanBoldChar"/>
     <w:rsid w:val="00221DD3"/>
     <w:rPr>
@@ -50895,7 +49242,7 @@
   </w:style>
   <w:style w:type="paragraph" w:customStyle="1" w:styleId="StyleHeading3ComplexTimesNewRoman">
     <w:name w:val="Style Heading 3 + (Complex) Times New Roman"/>
-    <w:basedOn w:val="Heading3"/>
+    <w:basedOn w:val="berschrift3"/>
     <w:rsid w:val="00221DD3"/>
     <w:pPr>
       <w:numPr>
@@ -50908,7 +49255,7 @@
   </w:style>
   <w:style w:type="paragraph" w:customStyle="1" w:styleId="StyleNormalWebComplexTimesNewRoman1">
     <w:name w:val="Style Normal (Web) + (Complex) Times New Roman1"/>
-    <w:basedOn w:val="NormalWeb"/>
+    <w:basedOn w:val="StandardWeb"/>
     <w:link w:val="StyleNormalWebComplexTimesNewRoman1Char"/>
     <w:rsid w:val="00A976DC"/>
     <w:rPr>
@@ -50928,7 +49275,7 @@
   </w:style>
   <w:style w:type="paragraph" w:customStyle="1" w:styleId="StyleNormalWebComplexTimesNewRomanBold1">
     <w:name w:val="Style Normal (Web) + (Complex) Times New Roman Bold1"/>
-    <w:basedOn w:val="NormalWeb"/>
+    <w:basedOn w:val="StandardWeb"/>
     <w:link w:val="StyleNormalWebComplexTimesNewRomanBold1Char"/>
     <w:rsid w:val="00A976DC"/>
     <w:rPr>
@@ -50952,7 +49299,7 @@
   </w:style>
   <w:style w:type="paragraph" w:customStyle="1" w:styleId="StyleHeading3ComplexTimesNewRoman2">
     <w:name w:val="Style Heading 3 + (Complex) Times New Roman2"/>
-    <w:basedOn w:val="Heading3"/>
+    <w:basedOn w:val="berschrift3"/>
     <w:rsid w:val="00A976DC"/>
     <w:pPr>
       <w:numPr>
@@ -50965,7 +49312,7 @@
   </w:style>
   <w:style w:type="paragraph" w:customStyle="1" w:styleId="StyleHeading3ComplexTimesNewRoman3">
     <w:name w:val="Style Heading 3 + (Complex) Times New Roman3"/>
-    <w:basedOn w:val="Heading3"/>
+    <w:basedOn w:val="berschrift3"/>
     <w:rsid w:val="00EA24D4"/>
     <w:pPr>
       <w:numPr>
@@ -50997,17 +49344,17 @@
   </w:style>
   <w:style w:type="character" w:customStyle="1" w:styleId="apple-converted-space">
     <w:name w:val="apple-converted-space"/>
-    <w:basedOn w:val="DefaultParagraphFont"/>
+    <w:basedOn w:val="Absatz-Standardschriftart"/>
     <w:rsid w:val="005A3000"/>
   </w:style>
   <w:style w:type="character" w:customStyle="1" w:styleId="apple-style-span">
     <w:name w:val="apple-style-span"/>
-    <w:basedOn w:val="DefaultParagraphFont"/>
+    <w:basedOn w:val="Absatz-Standardschriftart"/>
     <w:rsid w:val="002C37A2"/>
   </w:style>
-  <w:style w:type="character" w:customStyle="1" w:styleId="FooterChar">
-    <w:name w:val="Footer Char"/>
-    <w:link w:val="Footer"/>
+  <w:style w:type="character" w:customStyle="1" w:styleId="FuzeileZchn">
+    <w:name w:val="Fußzeile Zchn"/>
+    <w:link w:val="Fuzeile"/>
     <w:uiPriority w:val="99"/>
     <w:rsid w:val="0033259E"/>
     <w:rPr>
@@ -51015,10 +49362,10 @@
       <w:lang w:val="en-GB"/>
     </w:rPr>
   </w:style>
-  <w:style w:type="paragraph" w:styleId="GridTable3">
-    <w:name w:val="Grid Table 3"/>
-    <w:basedOn w:val="Heading1"/>
-    <w:next w:val="Normal"/>
+  <w:style w:type="paragraph" w:customStyle="1" w:styleId="Gitternetztabelle31">
+    <w:name w:val="Gitternetztabelle 31"/>
+    <w:basedOn w:val="berschrift1"/>
+    <w:next w:val="Standard"/>
     <w:uiPriority w:val="39"/>
     <w:semiHidden/>
     <w:unhideWhenUsed/>
@@ -51102,9 +49449,9 @@
       <w:lang w:val="de-DE"/>
     </w:rPr>
   </w:style>
-  <w:style w:type="character" w:customStyle="1" w:styleId="Heading1Char">
-    <w:name w:val="Heading 1 Char"/>
-    <w:link w:val="Heading1"/>
+  <w:style w:type="character" w:customStyle="1" w:styleId="berschrift1Zchn">
+    <w:name w:val="Überschrift 1 Zchn"/>
+    <w:link w:val="berschrift1"/>
     <w:uiPriority w:val="9"/>
     <w:rsid w:val="00E6104B"/>
     <w:rPr>
@@ -51117,9 +49464,9 @@
       <w:lang w:eastAsia="en-US"/>
     </w:rPr>
   </w:style>
-  <w:style w:type="paragraph" w:styleId="ColorfulList-Accent1">
-    <w:name w:val="Colorful List Accent 1"/>
-    <w:basedOn w:val="Normal"/>
+  <w:style w:type="paragraph" w:customStyle="1" w:styleId="FarbigeListe-Akzent11">
+    <w:name w:val="Farbige Liste - Akzent 11"/>
+    <w:basedOn w:val="Standard"/>
     <w:uiPriority w:val="34"/>
     <w:qFormat/>
     <w:rsid w:val="00A657B8"/>
@@ -51135,9 +49482,9 @@
       <w:lang w:val="en-US"/>
     </w:rPr>
   </w:style>
-  <w:style w:type="character" w:customStyle="1" w:styleId="BalloonTextChar">
-    <w:name w:val="Balloon Text Char"/>
-    <w:link w:val="BalloonText"/>
+  <w:style w:type="character" w:customStyle="1" w:styleId="SprechblasentextZchn">
+    <w:name w:val="Sprechblasentext Zchn"/>
+    <w:link w:val="Sprechblasentext"/>
     <w:uiPriority w:val="99"/>
     <w:semiHidden/>
     <w:rsid w:val="00A657B8"/>
@@ -51148,9 +49495,9 @@
       <w:lang w:val="en-GB"/>
     </w:rPr>
   </w:style>
-  <w:style w:type="character" w:customStyle="1" w:styleId="HeaderChar">
-    <w:name w:val="Header Char"/>
-    <w:link w:val="Header"/>
+  <w:style w:type="character" w:customStyle="1" w:styleId="KopfzeileZchn">
+    <w:name w:val="Kopfzeile Zchn"/>
+    <w:link w:val="Kopfzeile"/>
     <w:uiPriority w:val="99"/>
     <w:rsid w:val="00A657B8"/>
     <w:rPr>
@@ -51158,9 +49505,9 @@
       <w:lang w:val="en-GB"/>
     </w:rPr>
   </w:style>
-  <w:style w:type="character" w:customStyle="1" w:styleId="Heading4Char">
-    <w:name w:val="Heading 4 Char"/>
-    <w:link w:val="Heading4"/>
+  <w:style w:type="character" w:customStyle="1" w:styleId="berschrift4Zchn">
+    <w:name w:val="Überschrift 4 Zchn"/>
+    <w:link w:val="berschrift4"/>
     <w:uiPriority w:val="9"/>
     <w:rsid w:val="00A657B8"/>
     <w:rPr>
@@ -51174,7 +49521,7 @@
   </w:style>
   <w:style w:type="paragraph" w:customStyle="1" w:styleId="msonormal0">
     <w:name w:val="msonormal"/>
-    <w:basedOn w:val="Normal"/>
+    <w:basedOn w:val="Standard"/>
     <w:rsid w:val="00EE3812"/>
     <w:pPr>
       <w:spacing w:before="100" w:beforeAutospacing="1" w:after="100" w:afterAutospacing="1"/>
@@ -51186,7 +49533,7 @@
   </w:style>
   <w:style w:type="paragraph" w:customStyle="1" w:styleId="contenttable">
     <w:name w:val="contenttable"/>
-    <w:basedOn w:val="Normal"/>
+    <w:basedOn w:val="Standard"/>
     <w:rsid w:val="00EE3812"/>
     <w:pPr>
       <w:spacing w:before="100" w:beforeAutospacing="1" w:after="100" w:afterAutospacing="1"/>
@@ -51200,7 +49547,7 @@
   </w:style>
   <w:style w:type="paragraph" w:customStyle="1" w:styleId="contenttitle">
     <w:name w:val="contenttitle"/>
-    <w:basedOn w:val="Normal"/>
+    <w:basedOn w:val="Standard"/>
     <w:rsid w:val="00EE3812"/>
     <w:pPr>
       <w:spacing w:before="100" w:beforeAutospacing="1" w:after="100" w:afterAutospacing="1"/>
@@ -51214,7 +49561,7 @@
   </w:style>
   <w:style w:type="paragraph" w:customStyle="1" w:styleId="contentth">
     <w:name w:val="contentth"/>
-    <w:basedOn w:val="Normal"/>
+    <w:basedOn w:val="Standard"/>
     <w:rsid w:val="00EE3812"/>
     <w:pPr>
       <w:shd w:val="clear" w:color="auto" w:fill="CCCCCC"/>
@@ -51229,7 +49576,7 @@
   </w:style>
   <w:style w:type="paragraph" w:customStyle="1" w:styleId="contenttd1">
     <w:name w:val="contenttd1"/>
-    <w:basedOn w:val="Normal"/>
+    <w:basedOn w:val="Standard"/>
     <w:rsid w:val="00EE3812"/>
     <w:pPr>
       <w:spacing w:before="100" w:beforeAutospacing="1" w:after="100" w:afterAutospacing="1"/>
@@ -51242,7 +49589,7 @@
   </w:style>
   <w:style w:type="paragraph" w:customStyle="1" w:styleId="contenttd">
     <w:name w:val="contenttd"/>
-    <w:basedOn w:val="Normal"/>
+    <w:basedOn w:val="Standard"/>
     <w:rsid w:val="00EE3812"/>
     <w:pPr>
       <w:spacing w:before="100" w:beforeAutospacing="1" w:after="100" w:afterAutospacing="1"/>
@@ -51255,7 +49602,7 @@
   </w:style>
   <w:style w:type="paragraph" w:customStyle="1" w:styleId="nstable">
     <w:name w:val="nstable"/>
-    <w:basedOn w:val="Normal"/>
+    <w:basedOn w:val="Standard"/>
     <w:rsid w:val="00EE3812"/>
     <w:pPr>
       <w:spacing w:before="100" w:beforeAutospacing="1" w:after="100" w:afterAutospacing="1"/>
@@ -51269,7 +49616,7 @@
   </w:style>
   <w:style w:type="paragraph" w:customStyle="1" w:styleId="nstitle">
     <w:name w:val="nstitle"/>
-    <w:basedOn w:val="Normal"/>
+    <w:basedOn w:val="Standard"/>
     <w:rsid w:val="00EE3812"/>
     <w:pPr>
       <w:spacing w:before="100" w:beforeAutospacing="1" w:after="100" w:afterAutospacing="1"/>
@@ -51283,7 +49630,7 @@
   </w:style>
   <w:style w:type="paragraph" w:customStyle="1" w:styleId="nsth">
     <w:name w:val="nsth"/>
-    <w:basedOn w:val="Normal"/>
+    <w:basedOn w:val="Standard"/>
     <w:rsid w:val="00EE3812"/>
     <w:pPr>
       <w:shd w:val="clear" w:color="auto" w:fill="CCCCCC"/>
@@ -51298,7 +49645,7 @@
   </w:style>
   <w:style w:type="paragraph" w:customStyle="1" w:styleId="nstd">
     <w:name w:val="nstd"/>
-    <w:basedOn w:val="Normal"/>
+    <w:basedOn w:val="Standard"/>
     <w:rsid w:val="00EE3812"/>
     <w:pPr>
       <w:spacing w:before="100" w:beforeAutospacing="1" w:after="100" w:afterAutospacing="1"/>

</xml_diff>